<commit_message>
AV Timeline: split screen column into Left/Main/Right; add TBD placeholders for walkthrough
</commit_message>
<xml_diff>
--- a/deliverables/av-package/AV-Timeline.docx
+++ b/deliverables/av-package/AV-Timeline.docx
@@ -102,7 +102,7 @@
             <w:pPr>
               <w:spacing w:after="40" w:before="0"/>
             </w:pPr>
-            <w:hyperlink w:history="1" r:id="rIddam_xsso4u4dhj7a0dcff">
+            <w:hyperlink w:history="1" r:id="rIdxsvjycklvm-ipcxguuksp">
               <w:r>
                 <w:rPr>
                   <w:rStyle w:val="Hyperlink"/>
@@ -180,7 +180,7 @@
             <w:pPr>
               <w:spacing w:after="40" w:before="0"/>
             </w:pPr>
-            <w:hyperlink w:history="1" r:id="rIdncnr6zc19mbvearknqnfg">
+            <w:hyperlink w:history="1" r:id="rIddtkxf4sywtoac-jiq1vqz">
               <w:r>
                 <w:rPr>
                   <w:rStyle w:val="Hyperlink"/>
@@ -199,7 +199,7 @@
               </w:rPr>
               <w:t xml:space="preserve"> · </w:t>
             </w:r>
-            <w:hyperlink w:history="1" r:id="rId28sia1tqpxtdo-3owyk_u">
+            <w:hyperlink w:history="1" r:id="rId5t2nk6lvmovht5myasb71">
               <w:r>
                 <w:rPr>
                   <w:rStyle w:val="Hyperlink"/>
@@ -218,7 +218,7 @@
               </w:rPr>
               <w:t xml:space="preserve"> · </w:t>
             </w:r>
-            <w:hyperlink w:history="1" r:id="rIdfs49ixumsdl5xerreszgm">
+            <w:hyperlink w:history="1" r:id="rIdw-m_xohaxj1i0-_oqeobn">
               <w:r>
                 <w:rPr>
                   <w:rStyle w:val="Hyperlink"/>
@@ -237,7 +237,7 @@
               </w:rPr>
               <w:t xml:space="preserve"> · </w:t>
             </w:r>
-            <w:hyperlink w:history="1" r:id="rIdpmfunblyoaxl9p2gw9zvf">
+            <w:hyperlink w:history="1" r:id="rIdtkcbx0hl8bfymd4be0buy">
               <w:r>
                 <w:rPr>
                   <w:rStyle w:val="Hyperlink"/>
@@ -511,11 +511,13 @@
         </w:tblBorders>
       </w:tblPr>
       <w:tblGrid>
-        <w:gridCol w:w="1500"/>
-        <w:gridCol w:w="3200"/>
-        <w:gridCol w:w="2700"/>
-        <w:gridCol w:w="3400"/>
-        <w:gridCol w:w="3600"/>
+        <w:gridCol w:w="1200"/>
+        <w:gridCol w:w="2600"/>
+        <w:gridCol w:w="1800"/>
+        <w:gridCol w:w="2200"/>
+        <w:gridCol w:w="1800"/>
+        <w:gridCol w:w="2400"/>
+        <w:gridCol w:w="2400"/>
       </w:tblGrid>
       <w:tr>
         <w:trPr>
@@ -523,7 +525,7 @@
         </w:trPr>
         <w:tc>
           <w:tcPr>
-            <w:tcW w:type="dxa" w:w="1500"/>
+            <w:tcW w:type="dxa" w:w="1200"/>
             <w:tcBorders>
               <w:top w:val="single" w:color="D4D1CA" w:sz="4"/>
               <w:left w:val="single" w:color="D4D1CA" w:sz="4"/>
@@ -555,7 +557,7 @@
         </w:tc>
         <w:tc>
           <w:tcPr>
-            <w:tcW w:type="dxa" w:w="3200"/>
+            <w:tcW w:type="dxa" w:w="2600"/>
             <w:tcBorders>
               <w:top w:val="single" w:color="D4D1CA" w:sz="4"/>
               <w:left w:val="single" w:color="D4D1CA" w:sz="4"/>
@@ -587,7 +589,7 @@
         </w:tc>
         <w:tc>
           <w:tcPr>
-            <w:tcW w:type="dxa" w:w="2700"/>
+            <w:tcW w:type="dxa" w:w="1800"/>
             <w:tcBorders>
               <w:top w:val="single" w:color="D4D1CA" w:sz="4"/>
               <w:left w:val="single" w:color="D4D1CA" w:sz="4"/>
@@ -613,13 +615,13 @@
                 <w:sz w:val="20"/>
                 <w:szCs w:val="20"/>
               </w:rPr>
-              <w:t xml:space="preserve">On Main Screen</w:t>
-            </w:r>
-          </w:p>
-        </w:tc>
-        <w:tc>
-          <w:tcPr>
-            <w:tcW w:type="dxa" w:w="3400"/>
+              <w:t xml:space="preserve">Left Screen</w:t>
+            </w:r>
+          </w:p>
+        </w:tc>
+        <w:tc>
+          <w:tcPr>
+            <w:tcW w:type="dxa" w:w="2200"/>
             <w:tcBorders>
               <w:top w:val="single" w:color="D4D1CA" w:sz="4"/>
               <w:left w:val="single" w:color="D4D1CA" w:sz="4"/>
@@ -645,13 +647,13 @@
                 <w:sz w:val="20"/>
                 <w:szCs w:val="20"/>
               </w:rPr>
-              <w:t xml:space="preserve">Music / Audio</w:t>
-            </w:r>
-          </w:p>
-        </w:tc>
-        <w:tc>
-          <w:tcPr>
-            <w:tcW w:type="dxa" w:w="3600"/>
+              <w:t xml:space="preserve">Main Screen</w:t>
+            </w:r>
+          </w:p>
+        </w:tc>
+        <w:tc>
+          <w:tcPr>
+            <w:tcW w:type="dxa" w:w="1800"/>
             <w:tcBorders>
               <w:top w:val="single" w:color="D4D1CA" w:sz="4"/>
               <w:left w:val="single" w:color="D4D1CA" w:sz="4"/>
@@ -677,26 +679,24 @@
                 <w:sz w:val="20"/>
                 <w:szCs w:val="20"/>
               </w:rPr>
-              <w:t xml:space="preserve">AV Action</w:t>
-            </w:r>
-          </w:p>
-        </w:tc>
-      </w:tr>
-      <w:tr>
-        <w:tc>
-          <w:tcPr>
-            <w:gridSpan w:val="5"/>
-            <w:tcBorders>
-              <w:top w:val="single" w:color="D4D1CA" w:sz="4"/>
-              <w:left w:val="single" w:color="D4D1CA" w:sz="4"/>
-              <w:bottom w:val="single" w:color="D4D1CA" w:sz="4"/>
-              <w:right w:val="single" w:color="D4D1CA" w:sz="4"/>
-            </w:tcBorders>
-            <w:shd w:fill="E87722" w:val="clear"/>
-            <w:tcMar>
-              <w:top w:type="dxa" w:w="80"/>
+              <w:t xml:space="preserve">Right Screen</w:t>
+            </w:r>
+          </w:p>
+        </w:tc>
+        <w:tc>
+          <w:tcPr>
+            <w:tcW w:type="dxa" w:w="2400"/>
+            <w:tcBorders>
+              <w:top w:val="single" w:color="D4D1CA" w:sz="4"/>
+              <w:left w:val="single" w:color="D4D1CA" w:sz="4"/>
+              <w:bottom w:val="single" w:color="D4D1CA" w:sz="4"/>
+              <w:right w:val="single" w:color="D4D1CA" w:sz="4"/>
+            </w:tcBorders>
+            <w:shd w:fill="0B1F3A" w:val="clear"/>
+            <w:tcMar>
+              <w:top w:type="dxa" w:w="100"/>
               <w:left w:type="dxa" w:w="120"/>
-              <w:bottom w:type="dxa" w:w="80"/>
+              <w:bottom w:type="dxa" w:w="100"/>
               <w:right w:type="dxa" w:w="120"/>
             </w:tcMar>
             <w:vAlign w:val="top"/>
@@ -711,7 +711,39 @@
                 <w:sz w:val="20"/>
                 <w:szCs w:val="20"/>
               </w:rPr>
-              <w:t xml:space="preserve">FREE MORNING PROGRAM</w:t>
+              <w:t xml:space="preserve">Music / Audio</w:t>
+            </w:r>
+          </w:p>
+        </w:tc>
+        <w:tc>
+          <w:tcPr>
+            <w:tcW w:type="dxa" w:w="2400"/>
+            <w:tcBorders>
+              <w:top w:val="single" w:color="D4D1CA" w:sz="4"/>
+              <w:left w:val="single" w:color="D4D1CA" w:sz="4"/>
+              <w:bottom w:val="single" w:color="D4D1CA" w:sz="4"/>
+              <w:right w:val="single" w:color="D4D1CA" w:sz="4"/>
+            </w:tcBorders>
+            <w:shd w:fill="0B1F3A" w:val="clear"/>
+            <w:tcMar>
+              <w:top w:type="dxa" w:w="100"/>
+              <w:left w:type="dxa" w:w="120"/>
+              <w:bottom w:type="dxa" w:w="100"/>
+              <w:right w:type="dxa" w:w="120"/>
+            </w:tcMar>
+            <w:vAlign w:val="top"/>
+          </w:tcPr>
+          <w:p>
+            <w:r>
+              <w:rPr>
+                <w:rFonts w:ascii="Calibri" w:cs="Calibri" w:eastAsia="Calibri" w:hAnsi="Calibri"/>
+                <w:b/>
+                <w:bCs/>
+                <w:color w:val="FFFFFF"/>
+                <w:sz w:val="20"/>
+                <w:szCs w:val="20"/>
+              </w:rPr>
+              <w:t xml:space="preserve">AV Action</w:t>
             </w:r>
           </w:p>
         </w:tc>
@@ -719,7 +751,41 @@
       <w:tr>
         <w:tc>
           <w:tcPr>
-            <w:tcW w:type="dxa" w:w="1500"/>
+            <w:gridSpan w:val="7"/>
+            <w:tcBorders>
+              <w:top w:val="single" w:color="D4D1CA" w:sz="4"/>
+              <w:left w:val="single" w:color="D4D1CA" w:sz="4"/>
+              <w:bottom w:val="single" w:color="D4D1CA" w:sz="4"/>
+              <w:right w:val="single" w:color="D4D1CA" w:sz="4"/>
+            </w:tcBorders>
+            <w:shd w:fill="E87722" w:val="clear"/>
+            <w:tcMar>
+              <w:top w:type="dxa" w:w="80"/>
+              <w:left w:type="dxa" w:w="120"/>
+              <w:bottom w:type="dxa" w:w="80"/>
+              <w:right w:type="dxa" w:w="120"/>
+            </w:tcMar>
+            <w:vAlign w:val="top"/>
+          </w:tcPr>
+          <w:p>
+            <w:r>
+              <w:rPr>
+                <w:rFonts w:ascii="Calibri" w:cs="Calibri" w:eastAsia="Calibri" w:hAnsi="Calibri"/>
+                <w:b/>
+                <w:bCs/>
+                <w:color w:val="FFFFFF"/>
+                <w:sz w:val="20"/>
+                <w:szCs w:val="20"/>
+              </w:rPr>
+              <w:t xml:space="preserve">FREE MORNING PROGRAM</w:t>
+            </w:r>
+          </w:p>
+        </w:tc>
+      </w:tr>
+      <w:tr>
+        <w:tc>
+          <w:tcPr>
+            <w:tcW w:type="dxa" w:w="1200"/>
             <w:tcBorders>
               <w:top w:val="single" w:color="D4D1CA" w:sz="4"/>
               <w:left w:val="single" w:color="D4D1CA" w:sz="4"/>
@@ -750,7 +816,7 @@
         </w:tc>
         <w:tc>
           <w:tcPr>
-            <w:tcW w:type="dxa" w:w="3200"/>
+            <w:tcW w:type="dxa" w:w="2600"/>
             <w:tcBorders>
               <w:top w:val="single" w:color="D4D1CA" w:sz="4"/>
               <w:left w:val="single" w:color="D4D1CA" w:sz="4"/>
@@ -781,7 +847,41 @@
         </w:tc>
         <w:tc>
           <w:tcPr>
-            <w:tcW w:type="dxa" w:w="2700"/>
+            <w:tcW w:type="dxa" w:w="1800"/>
+            <w:tcBorders>
+              <w:top w:val="single" w:color="D4D1CA" w:sz="4"/>
+              <w:left w:val="single" w:color="D4D1CA" w:sz="4"/>
+              <w:bottom w:val="single" w:color="D4D1CA" w:sz="4"/>
+              <w:right w:val="single" w:color="D4D1CA" w:sz="4"/>
+            </w:tcBorders>
+            <w:tcMar>
+              <w:top w:type="dxa" w:w="80"/>
+              <w:left w:type="dxa" w:w="100"/>
+              <w:bottom w:type="dxa" w:w="80"/>
+              <w:right w:type="dxa" w:w="100"/>
+            </w:tcMar>
+            <w:vAlign w:val="top"/>
+          </w:tcPr>
+          <w:p>
+            <w:pPr>
+              <w:spacing w:after="40" w:before="0"/>
+            </w:pPr>
+            <w:r>
+              <w:rPr>
+                <w:rFonts w:ascii="Calibri" w:cs="Calibri" w:eastAsia="Calibri" w:hAnsi="Calibri"/>
+                <w:b/>
+                <w:bCs/>
+                <w:color w:val="B0000A"/>
+                <w:sz w:val="18"/>
+                <w:szCs w:val="18"/>
+              </w:rPr>
+              <w:t xml:space="preserve">TBD (walkthrough)</w:t>
+            </w:r>
+          </w:p>
+        </w:tc>
+        <w:tc>
+          <w:tcPr>
+            <w:tcW w:type="dxa" w:w="2200"/>
             <w:tcBorders>
               <w:top w:val="single" w:color="D4D1CA" w:sz="4"/>
               <w:left w:val="single" w:color="D4D1CA" w:sz="4"/>
@@ -822,26 +922,60 @@
         </w:tc>
         <w:tc>
           <w:tcPr>
-            <w:tcW w:type="dxa" w:w="3400"/>
-            <w:tcBorders>
-              <w:top w:val="single" w:color="D4D1CA" w:sz="4"/>
-              <w:left w:val="single" w:color="D4D1CA" w:sz="4"/>
-              <w:bottom w:val="single" w:color="D4D1CA" w:sz="4"/>
-              <w:right w:val="single" w:color="D4D1CA" w:sz="4"/>
-            </w:tcBorders>
-            <w:tcMar>
-              <w:top w:type="dxa" w:w="80"/>
-              <w:left w:type="dxa" w:w="100"/>
-              <w:bottom w:type="dxa" w:w="80"/>
-              <w:right w:type="dxa" w:w="100"/>
-            </w:tcMar>
-            <w:vAlign w:val="top"/>
-          </w:tcPr>
-          <w:p>
-            <w:pPr>
-              <w:spacing w:after="40" w:before="0"/>
-            </w:pPr>
-            <w:hyperlink w:history="1" r:id="rId7g4hb52scwip7_1c5qrma">
+            <w:tcW w:type="dxa" w:w="1800"/>
+            <w:tcBorders>
+              <w:top w:val="single" w:color="D4D1CA" w:sz="4"/>
+              <w:left w:val="single" w:color="D4D1CA" w:sz="4"/>
+              <w:bottom w:val="single" w:color="D4D1CA" w:sz="4"/>
+              <w:right w:val="single" w:color="D4D1CA" w:sz="4"/>
+            </w:tcBorders>
+            <w:tcMar>
+              <w:top w:type="dxa" w:w="80"/>
+              <w:left w:type="dxa" w:w="100"/>
+              <w:bottom w:type="dxa" w:w="80"/>
+              <w:right w:type="dxa" w:w="100"/>
+            </w:tcMar>
+            <w:vAlign w:val="top"/>
+          </w:tcPr>
+          <w:p>
+            <w:pPr>
+              <w:spacing w:after="40" w:before="0"/>
+            </w:pPr>
+            <w:r>
+              <w:rPr>
+                <w:rFonts w:ascii="Calibri" w:cs="Calibri" w:eastAsia="Calibri" w:hAnsi="Calibri"/>
+                <w:b/>
+                <w:bCs/>
+                <w:color w:val="B0000A"/>
+                <w:sz w:val="18"/>
+                <w:szCs w:val="18"/>
+              </w:rPr>
+              <w:t xml:space="preserve">TBD (walkthrough)</w:t>
+            </w:r>
+          </w:p>
+        </w:tc>
+        <w:tc>
+          <w:tcPr>
+            <w:tcW w:type="dxa" w:w="2400"/>
+            <w:tcBorders>
+              <w:top w:val="single" w:color="D4D1CA" w:sz="4"/>
+              <w:left w:val="single" w:color="D4D1CA" w:sz="4"/>
+              <w:bottom w:val="single" w:color="D4D1CA" w:sz="4"/>
+              <w:right w:val="single" w:color="D4D1CA" w:sz="4"/>
+            </w:tcBorders>
+            <w:tcMar>
+              <w:top w:type="dxa" w:w="80"/>
+              <w:left w:type="dxa" w:w="100"/>
+              <w:bottom w:type="dxa" w:w="80"/>
+              <w:right w:type="dxa" w:w="100"/>
+            </w:tcMar>
+            <w:vAlign w:val="top"/>
+          </w:tcPr>
+          <w:p>
+            <w:pPr>
+              <w:spacing w:after="40" w:before="0"/>
+            </w:pPr>
+            <w:hyperlink w:history="1" r:id="rIdga3hwqj6u6xdi0fexsjqk">
               <w:r>
                 <w:rPr>
                   <w:rStyle w:val="Hyperlink"/>
@@ -856,7 +990,7 @@
         </w:tc>
         <w:tc>
           <w:tcPr>
-            <w:tcW w:type="dxa" w:w="3600"/>
+            <w:tcW w:type="dxa" w:w="2400"/>
             <w:tcBorders>
               <w:top w:val="single" w:color="D4D1CA" w:sz="4"/>
               <w:left w:val="single" w:color="D4D1CA" w:sz="4"/>
@@ -893,7 +1027,7 @@
               </w:rPr>
               <w:t xml:space="preserve">Open </w:t>
             </w:r>
-            <w:hyperlink w:history="1" r:id="rIdg-w_rd5bpd11-mohaj6gk">
+            <w:hyperlink w:history="1" r:id="rIdjdp7jscxt5z-bivrhtfum">
               <w:r>
                 <w:rPr>
                   <w:rStyle w:val="Hyperlink"/>
@@ -918,7 +1052,7 @@
       <w:tr>
         <w:tc>
           <w:tcPr>
-            <w:tcW w:type="dxa" w:w="1500"/>
+            <w:tcW w:type="dxa" w:w="1200"/>
             <w:tcBorders>
               <w:top w:val="single" w:color="D4D1CA" w:sz="4"/>
               <w:left w:val="single" w:color="D4D1CA" w:sz="4"/>
@@ -950,7 +1084,7 @@
         </w:tc>
         <w:tc>
           <w:tcPr>
-            <w:tcW w:type="dxa" w:w="3200"/>
+            <w:tcW w:type="dxa" w:w="2600"/>
             <w:tcBorders>
               <w:top w:val="single" w:color="D4D1CA" w:sz="4"/>
               <w:left w:val="single" w:color="D4D1CA" w:sz="4"/>
@@ -998,7 +1132,7 @@
         </w:tc>
         <w:tc>
           <w:tcPr>
-            <w:tcW w:type="dxa" w:w="2700"/>
+            <w:tcW w:type="dxa" w:w="1800"/>
             <w:tcBorders>
               <w:top w:val="single" w:color="D4D1CA" w:sz="4"/>
               <w:left w:val="single" w:color="D4D1CA" w:sz="4"/>
@@ -1021,6 +1155,41 @@
             <w:r>
               <w:rPr>
                 <w:rFonts w:ascii="Calibri" w:cs="Calibri" w:eastAsia="Calibri" w:hAnsi="Calibri"/>
+                <w:b/>
+                <w:bCs/>
+                <w:color w:val="B0000A"/>
+                <w:sz w:val="18"/>
+                <w:szCs w:val="18"/>
+              </w:rPr>
+              <w:t xml:space="preserve">TBD (walkthrough)</w:t>
+            </w:r>
+          </w:p>
+        </w:tc>
+        <w:tc>
+          <w:tcPr>
+            <w:tcW w:type="dxa" w:w="2200"/>
+            <w:tcBorders>
+              <w:top w:val="single" w:color="D4D1CA" w:sz="4"/>
+              <w:left w:val="single" w:color="D4D1CA" w:sz="4"/>
+              <w:bottom w:val="single" w:color="D4D1CA" w:sz="4"/>
+              <w:right w:val="single" w:color="D4D1CA" w:sz="4"/>
+            </w:tcBorders>
+            <w:shd w:fill="F5F1EA" w:val="clear"/>
+            <w:tcMar>
+              <w:top w:type="dxa" w:w="80"/>
+              <w:left w:type="dxa" w:w="100"/>
+              <w:bottom w:type="dxa" w:w="80"/>
+              <w:right w:type="dxa" w:w="100"/>
+            </w:tcMar>
+            <w:vAlign w:val="top"/>
+          </w:tcPr>
+          <w:p>
+            <w:pPr>
+              <w:spacing w:after="40" w:before="0"/>
+            </w:pPr>
+            <w:r>
+              <w:rPr>
+                <w:rFonts w:ascii="Calibri" w:cs="Calibri" w:eastAsia="Calibri" w:hAnsi="Calibri"/>
                 <w:sz w:val="18"/>
                 <w:szCs w:val="18"/>
               </w:rPr>
@@ -1030,7 +1199,7 @@
         </w:tc>
         <w:tc>
           <w:tcPr>
-            <w:tcW w:type="dxa" w:w="3400"/>
+            <w:tcW w:type="dxa" w:w="1800"/>
             <w:tcBorders>
               <w:top w:val="single" w:color="D4D1CA" w:sz="4"/>
               <w:left w:val="single" w:color="D4D1CA" w:sz="4"/>
@@ -1055,12 +1224,47 @@
                 <w:rFonts w:ascii="Calibri" w:cs="Calibri" w:eastAsia="Calibri" w:hAnsi="Calibri"/>
                 <w:b/>
                 <w:bCs/>
+                <w:color w:val="B0000A"/>
+                <w:sz w:val="18"/>
+                <w:szCs w:val="18"/>
+              </w:rPr>
+              <w:t xml:space="preserve">TBD (walkthrough)</w:t>
+            </w:r>
+          </w:p>
+        </w:tc>
+        <w:tc>
+          <w:tcPr>
+            <w:tcW w:type="dxa" w:w="2400"/>
+            <w:tcBorders>
+              <w:top w:val="single" w:color="D4D1CA" w:sz="4"/>
+              <w:left w:val="single" w:color="D4D1CA" w:sz="4"/>
+              <w:bottom w:val="single" w:color="D4D1CA" w:sz="4"/>
+              <w:right w:val="single" w:color="D4D1CA" w:sz="4"/>
+            </w:tcBorders>
+            <w:shd w:fill="F5F1EA" w:val="clear"/>
+            <w:tcMar>
+              <w:top w:type="dxa" w:w="80"/>
+              <w:left w:type="dxa" w:w="100"/>
+              <w:bottom w:type="dxa" w:w="80"/>
+              <w:right w:type="dxa" w:w="100"/>
+            </w:tcMar>
+            <w:vAlign w:val="top"/>
+          </w:tcPr>
+          <w:p>
+            <w:pPr>
+              <w:spacing w:after="40" w:before="0"/>
+            </w:pPr>
+            <w:r>
+              <w:rPr>
+                <w:rFonts w:ascii="Calibri" w:cs="Calibri" w:eastAsia="Calibri" w:hAnsi="Calibri"/>
+                <w:b/>
+                <w:bCs/>
                 <w:sz w:val="18"/>
                 <w:szCs w:val="18"/>
               </w:rPr>
               <w:t xml:space="preserve">Walk-on: </w:t>
             </w:r>
-            <w:hyperlink w:history="1" r:id="rIdk_ybm_rysmwergrk7vury">
+            <w:hyperlink w:history="1" r:id="rIdoitcay-hbguneaqjbnfwn">
               <w:r>
                 <w:rPr>
                   <w:rStyle w:val="Hyperlink"/>
@@ -1095,7 +1299,7 @@
         </w:tc>
         <w:tc>
           <w:tcPr>
-            <w:tcW w:type="dxa" w:w="3600"/>
+            <w:tcW w:type="dxa" w:w="2400"/>
             <w:tcBorders>
               <w:top w:val="single" w:color="D4D1CA" w:sz="4"/>
               <w:left w:val="single" w:color="D4D1CA" w:sz="4"/>
@@ -1129,7 +1333,7 @@
       <w:tr>
         <w:tc>
           <w:tcPr>
-            <w:tcW w:type="dxa" w:w="1500"/>
+            <w:tcW w:type="dxa" w:w="1200"/>
             <w:tcBorders>
               <w:top w:val="single" w:color="D4D1CA" w:sz="4"/>
               <w:left w:val="single" w:color="D4D1CA" w:sz="4"/>
@@ -1160,7 +1364,7 @@
         </w:tc>
         <w:tc>
           <w:tcPr>
-            <w:tcW w:type="dxa" w:w="3200"/>
+            <w:tcW w:type="dxa" w:w="2600"/>
             <w:tcBorders>
               <w:top w:val="single" w:color="D4D1CA" w:sz="4"/>
               <w:left w:val="single" w:color="D4D1CA" w:sz="4"/>
@@ -1191,7 +1395,41 @@
         </w:tc>
         <w:tc>
           <w:tcPr>
-            <w:tcW w:type="dxa" w:w="2700"/>
+            <w:tcW w:type="dxa" w:w="1800"/>
+            <w:tcBorders>
+              <w:top w:val="single" w:color="D4D1CA" w:sz="4"/>
+              <w:left w:val="single" w:color="D4D1CA" w:sz="4"/>
+              <w:bottom w:val="single" w:color="D4D1CA" w:sz="4"/>
+              <w:right w:val="single" w:color="D4D1CA" w:sz="4"/>
+            </w:tcBorders>
+            <w:tcMar>
+              <w:top w:type="dxa" w:w="80"/>
+              <w:left w:type="dxa" w:w="100"/>
+              <w:bottom w:type="dxa" w:w="80"/>
+              <w:right w:type="dxa" w:w="100"/>
+            </w:tcMar>
+            <w:vAlign w:val="top"/>
+          </w:tcPr>
+          <w:p>
+            <w:pPr>
+              <w:spacing w:after="40" w:before="0"/>
+            </w:pPr>
+            <w:r>
+              <w:rPr>
+                <w:rFonts w:ascii="Calibri" w:cs="Calibri" w:eastAsia="Calibri" w:hAnsi="Calibri"/>
+                <w:b/>
+                <w:bCs/>
+                <w:color w:val="B0000A"/>
+                <w:sz w:val="18"/>
+                <w:szCs w:val="18"/>
+              </w:rPr>
+              <w:t xml:space="preserve">TBD (walkthrough)</w:t>
+            </w:r>
+          </w:p>
+        </w:tc>
+        <w:tc>
+          <w:tcPr>
+            <w:tcW w:type="dxa" w:w="2200"/>
             <w:tcBorders>
               <w:top w:val="single" w:color="D4D1CA" w:sz="4"/>
               <w:left w:val="single" w:color="D4D1CA" w:sz="4"/>
@@ -1232,26 +1470,60 @@
         </w:tc>
         <w:tc>
           <w:tcPr>
-            <w:tcW w:type="dxa" w:w="3400"/>
-            <w:tcBorders>
-              <w:top w:val="single" w:color="D4D1CA" w:sz="4"/>
-              <w:left w:val="single" w:color="D4D1CA" w:sz="4"/>
-              <w:bottom w:val="single" w:color="D4D1CA" w:sz="4"/>
-              <w:right w:val="single" w:color="D4D1CA" w:sz="4"/>
-            </w:tcBorders>
-            <w:tcMar>
-              <w:top w:type="dxa" w:w="80"/>
-              <w:left w:type="dxa" w:w="100"/>
-              <w:bottom w:type="dxa" w:w="80"/>
-              <w:right w:type="dxa" w:w="100"/>
-            </w:tcMar>
-            <w:vAlign w:val="top"/>
-          </w:tcPr>
-          <w:p>
-            <w:pPr>
-              <w:spacing w:after="40" w:before="0"/>
-            </w:pPr>
-            <w:hyperlink w:history="1" r:id="rIdhqrf1qa3ztk8q-y-w1bx-">
+            <w:tcW w:type="dxa" w:w="1800"/>
+            <w:tcBorders>
+              <w:top w:val="single" w:color="D4D1CA" w:sz="4"/>
+              <w:left w:val="single" w:color="D4D1CA" w:sz="4"/>
+              <w:bottom w:val="single" w:color="D4D1CA" w:sz="4"/>
+              <w:right w:val="single" w:color="D4D1CA" w:sz="4"/>
+            </w:tcBorders>
+            <w:tcMar>
+              <w:top w:type="dxa" w:w="80"/>
+              <w:left w:type="dxa" w:w="100"/>
+              <w:bottom w:type="dxa" w:w="80"/>
+              <w:right w:type="dxa" w:w="100"/>
+            </w:tcMar>
+            <w:vAlign w:val="top"/>
+          </w:tcPr>
+          <w:p>
+            <w:pPr>
+              <w:spacing w:after="40" w:before="0"/>
+            </w:pPr>
+            <w:r>
+              <w:rPr>
+                <w:rFonts w:ascii="Calibri" w:cs="Calibri" w:eastAsia="Calibri" w:hAnsi="Calibri"/>
+                <w:b/>
+                <w:bCs/>
+                <w:color w:val="B0000A"/>
+                <w:sz w:val="18"/>
+                <w:szCs w:val="18"/>
+              </w:rPr>
+              <w:t xml:space="preserve">TBD (walkthrough)</w:t>
+            </w:r>
+          </w:p>
+        </w:tc>
+        <w:tc>
+          <w:tcPr>
+            <w:tcW w:type="dxa" w:w="2400"/>
+            <w:tcBorders>
+              <w:top w:val="single" w:color="D4D1CA" w:sz="4"/>
+              <w:left w:val="single" w:color="D4D1CA" w:sz="4"/>
+              <w:bottom w:val="single" w:color="D4D1CA" w:sz="4"/>
+              <w:right w:val="single" w:color="D4D1CA" w:sz="4"/>
+            </w:tcBorders>
+            <w:tcMar>
+              <w:top w:type="dxa" w:w="80"/>
+              <w:left w:type="dxa" w:w="100"/>
+              <w:bottom w:type="dxa" w:w="80"/>
+              <w:right w:type="dxa" w:w="100"/>
+            </w:tcMar>
+            <w:vAlign w:val="top"/>
+          </w:tcPr>
+          <w:p>
+            <w:pPr>
+              <w:spacing w:after="40" w:before="0"/>
+            </w:pPr>
+            <w:hyperlink w:history="1" r:id="rIdwcqis82n0_f0uaxt6bf4j">
               <w:r>
                 <w:rPr>
                   <w:rStyle w:val="Hyperlink"/>
@@ -1266,7 +1538,7 @@
         </w:tc>
         <w:tc>
           <w:tcPr>
-            <w:tcW w:type="dxa" w:w="3600"/>
+            <w:tcW w:type="dxa" w:w="2400"/>
             <w:tcBorders>
               <w:top w:val="single" w:color="D4D1CA" w:sz="4"/>
               <w:left w:val="single" w:color="D4D1CA" w:sz="4"/>
@@ -1363,7 +1635,7 @@
       <w:tr>
         <w:tc>
           <w:tcPr>
-            <w:tcW w:type="dxa" w:w="1500"/>
+            <w:tcW w:type="dxa" w:w="1200"/>
             <w:tcBorders>
               <w:top w:val="single" w:color="D4D1CA" w:sz="4"/>
               <w:left w:val="single" w:color="D4D1CA" w:sz="4"/>
@@ -1395,7 +1667,7 @@
         </w:tc>
         <w:tc>
           <w:tcPr>
-            <w:tcW w:type="dxa" w:w="3200"/>
+            <w:tcW w:type="dxa" w:w="2600"/>
             <w:tcBorders>
               <w:top w:val="single" w:color="D4D1CA" w:sz="4"/>
               <w:left w:val="single" w:color="D4D1CA" w:sz="4"/>
@@ -1443,7 +1715,7 @@
         </w:tc>
         <w:tc>
           <w:tcPr>
-            <w:tcW w:type="dxa" w:w="2700"/>
+            <w:tcW w:type="dxa" w:w="1800"/>
             <w:tcBorders>
               <w:top w:val="single" w:color="D4D1CA" w:sz="4"/>
               <w:left w:val="single" w:color="D4D1CA" w:sz="4"/>
@@ -1466,6 +1738,41 @@
             <w:r>
               <w:rPr>
                 <w:rFonts w:ascii="Calibri" w:cs="Calibri" w:eastAsia="Calibri" w:hAnsi="Calibri"/>
+                <w:b/>
+                <w:bCs/>
+                <w:color w:val="B0000A"/>
+                <w:sz w:val="18"/>
+                <w:szCs w:val="18"/>
+              </w:rPr>
+              <w:t xml:space="preserve">TBD (walkthrough)</w:t>
+            </w:r>
+          </w:p>
+        </w:tc>
+        <w:tc>
+          <w:tcPr>
+            <w:tcW w:type="dxa" w:w="2200"/>
+            <w:tcBorders>
+              <w:top w:val="single" w:color="D4D1CA" w:sz="4"/>
+              <w:left w:val="single" w:color="D4D1CA" w:sz="4"/>
+              <w:bottom w:val="single" w:color="D4D1CA" w:sz="4"/>
+              <w:right w:val="single" w:color="D4D1CA" w:sz="4"/>
+            </w:tcBorders>
+            <w:shd w:fill="F5F1EA" w:val="clear"/>
+            <w:tcMar>
+              <w:top w:type="dxa" w:w="80"/>
+              <w:left w:type="dxa" w:w="100"/>
+              <w:bottom w:type="dxa" w:w="80"/>
+              <w:right w:type="dxa" w:w="100"/>
+            </w:tcMar>
+            <w:vAlign w:val="top"/>
+          </w:tcPr>
+          <w:p>
+            <w:pPr>
+              <w:spacing w:after="40" w:before="0"/>
+            </w:pPr>
+            <w:r>
+              <w:rPr>
+                <w:rFonts w:ascii="Calibri" w:cs="Calibri" w:eastAsia="Calibri" w:hAnsi="Calibri"/>
                 <w:sz w:val="18"/>
                 <w:szCs w:val="18"/>
               </w:rPr>
@@ -1475,7 +1782,7 @@
         </w:tc>
         <w:tc>
           <w:tcPr>
-            <w:tcW w:type="dxa" w:w="3400"/>
+            <w:tcW w:type="dxa" w:w="1800"/>
             <w:tcBorders>
               <w:top w:val="single" w:color="D4D1CA" w:sz="4"/>
               <w:left w:val="single" w:color="D4D1CA" w:sz="4"/>
@@ -1500,12 +1807,47 @@
                 <w:rFonts w:ascii="Calibri" w:cs="Calibri" w:eastAsia="Calibri" w:hAnsi="Calibri"/>
                 <w:b/>
                 <w:bCs/>
+                <w:color w:val="B0000A"/>
+                <w:sz w:val="18"/>
+                <w:szCs w:val="18"/>
+              </w:rPr>
+              <w:t xml:space="preserve">TBD (walkthrough)</w:t>
+            </w:r>
+          </w:p>
+        </w:tc>
+        <w:tc>
+          <w:tcPr>
+            <w:tcW w:type="dxa" w:w="2400"/>
+            <w:tcBorders>
+              <w:top w:val="single" w:color="D4D1CA" w:sz="4"/>
+              <w:left w:val="single" w:color="D4D1CA" w:sz="4"/>
+              <w:bottom w:val="single" w:color="D4D1CA" w:sz="4"/>
+              <w:right w:val="single" w:color="D4D1CA" w:sz="4"/>
+            </w:tcBorders>
+            <w:shd w:fill="F5F1EA" w:val="clear"/>
+            <w:tcMar>
+              <w:top w:type="dxa" w:w="80"/>
+              <w:left w:type="dxa" w:w="100"/>
+              <w:bottom w:type="dxa" w:w="80"/>
+              <w:right w:type="dxa" w:w="100"/>
+            </w:tcMar>
+            <w:vAlign w:val="top"/>
+          </w:tcPr>
+          <w:p>
+            <w:pPr>
+              <w:spacing w:after="40" w:before="0"/>
+            </w:pPr>
+            <w:r>
+              <w:rPr>
+                <w:rFonts w:ascii="Calibri" w:cs="Calibri" w:eastAsia="Calibri" w:hAnsi="Calibri"/>
+                <w:b/>
+                <w:bCs/>
                 <w:sz w:val="18"/>
                 <w:szCs w:val="18"/>
               </w:rPr>
               <w:t xml:space="preserve">Walk-on: </w:t>
             </w:r>
-            <w:hyperlink w:history="1" r:id="rIdzh9qz-8eednpisvozrdkm">
+            <w:hyperlink w:history="1" r:id="rIdy76btka7jtdkd31icef28">
               <w:r>
                 <w:rPr>
                   <w:rStyle w:val="Hyperlink"/>
@@ -1530,7 +1872,7 @@
         </w:tc>
         <w:tc>
           <w:tcPr>
-            <w:tcW w:type="dxa" w:w="3600"/>
+            <w:tcW w:type="dxa" w:w="2400"/>
             <w:tcBorders>
               <w:top w:val="single" w:color="D4D1CA" w:sz="4"/>
               <w:left w:val="single" w:color="D4D1CA" w:sz="4"/>
@@ -1564,7 +1906,7 @@
       <w:tr>
         <w:tc>
           <w:tcPr>
-            <w:tcW w:type="dxa" w:w="1500"/>
+            <w:tcW w:type="dxa" w:w="1200"/>
             <w:tcBorders>
               <w:top w:val="single" w:color="D4D1CA" w:sz="4"/>
               <w:left w:val="single" w:color="D4D1CA" w:sz="4"/>
@@ -1595,7 +1937,7 @@
         </w:tc>
         <w:tc>
           <w:tcPr>
-            <w:tcW w:type="dxa" w:w="3200"/>
+            <w:tcW w:type="dxa" w:w="2600"/>
             <w:tcBorders>
               <w:top w:val="single" w:color="D4D1CA" w:sz="4"/>
               <w:left w:val="single" w:color="D4D1CA" w:sz="4"/>
@@ -1626,7 +1968,41 @@
         </w:tc>
         <w:tc>
           <w:tcPr>
-            <w:tcW w:type="dxa" w:w="2700"/>
+            <w:tcW w:type="dxa" w:w="1800"/>
+            <w:tcBorders>
+              <w:top w:val="single" w:color="D4D1CA" w:sz="4"/>
+              <w:left w:val="single" w:color="D4D1CA" w:sz="4"/>
+              <w:bottom w:val="single" w:color="D4D1CA" w:sz="4"/>
+              <w:right w:val="single" w:color="D4D1CA" w:sz="4"/>
+            </w:tcBorders>
+            <w:tcMar>
+              <w:top w:type="dxa" w:w="80"/>
+              <w:left w:type="dxa" w:w="100"/>
+              <w:bottom w:type="dxa" w:w="80"/>
+              <w:right w:type="dxa" w:w="100"/>
+            </w:tcMar>
+            <w:vAlign w:val="top"/>
+          </w:tcPr>
+          <w:p>
+            <w:pPr>
+              <w:spacing w:after="40" w:before="0"/>
+            </w:pPr>
+            <w:r>
+              <w:rPr>
+                <w:rFonts w:ascii="Calibri" w:cs="Calibri" w:eastAsia="Calibri" w:hAnsi="Calibri"/>
+                <w:b/>
+                <w:bCs/>
+                <w:color w:val="B0000A"/>
+                <w:sz w:val="18"/>
+                <w:szCs w:val="18"/>
+              </w:rPr>
+              <w:t xml:space="preserve">TBD (walkthrough)</w:t>
+            </w:r>
+          </w:p>
+        </w:tc>
+        <w:tc>
+          <w:tcPr>
+            <w:tcW w:type="dxa" w:w="2200"/>
             <w:tcBorders>
               <w:top w:val="single" w:color="D4D1CA" w:sz="4"/>
               <w:left w:val="single" w:color="D4D1CA" w:sz="4"/>
@@ -1667,26 +2043,60 @@
         </w:tc>
         <w:tc>
           <w:tcPr>
-            <w:tcW w:type="dxa" w:w="3400"/>
-            <w:tcBorders>
-              <w:top w:val="single" w:color="D4D1CA" w:sz="4"/>
-              <w:left w:val="single" w:color="D4D1CA" w:sz="4"/>
-              <w:bottom w:val="single" w:color="D4D1CA" w:sz="4"/>
-              <w:right w:val="single" w:color="D4D1CA" w:sz="4"/>
-            </w:tcBorders>
-            <w:tcMar>
-              <w:top w:type="dxa" w:w="80"/>
-              <w:left w:type="dxa" w:w="100"/>
-              <w:bottom w:type="dxa" w:w="80"/>
-              <w:right w:type="dxa" w:w="100"/>
-            </w:tcMar>
-            <w:vAlign w:val="top"/>
-          </w:tcPr>
-          <w:p>
-            <w:pPr>
-              <w:spacing w:after="40" w:before="0"/>
-            </w:pPr>
-            <w:hyperlink w:history="1" r:id="rIdscrzzpfj89q3xg7wqdu_g">
+            <w:tcW w:type="dxa" w:w="1800"/>
+            <w:tcBorders>
+              <w:top w:val="single" w:color="D4D1CA" w:sz="4"/>
+              <w:left w:val="single" w:color="D4D1CA" w:sz="4"/>
+              <w:bottom w:val="single" w:color="D4D1CA" w:sz="4"/>
+              <w:right w:val="single" w:color="D4D1CA" w:sz="4"/>
+            </w:tcBorders>
+            <w:tcMar>
+              <w:top w:type="dxa" w:w="80"/>
+              <w:left w:type="dxa" w:w="100"/>
+              <w:bottom w:type="dxa" w:w="80"/>
+              <w:right w:type="dxa" w:w="100"/>
+            </w:tcMar>
+            <w:vAlign w:val="top"/>
+          </w:tcPr>
+          <w:p>
+            <w:pPr>
+              <w:spacing w:after="40" w:before="0"/>
+            </w:pPr>
+            <w:r>
+              <w:rPr>
+                <w:rFonts w:ascii="Calibri" w:cs="Calibri" w:eastAsia="Calibri" w:hAnsi="Calibri"/>
+                <w:b/>
+                <w:bCs/>
+                <w:color w:val="B0000A"/>
+                <w:sz w:val="18"/>
+                <w:szCs w:val="18"/>
+              </w:rPr>
+              <w:t xml:space="preserve">TBD (walkthrough)</w:t>
+            </w:r>
+          </w:p>
+        </w:tc>
+        <w:tc>
+          <w:tcPr>
+            <w:tcW w:type="dxa" w:w="2400"/>
+            <w:tcBorders>
+              <w:top w:val="single" w:color="D4D1CA" w:sz="4"/>
+              <w:left w:val="single" w:color="D4D1CA" w:sz="4"/>
+              <w:bottom w:val="single" w:color="D4D1CA" w:sz="4"/>
+              <w:right w:val="single" w:color="D4D1CA" w:sz="4"/>
+            </w:tcBorders>
+            <w:tcMar>
+              <w:top w:type="dxa" w:w="80"/>
+              <w:left w:type="dxa" w:w="100"/>
+              <w:bottom w:type="dxa" w:w="80"/>
+              <w:right w:type="dxa" w:w="100"/>
+            </w:tcMar>
+            <w:vAlign w:val="top"/>
+          </w:tcPr>
+          <w:p>
+            <w:pPr>
+              <w:spacing w:after="40" w:before="0"/>
+            </w:pPr>
+            <w:hyperlink w:history="1" r:id="rIdk4fbhe4i2ljbd1zol2mme">
               <w:r>
                 <w:rPr>
                   <w:rStyle w:val="Hyperlink"/>
@@ -1701,7 +2111,7 @@
         </w:tc>
         <w:tc>
           <w:tcPr>
-            <w:tcW w:type="dxa" w:w="3600"/>
+            <w:tcW w:type="dxa" w:w="2400"/>
             <w:tcBorders>
               <w:top w:val="single" w:color="D4D1CA" w:sz="4"/>
               <w:left w:val="single" w:color="D4D1CA" w:sz="4"/>
@@ -1756,7 +2166,7 @@
               </w:rPr>
               <w:t xml:space="preserve"> to exit Celebrations loop. One-click: </w:t>
             </w:r>
-            <w:hyperlink w:history="1" r:id="rId5yx6vdfjsj3_zr4bbl9rp">
+            <w:hyperlink w:history="1" r:id="rIdc97tmb9h1g-codmaffb8k">
               <w:r>
                 <w:rPr>
                   <w:rStyle w:val="Hyperlink"/>
@@ -1781,7 +2191,7 @@
       <w:tr>
         <w:tc>
           <w:tcPr>
-            <w:tcW w:type="dxa" w:w="1500"/>
+            <w:tcW w:type="dxa" w:w="1200"/>
             <w:tcBorders>
               <w:top w:val="single" w:color="D4D1CA" w:sz="4"/>
               <w:left w:val="single" w:color="D4D1CA" w:sz="4"/>
@@ -1813,7 +2223,7 @@
         </w:tc>
         <w:tc>
           <w:tcPr>
-            <w:tcW w:type="dxa" w:w="3200"/>
+            <w:tcW w:type="dxa" w:w="2600"/>
             <w:tcBorders>
               <w:top w:val="single" w:color="D4D1CA" w:sz="4"/>
               <w:left w:val="single" w:color="D4D1CA" w:sz="4"/>
@@ -1861,7 +2271,7 @@
         </w:tc>
         <w:tc>
           <w:tcPr>
-            <w:tcW w:type="dxa" w:w="2700"/>
+            <w:tcW w:type="dxa" w:w="1800"/>
             <w:tcBorders>
               <w:top w:val="single" w:color="D4D1CA" w:sz="4"/>
               <w:left w:val="single" w:color="D4D1CA" w:sz="4"/>
@@ -1884,6 +2294,41 @@
             <w:r>
               <w:rPr>
                 <w:rFonts w:ascii="Calibri" w:cs="Calibri" w:eastAsia="Calibri" w:hAnsi="Calibri"/>
+                <w:b/>
+                <w:bCs/>
+                <w:color w:val="B0000A"/>
+                <w:sz w:val="18"/>
+                <w:szCs w:val="18"/>
+              </w:rPr>
+              <w:t xml:space="preserve">TBD (walkthrough)</w:t>
+            </w:r>
+          </w:p>
+        </w:tc>
+        <w:tc>
+          <w:tcPr>
+            <w:tcW w:type="dxa" w:w="2200"/>
+            <w:tcBorders>
+              <w:top w:val="single" w:color="D4D1CA" w:sz="4"/>
+              <w:left w:val="single" w:color="D4D1CA" w:sz="4"/>
+              <w:bottom w:val="single" w:color="D4D1CA" w:sz="4"/>
+              <w:right w:val="single" w:color="D4D1CA" w:sz="4"/>
+            </w:tcBorders>
+            <w:shd w:fill="F5F1EA" w:val="clear"/>
+            <w:tcMar>
+              <w:top w:type="dxa" w:w="80"/>
+              <w:left w:type="dxa" w:w="100"/>
+              <w:bottom w:type="dxa" w:w="80"/>
+              <w:right w:type="dxa" w:w="100"/>
+            </w:tcMar>
+            <w:vAlign w:val="top"/>
+          </w:tcPr>
+          <w:p>
+            <w:pPr>
+              <w:spacing w:after="40" w:before="0"/>
+            </w:pPr>
+            <w:r>
+              <w:rPr>
+                <w:rFonts w:ascii="Calibri" w:cs="Calibri" w:eastAsia="Calibri" w:hAnsi="Calibri"/>
                 <w:sz w:val="18"/>
                 <w:szCs w:val="18"/>
               </w:rPr>
@@ -1893,7 +2338,7 @@
         </w:tc>
         <w:tc>
           <w:tcPr>
-            <w:tcW w:type="dxa" w:w="3400"/>
+            <w:tcW w:type="dxa" w:w="1800"/>
             <w:tcBorders>
               <w:top w:val="single" w:color="D4D1CA" w:sz="4"/>
               <w:left w:val="single" w:color="D4D1CA" w:sz="4"/>
@@ -1918,12 +2363,47 @@
                 <w:rFonts w:ascii="Calibri" w:cs="Calibri" w:eastAsia="Calibri" w:hAnsi="Calibri"/>
                 <w:b/>
                 <w:bCs/>
+                <w:color w:val="B0000A"/>
+                <w:sz w:val="18"/>
+                <w:szCs w:val="18"/>
+              </w:rPr>
+              <w:t xml:space="preserve">TBD (walkthrough)</w:t>
+            </w:r>
+          </w:p>
+        </w:tc>
+        <w:tc>
+          <w:tcPr>
+            <w:tcW w:type="dxa" w:w="2400"/>
+            <w:tcBorders>
+              <w:top w:val="single" w:color="D4D1CA" w:sz="4"/>
+              <w:left w:val="single" w:color="D4D1CA" w:sz="4"/>
+              <w:bottom w:val="single" w:color="D4D1CA" w:sz="4"/>
+              <w:right w:val="single" w:color="D4D1CA" w:sz="4"/>
+            </w:tcBorders>
+            <w:shd w:fill="F5F1EA" w:val="clear"/>
+            <w:tcMar>
+              <w:top w:type="dxa" w:w="80"/>
+              <w:left w:type="dxa" w:w="100"/>
+              <w:bottom w:type="dxa" w:w="80"/>
+              <w:right w:type="dxa" w:w="100"/>
+            </w:tcMar>
+            <w:vAlign w:val="top"/>
+          </w:tcPr>
+          <w:p>
+            <w:pPr>
+              <w:spacing w:after="40" w:before="0"/>
+            </w:pPr>
+            <w:r>
+              <w:rPr>
+                <w:rFonts w:ascii="Calibri" w:cs="Calibri" w:eastAsia="Calibri" w:hAnsi="Calibri"/>
+                <w:b/>
+                <w:bCs/>
                 <w:sz w:val="18"/>
                 <w:szCs w:val="18"/>
               </w:rPr>
               <w:t xml:space="preserve">Walk-on: </w:t>
             </w:r>
-            <w:hyperlink w:history="1" r:id="rIdbj3j9ajreiiz5xjc9ohoz">
+            <w:hyperlink w:history="1" r:id="rIdx3l371ypbvdc0hw6uwo90">
               <w:r>
                 <w:rPr>
                   <w:rStyle w:val="Hyperlink"/>
@@ -1948,7 +2428,7 @@
         </w:tc>
         <w:tc>
           <w:tcPr>
-            <w:tcW w:type="dxa" w:w="3600"/>
+            <w:tcW w:type="dxa" w:w="2400"/>
             <w:tcBorders>
               <w:top w:val="single" w:color="D4D1CA" w:sz="4"/>
               <w:left w:val="single" w:color="D4D1CA" w:sz="4"/>
@@ -1982,7 +2462,7 @@
       <w:tr>
         <w:tc>
           <w:tcPr>
-            <w:tcW w:type="dxa" w:w="1500"/>
+            <w:tcW w:type="dxa" w:w="1200"/>
             <w:tcBorders>
               <w:top w:val="single" w:color="D4D1CA" w:sz="4"/>
               <w:left w:val="single" w:color="D4D1CA" w:sz="4"/>
@@ -2013,7 +2493,7 @@
         </w:tc>
         <w:tc>
           <w:tcPr>
-            <w:tcW w:type="dxa" w:w="3200"/>
+            <w:tcW w:type="dxa" w:w="2600"/>
             <w:tcBorders>
               <w:top w:val="single" w:color="D4D1CA" w:sz="4"/>
               <w:left w:val="single" w:color="D4D1CA" w:sz="4"/>
@@ -2044,7 +2524,41 @@
         </w:tc>
         <w:tc>
           <w:tcPr>
-            <w:tcW w:type="dxa" w:w="2700"/>
+            <w:tcW w:type="dxa" w:w="1800"/>
+            <w:tcBorders>
+              <w:top w:val="single" w:color="D4D1CA" w:sz="4"/>
+              <w:left w:val="single" w:color="D4D1CA" w:sz="4"/>
+              <w:bottom w:val="single" w:color="D4D1CA" w:sz="4"/>
+              <w:right w:val="single" w:color="D4D1CA" w:sz="4"/>
+            </w:tcBorders>
+            <w:tcMar>
+              <w:top w:type="dxa" w:w="80"/>
+              <w:left w:type="dxa" w:w="100"/>
+              <w:bottom w:type="dxa" w:w="80"/>
+              <w:right w:type="dxa" w:w="100"/>
+            </w:tcMar>
+            <w:vAlign w:val="top"/>
+          </w:tcPr>
+          <w:p>
+            <w:pPr>
+              <w:spacing w:after="40" w:before="0"/>
+            </w:pPr>
+            <w:r>
+              <w:rPr>
+                <w:rFonts w:ascii="Calibri" w:cs="Calibri" w:eastAsia="Calibri" w:hAnsi="Calibri"/>
+                <w:b/>
+                <w:bCs/>
+                <w:color w:val="B0000A"/>
+                <w:sz w:val="18"/>
+                <w:szCs w:val="18"/>
+              </w:rPr>
+              <w:t xml:space="preserve">TBD (walkthrough)</w:t>
+            </w:r>
+          </w:p>
+        </w:tc>
+        <w:tc>
+          <w:tcPr>
+            <w:tcW w:type="dxa" w:w="2200"/>
             <w:tcBorders>
               <w:top w:val="single" w:color="D4D1CA" w:sz="4"/>
               <w:left w:val="single" w:color="D4D1CA" w:sz="4"/>
@@ -2085,7 +2599,41 @@
         </w:tc>
         <w:tc>
           <w:tcPr>
-            <w:tcW w:type="dxa" w:w="3400"/>
+            <w:tcW w:type="dxa" w:w="1800"/>
+            <w:tcBorders>
+              <w:top w:val="single" w:color="D4D1CA" w:sz="4"/>
+              <w:left w:val="single" w:color="D4D1CA" w:sz="4"/>
+              <w:bottom w:val="single" w:color="D4D1CA" w:sz="4"/>
+              <w:right w:val="single" w:color="D4D1CA" w:sz="4"/>
+            </w:tcBorders>
+            <w:tcMar>
+              <w:top w:type="dxa" w:w="80"/>
+              <w:left w:type="dxa" w:w="100"/>
+              <w:bottom w:type="dxa" w:w="80"/>
+              <w:right w:type="dxa" w:w="100"/>
+            </w:tcMar>
+            <w:vAlign w:val="top"/>
+          </w:tcPr>
+          <w:p>
+            <w:pPr>
+              <w:spacing w:after="40" w:before="0"/>
+            </w:pPr>
+            <w:r>
+              <w:rPr>
+                <w:rFonts w:ascii="Calibri" w:cs="Calibri" w:eastAsia="Calibri" w:hAnsi="Calibri"/>
+                <w:b/>
+                <w:bCs/>
+                <w:color w:val="B0000A"/>
+                <w:sz w:val="18"/>
+                <w:szCs w:val="18"/>
+              </w:rPr>
+              <w:t xml:space="preserve">TBD (walkthrough)</w:t>
+            </w:r>
+          </w:p>
+        </w:tc>
+        <w:tc>
+          <w:tcPr>
+            <w:tcW w:type="dxa" w:w="2400"/>
             <w:tcBorders>
               <w:top w:val="single" w:color="D4D1CA" w:sz="4"/>
               <w:left w:val="single" w:color="D4D1CA" w:sz="4"/>
@@ -2114,7 +2662,7 @@
               </w:rPr>
               <w:t xml:space="preserve">Pre-Lunch: </w:t>
             </w:r>
-            <w:hyperlink w:history="1" r:id="rIdww2p6jcsveiqwwrtu6puc">
+            <w:hyperlink w:history="1" r:id="rIdh6pykl7kwvqj_-e52ef7a">
               <w:r>
                 <w:rPr>
                   <w:rStyle w:val="Hyperlink"/>
@@ -2139,7 +2687,7 @@
         </w:tc>
         <w:tc>
           <w:tcPr>
-            <w:tcW w:type="dxa" w:w="3600"/>
+            <w:tcW w:type="dxa" w:w="2400"/>
             <w:tcBorders>
               <w:top w:val="single" w:color="D4D1CA" w:sz="4"/>
               <w:left w:val="single" w:color="D4D1CA" w:sz="4"/>
@@ -2218,7 +2766,7 @@
       <w:tr>
         <w:tc>
           <w:tcPr>
-            <w:gridSpan w:val="5"/>
+            <w:gridSpan w:val="7"/>
             <w:tcBorders>
               <w:top w:val="single" w:color="D4D1CA" w:sz="4"/>
               <w:left w:val="single" w:color="D4D1CA" w:sz="4"/>
@@ -2252,7 +2800,7 @@
       <w:tr>
         <w:tc>
           <w:tcPr>
-            <w:tcW w:type="dxa" w:w="1500"/>
+            <w:tcW w:type="dxa" w:w="1200"/>
             <w:tcBorders>
               <w:top w:val="single" w:color="D4D1CA" w:sz="4"/>
               <w:left w:val="single" w:color="D4D1CA" w:sz="4"/>
@@ -2284,7 +2832,7 @@
         </w:tc>
         <w:tc>
           <w:tcPr>
-            <w:tcW w:type="dxa" w:w="3200"/>
+            <w:tcW w:type="dxa" w:w="2600"/>
             <w:tcBorders>
               <w:top w:val="single" w:color="D4D1CA" w:sz="4"/>
               <w:left w:val="single" w:color="D4D1CA" w:sz="4"/>
@@ -2332,7 +2880,7 @@
         </w:tc>
         <w:tc>
           <w:tcPr>
-            <w:tcW w:type="dxa" w:w="2700"/>
+            <w:tcW w:type="dxa" w:w="1800"/>
             <w:tcBorders>
               <w:top w:val="single" w:color="D4D1CA" w:sz="4"/>
               <w:left w:val="single" w:color="D4D1CA" w:sz="4"/>
@@ -2355,6 +2903,41 @@
             <w:r>
               <w:rPr>
                 <w:rFonts w:ascii="Calibri" w:cs="Calibri" w:eastAsia="Calibri" w:hAnsi="Calibri"/>
+                <w:b/>
+                <w:bCs/>
+                <w:color w:val="B0000A"/>
+                <w:sz w:val="18"/>
+                <w:szCs w:val="18"/>
+              </w:rPr>
+              <w:t xml:space="preserve">TBD (walkthrough)</w:t>
+            </w:r>
+          </w:p>
+        </w:tc>
+        <w:tc>
+          <w:tcPr>
+            <w:tcW w:type="dxa" w:w="2200"/>
+            <w:tcBorders>
+              <w:top w:val="single" w:color="D4D1CA" w:sz="4"/>
+              <w:left w:val="single" w:color="D4D1CA" w:sz="4"/>
+              <w:bottom w:val="single" w:color="D4D1CA" w:sz="4"/>
+              <w:right w:val="single" w:color="D4D1CA" w:sz="4"/>
+            </w:tcBorders>
+            <w:shd w:fill="F5F1EA" w:val="clear"/>
+            <w:tcMar>
+              <w:top w:type="dxa" w:w="80"/>
+              <w:left w:type="dxa" w:w="100"/>
+              <w:bottom w:type="dxa" w:w="80"/>
+              <w:right w:type="dxa" w:w="100"/>
+            </w:tcMar>
+            <w:vAlign w:val="top"/>
+          </w:tcPr>
+          <w:p>
+            <w:pPr>
+              <w:spacing w:after="40" w:before="0"/>
+            </w:pPr>
+            <w:r>
+              <w:rPr>
+                <w:rFonts w:ascii="Calibri" w:cs="Calibri" w:eastAsia="Calibri" w:hAnsi="Calibri"/>
                 <w:sz w:val="18"/>
                 <w:szCs w:val="18"/>
               </w:rPr>
@@ -2364,7 +2947,7 @@
         </w:tc>
         <w:tc>
           <w:tcPr>
-            <w:tcW w:type="dxa" w:w="3400"/>
+            <w:tcW w:type="dxa" w:w="1800"/>
             <w:tcBorders>
               <w:top w:val="single" w:color="D4D1CA" w:sz="4"/>
               <w:left w:val="single" w:color="D4D1CA" w:sz="4"/>
@@ -2389,12 +2972,47 @@
                 <w:rFonts w:ascii="Calibri" w:cs="Calibri" w:eastAsia="Calibri" w:hAnsi="Calibri"/>
                 <w:b/>
                 <w:bCs/>
+                <w:color w:val="B0000A"/>
+                <w:sz w:val="18"/>
+                <w:szCs w:val="18"/>
+              </w:rPr>
+              <w:t xml:space="preserve">TBD (walkthrough)</w:t>
+            </w:r>
+          </w:p>
+        </w:tc>
+        <w:tc>
+          <w:tcPr>
+            <w:tcW w:type="dxa" w:w="2400"/>
+            <w:tcBorders>
+              <w:top w:val="single" w:color="D4D1CA" w:sz="4"/>
+              <w:left w:val="single" w:color="D4D1CA" w:sz="4"/>
+              <w:bottom w:val="single" w:color="D4D1CA" w:sz="4"/>
+              <w:right w:val="single" w:color="D4D1CA" w:sz="4"/>
+            </w:tcBorders>
+            <w:shd w:fill="F5F1EA" w:val="clear"/>
+            <w:tcMar>
+              <w:top w:type="dxa" w:w="80"/>
+              <w:left w:type="dxa" w:w="100"/>
+              <w:bottom w:type="dxa" w:w="80"/>
+              <w:right w:type="dxa" w:w="100"/>
+            </w:tcMar>
+            <w:vAlign w:val="top"/>
+          </w:tcPr>
+          <w:p>
+            <w:pPr>
+              <w:spacing w:after="40" w:before="0"/>
+            </w:pPr>
+            <w:r>
+              <w:rPr>
+                <w:rFonts w:ascii="Calibri" w:cs="Calibri" w:eastAsia="Calibri" w:hAnsi="Calibri"/>
+                <w:b/>
+                <w:bCs/>
                 <w:sz w:val="18"/>
                 <w:szCs w:val="18"/>
               </w:rPr>
               <w:t xml:space="preserve">Walk-on: </w:t>
             </w:r>
-            <w:hyperlink w:history="1" r:id="rId5nbohpqbhh1sitikssjuu">
+            <w:hyperlink w:history="1" r:id="rIdm4c_cfhhwsiceiarhnlnw">
               <w:r>
                 <w:rPr>
                   <w:rStyle w:val="Hyperlink"/>
@@ -2419,7 +3037,7 @@
         </w:tc>
         <w:tc>
           <w:tcPr>
-            <w:tcW w:type="dxa" w:w="3600"/>
+            <w:tcW w:type="dxa" w:w="2400"/>
             <w:tcBorders>
               <w:top w:val="single" w:color="D4D1CA" w:sz="4"/>
               <w:left w:val="single" w:color="D4D1CA" w:sz="4"/>
@@ -2489,7 +3107,7 @@
       <w:tr>
         <w:tc>
           <w:tcPr>
-            <w:tcW w:type="dxa" w:w="1500"/>
+            <w:tcW w:type="dxa" w:w="1200"/>
             <w:tcBorders>
               <w:top w:val="single" w:color="D4D1CA" w:sz="4"/>
               <w:left w:val="single" w:color="D4D1CA" w:sz="4"/>
@@ -2520,7 +3138,7 @@
         </w:tc>
         <w:tc>
           <w:tcPr>
-            <w:tcW w:type="dxa" w:w="3200"/>
+            <w:tcW w:type="dxa" w:w="2600"/>
             <w:tcBorders>
               <w:top w:val="single" w:color="D4D1CA" w:sz="4"/>
               <w:left w:val="single" w:color="D4D1CA" w:sz="4"/>
@@ -2551,7 +3169,41 @@
         </w:tc>
         <w:tc>
           <w:tcPr>
-            <w:tcW w:type="dxa" w:w="2700"/>
+            <w:tcW w:type="dxa" w:w="1800"/>
+            <w:tcBorders>
+              <w:top w:val="single" w:color="D4D1CA" w:sz="4"/>
+              <w:left w:val="single" w:color="D4D1CA" w:sz="4"/>
+              <w:bottom w:val="single" w:color="D4D1CA" w:sz="4"/>
+              <w:right w:val="single" w:color="D4D1CA" w:sz="4"/>
+            </w:tcBorders>
+            <w:tcMar>
+              <w:top w:type="dxa" w:w="80"/>
+              <w:left w:type="dxa" w:w="100"/>
+              <w:bottom w:type="dxa" w:w="80"/>
+              <w:right w:type="dxa" w:w="100"/>
+            </w:tcMar>
+            <w:vAlign w:val="top"/>
+          </w:tcPr>
+          <w:p>
+            <w:pPr>
+              <w:spacing w:after="40" w:before="0"/>
+            </w:pPr>
+            <w:r>
+              <w:rPr>
+                <w:rFonts w:ascii="Calibri" w:cs="Calibri" w:eastAsia="Calibri" w:hAnsi="Calibri"/>
+                <w:b/>
+                <w:bCs/>
+                <w:color w:val="B0000A"/>
+                <w:sz w:val="18"/>
+                <w:szCs w:val="18"/>
+              </w:rPr>
+              <w:t xml:space="preserve">TBD (walkthrough)</w:t>
+            </w:r>
+          </w:p>
+        </w:tc>
+        <w:tc>
+          <w:tcPr>
+            <w:tcW w:type="dxa" w:w="2200"/>
             <w:tcBorders>
               <w:top w:val="single" w:color="D4D1CA" w:sz="4"/>
               <w:left w:val="single" w:color="D4D1CA" w:sz="4"/>
@@ -2592,7 +3244,41 @@
         </w:tc>
         <w:tc>
           <w:tcPr>
-            <w:tcW w:type="dxa" w:w="3400"/>
+            <w:tcW w:type="dxa" w:w="1800"/>
+            <w:tcBorders>
+              <w:top w:val="single" w:color="D4D1CA" w:sz="4"/>
+              <w:left w:val="single" w:color="D4D1CA" w:sz="4"/>
+              <w:bottom w:val="single" w:color="D4D1CA" w:sz="4"/>
+              <w:right w:val="single" w:color="D4D1CA" w:sz="4"/>
+            </w:tcBorders>
+            <w:tcMar>
+              <w:top w:type="dxa" w:w="80"/>
+              <w:left w:type="dxa" w:w="100"/>
+              <w:bottom w:type="dxa" w:w="80"/>
+              <w:right w:type="dxa" w:w="100"/>
+            </w:tcMar>
+            <w:vAlign w:val="top"/>
+          </w:tcPr>
+          <w:p>
+            <w:pPr>
+              <w:spacing w:after="40" w:before="0"/>
+            </w:pPr>
+            <w:r>
+              <w:rPr>
+                <w:rFonts w:ascii="Calibri" w:cs="Calibri" w:eastAsia="Calibri" w:hAnsi="Calibri"/>
+                <w:b/>
+                <w:bCs/>
+                <w:color w:val="B0000A"/>
+                <w:sz w:val="18"/>
+                <w:szCs w:val="18"/>
+              </w:rPr>
+              <w:t xml:space="preserve">TBD (walkthrough)</w:t>
+            </w:r>
+          </w:p>
+        </w:tc>
+        <w:tc>
+          <w:tcPr>
+            <w:tcW w:type="dxa" w:w="2400"/>
             <w:tcBorders>
               <w:top w:val="single" w:color="D4D1CA" w:sz="4"/>
               <w:left w:val="single" w:color="D4D1CA" w:sz="4"/>
@@ -2621,7 +3307,7 @@
               </w:rPr>
               <w:t xml:space="preserve">Post-Lunch: </w:t>
             </w:r>
-            <w:hyperlink w:history="1" r:id="rId60l0o41dsvrti9xnmhpxo">
+            <w:hyperlink w:history="1" r:id="rIdt0yeg0xgczb5xi7sayua3">
               <w:r>
                 <w:rPr>
                   <w:rStyle w:val="Hyperlink"/>
@@ -2642,7 +3328,7 @@
               </w:rPr>
               <w:t xml:space="preserve"> — Dolly Parton, then </w:t>
             </w:r>
-            <w:hyperlink w:history="1" r:id="rId2v87qlgze9sznefh68xp2">
+            <w:hyperlink w:history="1" r:id="rIdopbxepx0xpqi0zwa61-45">
               <w:r>
                 <w:rPr>
                   <w:rStyle w:val="Hyperlink"/>
@@ -2657,7 +3343,7 @@
         </w:tc>
         <w:tc>
           <w:tcPr>
-            <w:tcW w:type="dxa" w:w="3600"/>
+            <w:tcW w:type="dxa" w:w="2400"/>
             <w:tcBorders>
               <w:top w:val="single" w:color="D4D1CA" w:sz="4"/>
               <w:left w:val="single" w:color="D4D1CA" w:sz="4"/>
@@ -2712,7 +3398,7 @@
               </w:rPr>
               <w:t xml:space="preserve"> to exit lunch Celebrations loop. Play post-lunch song. One-click: </w:t>
             </w:r>
-            <w:hyperlink w:history="1" r:id="rIdvadabb4rje2rlzoxqkpen">
+            <w:hyperlink w:history="1" r:id="rId1vaql4wtwqbt_gfpnpdmr">
               <w:r>
                 <w:rPr>
                   <w:rStyle w:val="Hyperlink"/>
@@ -2737,7 +3423,7 @@
       <w:tr>
         <w:tc>
           <w:tcPr>
-            <w:gridSpan w:val="5"/>
+            <w:gridSpan w:val="7"/>
             <w:tcBorders>
               <w:top w:val="single" w:color="D4D1CA" w:sz="4"/>
               <w:left w:val="single" w:color="D4D1CA" w:sz="4"/>
@@ -2771,7 +3457,7 @@
       <w:tr>
         <w:tc>
           <w:tcPr>
-            <w:tcW w:type="dxa" w:w="1500"/>
+            <w:tcW w:type="dxa" w:w="1200"/>
             <w:tcBorders>
               <w:top w:val="single" w:color="D4D1CA" w:sz="4"/>
               <w:left w:val="single" w:color="D4D1CA" w:sz="4"/>
@@ -2803,7 +3489,7 @@
         </w:tc>
         <w:tc>
           <w:tcPr>
-            <w:tcW w:type="dxa" w:w="3200"/>
+            <w:tcW w:type="dxa" w:w="2600"/>
             <w:tcBorders>
               <w:top w:val="single" w:color="D4D1CA" w:sz="4"/>
               <w:left w:val="single" w:color="D4D1CA" w:sz="4"/>
@@ -2851,7 +3537,7 @@
         </w:tc>
         <w:tc>
           <w:tcPr>
-            <w:tcW w:type="dxa" w:w="2700"/>
+            <w:tcW w:type="dxa" w:w="1800"/>
             <w:tcBorders>
               <w:top w:val="single" w:color="D4D1CA" w:sz="4"/>
               <w:left w:val="single" w:color="D4D1CA" w:sz="4"/>
@@ -2874,6 +3560,41 @@
             <w:r>
               <w:rPr>
                 <w:rFonts w:ascii="Calibri" w:cs="Calibri" w:eastAsia="Calibri" w:hAnsi="Calibri"/>
+                <w:b/>
+                <w:bCs/>
+                <w:color w:val="B0000A"/>
+                <w:sz w:val="18"/>
+                <w:szCs w:val="18"/>
+              </w:rPr>
+              <w:t xml:space="preserve">TBD (walkthrough)</w:t>
+            </w:r>
+          </w:p>
+        </w:tc>
+        <w:tc>
+          <w:tcPr>
+            <w:tcW w:type="dxa" w:w="2200"/>
+            <w:tcBorders>
+              <w:top w:val="single" w:color="D4D1CA" w:sz="4"/>
+              <w:left w:val="single" w:color="D4D1CA" w:sz="4"/>
+              <w:bottom w:val="single" w:color="D4D1CA" w:sz="4"/>
+              <w:right w:val="single" w:color="D4D1CA" w:sz="4"/>
+            </w:tcBorders>
+            <w:shd w:fill="F5F1EA" w:val="clear"/>
+            <w:tcMar>
+              <w:top w:type="dxa" w:w="80"/>
+              <w:left w:type="dxa" w:w="100"/>
+              <w:bottom w:type="dxa" w:w="80"/>
+              <w:right w:type="dxa" w:w="100"/>
+            </w:tcMar>
+            <w:vAlign w:val="top"/>
+          </w:tcPr>
+          <w:p>
+            <w:pPr>
+              <w:spacing w:after="40" w:before="0"/>
+            </w:pPr>
+            <w:r>
+              <w:rPr>
+                <w:rFonts w:ascii="Calibri" w:cs="Calibri" w:eastAsia="Calibri" w:hAnsi="Calibri"/>
                 <w:sz w:val="18"/>
                 <w:szCs w:val="18"/>
               </w:rPr>
@@ -2883,7 +3604,7 @@
         </w:tc>
         <w:tc>
           <w:tcPr>
-            <w:tcW w:type="dxa" w:w="3400"/>
+            <w:tcW w:type="dxa" w:w="1800"/>
             <w:tcBorders>
               <w:top w:val="single" w:color="D4D1CA" w:sz="4"/>
               <w:left w:val="single" w:color="D4D1CA" w:sz="4"/>
@@ -2908,12 +3629,47 @@
                 <w:rFonts w:ascii="Calibri" w:cs="Calibri" w:eastAsia="Calibri" w:hAnsi="Calibri"/>
                 <w:b/>
                 <w:bCs/>
+                <w:color w:val="B0000A"/>
+                <w:sz w:val="18"/>
+                <w:szCs w:val="18"/>
+              </w:rPr>
+              <w:t xml:space="preserve">TBD (walkthrough)</w:t>
+            </w:r>
+          </w:p>
+        </w:tc>
+        <w:tc>
+          <w:tcPr>
+            <w:tcW w:type="dxa" w:w="2400"/>
+            <w:tcBorders>
+              <w:top w:val="single" w:color="D4D1CA" w:sz="4"/>
+              <w:left w:val="single" w:color="D4D1CA" w:sz="4"/>
+              <w:bottom w:val="single" w:color="D4D1CA" w:sz="4"/>
+              <w:right w:val="single" w:color="D4D1CA" w:sz="4"/>
+            </w:tcBorders>
+            <w:shd w:fill="F5F1EA" w:val="clear"/>
+            <w:tcMar>
+              <w:top w:type="dxa" w:w="80"/>
+              <w:left w:type="dxa" w:w="100"/>
+              <w:bottom w:type="dxa" w:w="80"/>
+              <w:right w:type="dxa" w:w="100"/>
+            </w:tcMar>
+            <w:vAlign w:val="top"/>
+          </w:tcPr>
+          <w:p>
+            <w:pPr>
+              <w:spacing w:after="40" w:before="0"/>
+            </w:pPr>
+            <w:r>
+              <w:rPr>
+                <w:rFonts w:ascii="Calibri" w:cs="Calibri" w:eastAsia="Calibri" w:hAnsi="Calibri"/>
+                <w:b/>
+                <w:bCs/>
                 <w:sz w:val="18"/>
                 <w:szCs w:val="18"/>
               </w:rPr>
               <w:t xml:space="preserve">Walk-on: </w:t>
             </w:r>
-            <w:hyperlink w:history="1" r:id="rIdni8gxhu_dno4n9osaluuf">
+            <w:hyperlink w:history="1" r:id="rIdot_-sbjzyczlnp1s7jedw">
               <w:r>
                 <w:rPr>
                   <w:rStyle w:val="Hyperlink"/>
@@ -2938,7 +3694,7 @@
         </w:tc>
         <w:tc>
           <w:tcPr>
-            <w:tcW w:type="dxa" w:w="3600"/>
+            <w:tcW w:type="dxa" w:w="2400"/>
             <w:tcBorders>
               <w:top w:val="single" w:color="D4D1CA" w:sz="4"/>
               <w:left w:val="single" w:color="D4D1CA" w:sz="4"/>
@@ -2990,7 +3746,7 @@
       <w:tr>
         <w:tc>
           <w:tcPr>
-            <w:tcW w:type="dxa" w:w="1500"/>
+            <w:tcW w:type="dxa" w:w="1200"/>
             <w:tcBorders>
               <w:top w:val="single" w:color="D4D1CA" w:sz="4"/>
               <w:left w:val="single" w:color="D4D1CA" w:sz="4"/>
@@ -3021,7 +3777,7 @@
         </w:tc>
         <w:tc>
           <w:tcPr>
-            <w:tcW w:type="dxa" w:w="3200"/>
+            <w:tcW w:type="dxa" w:w="2600"/>
             <w:tcBorders>
               <w:top w:val="single" w:color="D4D1CA" w:sz="4"/>
               <w:left w:val="single" w:color="D4D1CA" w:sz="4"/>
@@ -3052,7 +3808,41 @@
         </w:tc>
         <w:tc>
           <w:tcPr>
-            <w:tcW w:type="dxa" w:w="2700"/>
+            <w:tcW w:type="dxa" w:w="1800"/>
+            <w:tcBorders>
+              <w:top w:val="single" w:color="D4D1CA" w:sz="4"/>
+              <w:left w:val="single" w:color="D4D1CA" w:sz="4"/>
+              <w:bottom w:val="single" w:color="D4D1CA" w:sz="4"/>
+              <w:right w:val="single" w:color="D4D1CA" w:sz="4"/>
+            </w:tcBorders>
+            <w:tcMar>
+              <w:top w:type="dxa" w:w="80"/>
+              <w:left w:type="dxa" w:w="100"/>
+              <w:bottom w:type="dxa" w:w="80"/>
+              <w:right w:type="dxa" w:w="100"/>
+            </w:tcMar>
+            <w:vAlign w:val="top"/>
+          </w:tcPr>
+          <w:p>
+            <w:pPr>
+              <w:spacing w:after="40" w:before="0"/>
+            </w:pPr>
+            <w:r>
+              <w:rPr>
+                <w:rFonts w:ascii="Calibri" w:cs="Calibri" w:eastAsia="Calibri" w:hAnsi="Calibri"/>
+                <w:b/>
+                <w:bCs/>
+                <w:color w:val="B0000A"/>
+                <w:sz w:val="18"/>
+                <w:szCs w:val="18"/>
+              </w:rPr>
+              <w:t xml:space="preserve">TBD (walkthrough)</w:t>
+            </w:r>
+          </w:p>
+        </w:tc>
+        <w:tc>
+          <w:tcPr>
+            <w:tcW w:type="dxa" w:w="2200"/>
             <w:tcBorders>
               <w:top w:val="single" w:color="D4D1CA" w:sz="4"/>
               <w:left w:val="single" w:color="D4D1CA" w:sz="4"/>
@@ -3093,26 +3883,60 @@
         </w:tc>
         <w:tc>
           <w:tcPr>
-            <w:tcW w:type="dxa" w:w="3400"/>
-            <w:tcBorders>
-              <w:top w:val="single" w:color="D4D1CA" w:sz="4"/>
-              <w:left w:val="single" w:color="D4D1CA" w:sz="4"/>
-              <w:bottom w:val="single" w:color="D4D1CA" w:sz="4"/>
-              <w:right w:val="single" w:color="D4D1CA" w:sz="4"/>
-            </w:tcBorders>
-            <w:tcMar>
-              <w:top w:type="dxa" w:w="80"/>
-              <w:left w:type="dxa" w:w="100"/>
-              <w:bottom w:type="dxa" w:w="80"/>
-              <w:right w:type="dxa" w:w="100"/>
-            </w:tcMar>
-            <w:vAlign w:val="top"/>
-          </w:tcPr>
-          <w:p>
-            <w:pPr>
-              <w:spacing w:after="40" w:before="0"/>
-            </w:pPr>
-            <w:hyperlink w:history="1" r:id="rIdibh7-93aasaoh3zhuwiox">
+            <w:tcW w:type="dxa" w:w="1800"/>
+            <w:tcBorders>
+              <w:top w:val="single" w:color="D4D1CA" w:sz="4"/>
+              <w:left w:val="single" w:color="D4D1CA" w:sz="4"/>
+              <w:bottom w:val="single" w:color="D4D1CA" w:sz="4"/>
+              <w:right w:val="single" w:color="D4D1CA" w:sz="4"/>
+            </w:tcBorders>
+            <w:tcMar>
+              <w:top w:type="dxa" w:w="80"/>
+              <w:left w:type="dxa" w:w="100"/>
+              <w:bottom w:type="dxa" w:w="80"/>
+              <w:right w:type="dxa" w:w="100"/>
+            </w:tcMar>
+            <w:vAlign w:val="top"/>
+          </w:tcPr>
+          <w:p>
+            <w:pPr>
+              <w:spacing w:after="40" w:before="0"/>
+            </w:pPr>
+            <w:r>
+              <w:rPr>
+                <w:rFonts w:ascii="Calibri" w:cs="Calibri" w:eastAsia="Calibri" w:hAnsi="Calibri"/>
+                <w:b/>
+                <w:bCs/>
+                <w:color w:val="B0000A"/>
+                <w:sz w:val="18"/>
+                <w:szCs w:val="18"/>
+              </w:rPr>
+              <w:t xml:space="preserve">TBD (walkthrough)</w:t>
+            </w:r>
+          </w:p>
+        </w:tc>
+        <w:tc>
+          <w:tcPr>
+            <w:tcW w:type="dxa" w:w="2400"/>
+            <w:tcBorders>
+              <w:top w:val="single" w:color="D4D1CA" w:sz="4"/>
+              <w:left w:val="single" w:color="D4D1CA" w:sz="4"/>
+              <w:bottom w:val="single" w:color="D4D1CA" w:sz="4"/>
+              <w:right w:val="single" w:color="D4D1CA" w:sz="4"/>
+            </w:tcBorders>
+            <w:tcMar>
+              <w:top w:type="dxa" w:w="80"/>
+              <w:left w:type="dxa" w:w="100"/>
+              <w:bottom w:type="dxa" w:w="80"/>
+              <w:right w:type="dxa" w:w="100"/>
+            </w:tcMar>
+            <w:vAlign w:val="top"/>
+          </w:tcPr>
+          <w:p>
+            <w:pPr>
+              <w:spacing w:after="40" w:before="0"/>
+            </w:pPr>
+            <w:hyperlink w:history="1" r:id="rIdp8_dvklz1jq5-_fyc7g5p">
               <w:r>
                 <w:rPr>
                   <w:rStyle w:val="Hyperlink"/>
@@ -3127,7 +3951,7 @@
         </w:tc>
         <w:tc>
           <w:tcPr>
-            <w:tcW w:type="dxa" w:w="3600"/>
+            <w:tcW w:type="dxa" w:w="2400"/>
             <w:tcBorders>
               <w:top w:val="single" w:color="D4D1CA" w:sz="4"/>
               <w:left w:val="single" w:color="D4D1CA" w:sz="4"/>
@@ -3224,7 +4048,7 @@
       <w:tr>
         <w:tc>
           <w:tcPr>
-            <w:tcW w:type="dxa" w:w="1500"/>
+            <w:tcW w:type="dxa" w:w="1200"/>
             <w:tcBorders>
               <w:top w:val="single" w:color="D4D1CA" w:sz="4"/>
               <w:left w:val="single" w:color="D4D1CA" w:sz="4"/>
@@ -3256,7 +4080,7 @@
         </w:tc>
         <w:tc>
           <w:tcPr>
-            <w:tcW w:type="dxa" w:w="3200"/>
+            <w:tcW w:type="dxa" w:w="2600"/>
             <w:tcBorders>
               <w:top w:val="single" w:color="D4D1CA" w:sz="4"/>
               <w:left w:val="single" w:color="D4D1CA" w:sz="4"/>
@@ -3304,7 +4128,7 @@
         </w:tc>
         <w:tc>
           <w:tcPr>
-            <w:tcW w:type="dxa" w:w="2700"/>
+            <w:tcW w:type="dxa" w:w="1800"/>
             <w:tcBorders>
               <w:top w:val="single" w:color="D4D1CA" w:sz="4"/>
               <w:left w:val="single" w:color="D4D1CA" w:sz="4"/>
@@ -3327,6 +4151,41 @@
             <w:r>
               <w:rPr>
                 <w:rFonts w:ascii="Calibri" w:cs="Calibri" w:eastAsia="Calibri" w:hAnsi="Calibri"/>
+                <w:b/>
+                <w:bCs/>
+                <w:color w:val="B0000A"/>
+                <w:sz w:val="18"/>
+                <w:szCs w:val="18"/>
+              </w:rPr>
+              <w:t xml:space="preserve">TBD (walkthrough)</w:t>
+            </w:r>
+          </w:p>
+        </w:tc>
+        <w:tc>
+          <w:tcPr>
+            <w:tcW w:type="dxa" w:w="2200"/>
+            <w:tcBorders>
+              <w:top w:val="single" w:color="D4D1CA" w:sz="4"/>
+              <w:left w:val="single" w:color="D4D1CA" w:sz="4"/>
+              <w:bottom w:val="single" w:color="D4D1CA" w:sz="4"/>
+              <w:right w:val="single" w:color="D4D1CA" w:sz="4"/>
+            </w:tcBorders>
+            <w:shd w:fill="F5F1EA" w:val="clear"/>
+            <w:tcMar>
+              <w:top w:type="dxa" w:w="80"/>
+              <w:left w:type="dxa" w:w="100"/>
+              <w:bottom w:type="dxa" w:w="80"/>
+              <w:right w:type="dxa" w:w="100"/>
+            </w:tcMar>
+            <w:vAlign w:val="top"/>
+          </w:tcPr>
+          <w:p>
+            <w:pPr>
+              <w:spacing w:after="40" w:before="0"/>
+            </w:pPr>
+            <w:r>
+              <w:rPr>
+                <w:rFonts w:ascii="Calibri" w:cs="Calibri" w:eastAsia="Calibri" w:hAnsi="Calibri"/>
                 <w:sz w:val="18"/>
                 <w:szCs w:val="18"/>
               </w:rPr>
@@ -3336,7 +4195,7 @@
         </w:tc>
         <w:tc>
           <w:tcPr>
-            <w:tcW w:type="dxa" w:w="3400"/>
+            <w:tcW w:type="dxa" w:w="1800"/>
             <w:tcBorders>
               <w:top w:val="single" w:color="D4D1CA" w:sz="4"/>
               <w:left w:val="single" w:color="D4D1CA" w:sz="4"/>
@@ -3361,12 +4220,47 @@
                 <w:rFonts w:ascii="Calibri" w:cs="Calibri" w:eastAsia="Calibri" w:hAnsi="Calibri"/>
                 <w:b/>
                 <w:bCs/>
+                <w:color w:val="B0000A"/>
+                <w:sz w:val="18"/>
+                <w:szCs w:val="18"/>
+              </w:rPr>
+              <w:t xml:space="preserve">TBD (walkthrough)</w:t>
+            </w:r>
+          </w:p>
+        </w:tc>
+        <w:tc>
+          <w:tcPr>
+            <w:tcW w:type="dxa" w:w="2400"/>
+            <w:tcBorders>
+              <w:top w:val="single" w:color="D4D1CA" w:sz="4"/>
+              <w:left w:val="single" w:color="D4D1CA" w:sz="4"/>
+              <w:bottom w:val="single" w:color="D4D1CA" w:sz="4"/>
+              <w:right w:val="single" w:color="D4D1CA" w:sz="4"/>
+            </w:tcBorders>
+            <w:shd w:fill="F5F1EA" w:val="clear"/>
+            <w:tcMar>
+              <w:top w:type="dxa" w:w="80"/>
+              <w:left w:type="dxa" w:w="100"/>
+              <w:bottom w:type="dxa" w:w="80"/>
+              <w:right w:type="dxa" w:w="100"/>
+            </w:tcMar>
+            <w:vAlign w:val="top"/>
+          </w:tcPr>
+          <w:p>
+            <w:pPr>
+              <w:spacing w:after="40" w:before="0"/>
+            </w:pPr>
+            <w:r>
+              <w:rPr>
+                <w:rFonts w:ascii="Calibri" w:cs="Calibri" w:eastAsia="Calibri" w:hAnsi="Calibri"/>
+                <w:b/>
+                <w:bCs/>
                 <w:sz w:val="18"/>
                 <w:szCs w:val="18"/>
               </w:rPr>
               <w:t xml:space="preserve">Walk-on: </w:t>
             </w:r>
-            <w:hyperlink w:history="1" r:id="rId-m6cpsyzgelvvljrjdhic">
+            <w:hyperlink w:history="1" r:id="rIdt94okvofcetpyfxlrai05">
               <w:r>
                 <w:rPr>
                   <w:rStyle w:val="Hyperlink"/>
@@ -3391,7 +4285,7 @@
         </w:tc>
         <w:tc>
           <w:tcPr>
-            <w:tcW w:type="dxa" w:w="3600"/>
+            <w:tcW w:type="dxa" w:w="2400"/>
             <w:tcBorders>
               <w:top w:val="single" w:color="D4D1CA" w:sz="4"/>
               <w:left w:val="single" w:color="D4D1CA" w:sz="4"/>
@@ -3443,7 +4337,7 @@
       <w:tr>
         <w:tc>
           <w:tcPr>
-            <w:tcW w:type="dxa" w:w="1500"/>
+            <w:tcW w:type="dxa" w:w="1200"/>
             <w:tcBorders>
               <w:top w:val="single" w:color="D4D1CA" w:sz="4"/>
               <w:left w:val="single" w:color="D4D1CA" w:sz="4"/>
@@ -3474,7 +4368,7 @@
         </w:tc>
         <w:tc>
           <w:tcPr>
-            <w:tcW w:type="dxa" w:w="3200"/>
+            <w:tcW w:type="dxa" w:w="2600"/>
             <w:tcBorders>
               <w:top w:val="single" w:color="D4D1CA" w:sz="4"/>
               <w:left w:val="single" w:color="D4D1CA" w:sz="4"/>
@@ -3505,7 +4399,41 @@
         </w:tc>
         <w:tc>
           <w:tcPr>
-            <w:tcW w:type="dxa" w:w="2700"/>
+            <w:tcW w:type="dxa" w:w="1800"/>
+            <w:tcBorders>
+              <w:top w:val="single" w:color="D4D1CA" w:sz="4"/>
+              <w:left w:val="single" w:color="D4D1CA" w:sz="4"/>
+              <w:bottom w:val="single" w:color="D4D1CA" w:sz="4"/>
+              <w:right w:val="single" w:color="D4D1CA" w:sz="4"/>
+            </w:tcBorders>
+            <w:tcMar>
+              <w:top w:type="dxa" w:w="80"/>
+              <w:left w:type="dxa" w:w="100"/>
+              <w:bottom w:type="dxa" w:w="80"/>
+              <w:right w:type="dxa" w:w="100"/>
+            </w:tcMar>
+            <w:vAlign w:val="top"/>
+          </w:tcPr>
+          <w:p>
+            <w:pPr>
+              <w:spacing w:after="40" w:before="0"/>
+            </w:pPr>
+            <w:r>
+              <w:rPr>
+                <w:rFonts w:ascii="Calibri" w:cs="Calibri" w:eastAsia="Calibri" w:hAnsi="Calibri"/>
+                <w:b/>
+                <w:bCs/>
+                <w:color w:val="B0000A"/>
+                <w:sz w:val="18"/>
+                <w:szCs w:val="18"/>
+              </w:rPr>
+              <w:t xml:space="preserve">TBD (walkthrough)</w:t>
+            </w:r>
+          </w:p>
+        </w:tc>
+        <w:tc>
+          <w:tcPr>
+            <w:tcW w:type="dxa" w:w="2200"/>
             <w:tcBorders>
               <w:top w:val="single" w:color="D4D1CA" w:sz="4"/>
               <w:left w:val="single" w:color="D4D1CA" w:sz="4"/>
@@ -3546,26 +4474,60 @@
         </w:tc>
         <w:tc>
           <w:tcPr>
-            <w:tcW w:type="dxa" w:w="3400"/>
-            <w:tcBorders>
-              <w:top w:val="single" w:color="D4D1CA" w:sz="4"/>
-              <w:left w:val="single" w:color="D4D1CA" w:sz="4"/>
-              <w:bottom w:val="single" w:color="D4D1CA" w:sz="4"/>
-              <w:right w:val="single" w:color="D4D1CA" w:sz="4"/>
-            </w:tcBorders>
-            <w:tcMar>
-              <w:top w:type="dxa" w:w="80"/>
-              <w:left w:type="dxa" w:w="100"/>
-              <w:bottom w:type="dxa" w:w="80"/>
-              <w:right w:type="dxa" w:w="100"/>
-            </w:tcMar>
-            <w:vAlign w:val="top"/>
-          </w:tcPr>
-          <w:p>
-            <w:pPr>
-              <w:spacing w:after="40" w:before="0"/>
-            </w:pPr>
-            <w:hyperlink w:history="1" r:id="rIdkkknouorrxhc9k-o5qdgw">
+            <w:tcW w:type="dxa" w:w="1800"/>
+            <w:tcBorders>
+              <w:top w:val="single" w:color="D4D1CA" w:sz="4"/>
+              <w:left w:val="single" w:color="D4D1CA" w:sz="4"/>
+              <w:bottom w:val="single" w:color="D4D1CA" w:sz="4"/>
+              <w:right w:val="single" w:color="D4D1CA" w:sz="4"/>
+            </w:tcBorders>
+            <w:tcMar>
+              <w:top w:type="dxa" w:w="80"/>
+              <w:left w:type="dxa" w:w="100"/>
+              <w:bottom w:type="dxa" w:w="80"/>
+              <w:right w:type="dxa" w:w="100"/>
+            </w:tcMar>
+            <w:vAlign w:val="top"/>
+          </w:tcPr>
+          <w:p>
+            <w:pPr>
+              <w:spacing w:after="40" w:before="0"/>
+            </w:pPr>
+            <w:r>
+              <w:rPr>
+                <w:rFonts w:ascii="Calibri" w:cs="Calibri" w:eastAsia="Calibri" w:hAnsi="Calibri"/>
+                <w:b/>
+                <w:bCs/>
+                <w:color w:val="B0000A"/>
+                <w:sz w:val="18"/>
+                <w:szCs w:val="18"/>
+              </w:rPr>
+              <w:t xml:space="preserve">TBD (walkthrough)</w:t>
+            </w:r>
+          </w:p>
+        </w:tc>
+        <w:tc>
+          <w:tcPr>
+            <w:tcW w:type="dxa" w:w="2400"/>
+            <w:tcBorders>
+              <w:top w:val="single" w:color="D4D1CA" w:sz="4"/>
+              <w:left w:val="single" w:color="D4D1CA" w:sz="4"/>
+              <w:bottom w:val="single" w:color="D4D1CA" w:sz="4"/>
+              <w:right w:val="single" w:color="D4D1CA" w:sz="4"/>
+            </w:tcBorders>
+            <w:tcMar>
+              <w:top w:type="dxa" w:w="80"/>
+              <w:left w:type="dxa" w:w="100"/>
+              <w:bottom w:type="dxa" w:w="80"/>
+              <w:right w:type="dxa" w:w="100"/>
+            </w:tcMar>
+            <w:vAlign w:val="top"/>
+          </w:tcPr>
+          <w:p>
+            <w:pPr>
+              <w:spacing w:after="40" w:before="0"/>
+            </w:pPr>
+            <w:hyperlink w:history="1" r:id="rIdpq4ngcv_jj_urmui6u9_e">
               <w:r>
                 <w:rPr>
                   <w:rStyle w:val="Hyperlink"/>
@@ -3580,7 +4542,7 @@
         </w:tc>
         <w:tc>
           <w:tcPr>
-            <w:tcW w:type="dxa" w:w="3600"/>
+            <w:tcW w:type="dxa" w:w="2400"/>
             <w:tcBorders>
               <w:top w:val="single" w:color="D4D1CA" w:sz="4"/>
               <w:left w:val="single" w:color="D4D1CA" w:sz="4"/>
@@ -3635,7 +4597,7 @@
               </w:rPr>
               <w:t xml:space="preserve"> to exit Celebrations loop. One-click: </w:t>
             </w:r>
-            <w:hyperlink w:history="1" r:id="rIdx6cmokx8ibjzgbb_ec37i">
+            <w:hyperlink w:history="1" r:id="rId97juj-nl82frxdku3bhlw">
               <w:r>
                 <w:rPr>
                   <w:rStyle w:val="Hyperlink"/>
@@ -3660,7 +4622,7 @@
       <w:tr>
         <w:tc>
           <w:tcPr>
-            <w:tcW w:type="dxa" w:w="1500"/>
+            <w:tcW w:type="dxa" w:w="1200"/>
             <w:tcBorders>
               <w:top w:val="single" w:color="D4D1CA" w:sz="4"/>
               <w:left w:val="single" w:color="D4D1CA" w:sz="4"/>
@@ -3692,7 +4654,7 @@
         </w:tc>
         <w:tc>
           <w:tcPr>
-            <w:tcW w:type="dxa" w:w="3200"/>
+            <w:tcW w:type="dxa" w:w="2600"/>
             <w:tcBorders>
               <w:top w:val="single" w:color="D4D1CA" w:sz="4"/>
               <w:left w:val="single" w:color="D4D1CA" w:sz="4"/>
@@ -3740,7 +4702,7 @@
         </w:tc>
         <w:tc>
           <w:tcPr>
-            <w:tcW w:type="dxa" w:w="2700"/>
+            <w:tcW w:type="dxa" w:w="1800"/>
             <w:tcBorders>
               <w:top w:val="single" w:color="D4D1CA" w:sz="4"/>
               <w:left w:val="single" w:color="D4D1CA" w:sz="4"/>
@@ -3763,6 +4725,41 @@
             <w:r>
               <w:rPr>
                 <w:rFonts w:ascii="Calibri" w:cs="Calibri" w:eastAsia="Calibri" w:hAnsi="Calibri"/>
+                <w:b/>
+                <w:bCs/>
+                <w:color w:val="B0000A"/>
+                <w:sz w:val="18"/>
+                <w:szCs w:val="18"/>
+              </w:rPr>
+              <w:t xml:space="preserve">TBD (walkthrough)</w:t>
+            </w:r>
+          </w:p>
+        </w:tc>
+        <w:tc>
+          <w:tcPr>
+            <w:tcW w:type="dxa" w:w="2200"/>
+            <w:tcBorders>
+              <w:top w:val="single" w:color="D4D1CA" w:sz="4"/>
+              <w:left w:val="single" w:color="D4D1CA" w:sz="4"/>
+              <w:bottom w:val="single" w:color="D4D1CA" w:sz="4"/>
+              <w:right w:val="single" w:color="D4D1CA" w:sz="4"/>
+            </w:tcBorders>
+            <w:shd w:fill="F5F1EA" w:val="clear"/>
+            <w:tcMar>
+              <w:top w:type="dxa" w:w="80"/>
+              <w:left w:type="dxa" w:w="100"/>
+              <w:bottom w:type="dxa" w:w="80"/>
+              <w:right w:type="dxa" w:w="100"/>
+            </w:tcMar>
+            <w:vAlign w:val="top"/>
+          </w:tcPr>
+          <w:p>
+            <w:pPr>
+              <w:spacing w:after="40" w:before="0"/>
+            </w:pPr>
+            <w:r>
+              <w:rPr>
+                <w:rFonts w:ascii="Calibri" w:cs="Calibri" w:eastAsia="Calibri" w:hAnsi="Calibri"/>
                 <w:sz w:val="18"/>
                 <w:szCs w:val="18"/>
               </w:rPr>
@@ -3772,7 +4769,7 @@
         </w:tc>
         <w:tc>
           <w:tcPr>
-            <w:tcW w:type="dxa" w:w="3400"/>
+            <w:tcW w:type="dxa" w:w="1800"/>
             <w:tcBorders>
               <w:top w:val="single" w:color="D4D1CA" w:sz="4"/>
               <w:left w:val="single" w:color="D4D1CA" w:sz="4"/>
@@ -3797,6 +4794,41 @@
                 <w:rFonts w:ascii="Calibri" w:cs="Calibri" w:eastAsia="Calibri" w:hAnsi="Calibri"/>
                 <w:b/>
                 <w:bCs/>
+                <w:color w:val="B0000A"/>
+                <w:sz w:val="18"/>
+                <w:szCs w:val="18"/>
+              </w:rPr>
+              <w:t xml:space="preserve">TBD (walkthrough)</w:t>
+            </w:r>
+          </w:p>
+        </w:tc>
+        <w:tc>
+          <w:tcPr>
+            <w:tcW w:type="dxa" w:w="2400"/>
+            <w:tcBorders>
+              <w:top w:val="single" w:color="D4D1CA" w:sz="4"/>
+              <w:left w:val="single" w:color="D4D1CA" w:sz="4"/>
+              <w:bottom w:val="single" w:color="D4D1CA" w:sz="4"/>
+              <w:right w:val="single" w:color="D4D1CA" w:sz="4"/>
+            </w:tcBorders>
+            <w:shd w:fill="F5F1EA" w:val="clear"/>
+            <w:tcMar>
+              <w:top w:type="dxa" w:w="80"/>
+              <w:left w:type="dxa" w:w="100"/>
+              <w:bottom w:type="dxa" w:w="80"/>
+              <w:right w:type="dxa" w:w="100"/>
+            </w:tcMar>
+            <w:vAlign w:val="top"/>
+          </w:tcPr>
+          <w:p>
+            <w:pPr>
+              <w:spacing w:after="40" w:before="0"/>
+            </w:pPr>
+            <w:r>
+              <w:rPr>
+                <w:rFonts w:ascii="Calibri" w:cs="Calibri" w:eastAsia="Calibri" w:hAnsi="Calibri"/>
+                <w:b/>
+                <w:bCs/>
                 <w:sz w:val="18"/>
                 <w:szCs w:val="18"/>
               </w:rPr>
@@ -3817,7 +4849,7 @@
         </w:tc>
         <w:tc>
           <w:tcPr>
-            <w:tcW w:type="dxa" w:w="3600"/>
+            <w:tcW w:type="dxa" w:w="2400"/>
             <w:tcBorders>
               <w:top w:val="single" w:color="D4D1CA" w:sz="4"/>
               <w:left w:val="single" w:color="D4D1CA" w:sz="4"/>
@@ -3869,7 +4901,7 @@
       <w:tr>
         <w:tc>
           <w:tcPr>
-            <w:gridSpan w:val="5"/>
+            <w:gridSpan w:val="7"/>
             <w:tcBorders>
               <w:top w:val="single" w:color="D4D1CA" w:sz="4"/>
               <w:left w:val="single" w:color="D4D1CA" w:sz="4"/>
@@ -3903,7 +4935,7 @@
       <w:tr>
         <w:tc>
           <w:tcPr>
-            <w:tcW w:type="dxa" w:w="1500"/>
+            <w:tcW w:type="dxa" w:w="1200"/>
             <w:tcBorders>
               <w:top w:val="single" w:color="D4D1CA" w:sz="4"/>
               <w:left w:val="single" w:color="D4D1CA" w:sz="4"/>
@@ -3934,7 +4966,7 @@
         </w:tc>
         <w:tc>
           <w:tcPr>
-            <w:tcW w:type="dxa" w:w="3200"/>
+            <w:tcW w:type="dxa" w:w="2600"/>
             <w:tcBorders>
               <w:top w:val="single" w:color="D4D1CA" w:sz="4"/>
               <w:left w:val="single" w:color="D4D1CA" w:sz="4"/>
@@ -3981,7 +5013,41 @@
         </w:tc>
         <w:tc>
           <w:tcPr>
-            <w:tcW w:type="dxa" w:w="2700"/>
+            <w:tcW w:type="dxa" w:w="1800"/>
+            <w:tcBorders>
+              <w:top w:val="single" w:color="D4D1CA" w:sz="4"/>
+              <w:left w:val="single" w:color="D4D1CA" w:sz="4"/>
+              <w:bottom w:val="single" w:color="D4D1CA" w:sz="4"/>
+              <w:right w:val="single" w:color="D4D1CA" w:sz="4"/>
+            </w:tcBorders>
+            <w:tcMar>
+              <w:top w:type="dxa" w:w="80"/>
+              <w:left w:type="dxa" w:w="100"/>
+              <w:bottom w:type="dxa" w:w="80"/>
+              <w:right w:type="dxa" w:w="100"/>
+            </w:tcMar>
+            <w:vAlign w:val="top"/>
+          </w:tcPr>
+          <w:p>
+            <w:pPr>
+              <w:spacing w:after="40" w:before="0"/>
+            </w:pPr>
+            <w:r>
+              <w:rPr>
+                <w:rFonts w:ascii="Calibri" w:cs="Calibri" w:eastAsia="Calibri" w:hAnsi="Calibri"/>
+                <w:b/>
+                <w:bCs/>
+                <w:color w:val="B0000A"/>
+                <w:sz w:val="18"/>
+                <w:szCs w:val="18"/>
+              </w:rPr>
+              <w:t xml:space="preserve">TBD (walkthrough)</w:t>
+            </w:r>
+          </w:p>
+        </w:tc>
+        <w:tc>
+          <w:tcPr>
+            <w:tcW w:type="dxa" w:w="2200"/>
             <w:tcBorders>
               <w:top w:val="single" w:color="D4D1CA" w:sz="4"/>
               <w:left w:val="single" w:color="D4D1CA" w:sz="4"/>
@@ -4012,7 +5078,41 @@
         </w:tc>
         <w:tc>
           <w:tcPr>
-            <w:tcW w:type="dxa" w:w="3400"/>
+            <w:tcW w:type="dxa" w:w="1800"/>
+            <w:tcBorders>
+              <w:top w:val="single" w:color="D4D1CA" w:sz="4"/>
+              <w:left w:val="single" w:color="D4D1CA" w:sz="4"/>
+              <w:bottom w:val="single" w:color="D4D1CA" w:sz="4"/>
+              <w:right w:val="single" w:color="D4D1CA" w:sz="4"/>
+            </w:tcBorders>
+            <w:tcMar>
+              <w:top w:type="dxa" w:w="80"/>
+              <w:left w:type="dxa" w:w="100"/>
+              <w:bottom w:type="dxa" w:w="80"/>
+              <w:right w:type="dxa" w:w="100"/>
+            </w:tcMar>
+            <w:vAlign w:val="top"/>
+          </w:tcPr>
+          <w:p>
+            <w:pPr>
+              <w:spacing w:after="40" w:before="0"/>
+            </w:pPr>
+            <w:r>
+              <w:rPr>
+                <w:rFonts w:ascii="Calibri" w:cs="Calibri" w:eastAsia="Calibri" w:hAnsi="Calibri"/>
+                <w:b/>
+                <w:bCs/>
+                <w:color w:val="B0000A"/>
+                <w:sz w:val="18"/>
+                <w:szCs w:val="18"/>
+              </w:rPr>
+              <w:t xml:space="preserve">TBD (walkthrough)</w:t>
+            </w:r>
+          </w:p>
+        </w:tc>
+        <w:tc>
+          <w:tcPr>
+            <w:tcW w:type="dxa" w:w="2400"/>
             <w:tcBorders>
               <w:top w:val="single" w:color="D4D1CA" w:sz="4"/>
               <w:left w:val="single" w:color="D4D1CA" w:sz="4"/>
@@ -4043,7 +5143,7 @@
         </w:tc>
         <w:tc>
           <w:tcPr>
-            <w:tcW w:type="dxa" w:w="3600"/>
+            <w:tcW w:type="dxa" w:w="2400"/>
             <w:tcBorders>
               <w:top w:val="single" w:color="D4D1CA" w:sz="4"/>
               <w:left w:val="single" w:color="D4D1CA" w:sz="4"/>
@@ -4329,7 +5429,7 @@
             <w:pPr>
               <w:spacing w:after="40" w:before="0"/>
             </w:pPr>
-            <w:hyperlink w:history="1" r:id="rIdtthy3bini2eg_uyikqzwe">
+            <w:hyperlink w:history="1" r:id="rId7sxtykm6pji7qft6ydbov">
               <w:r>
                 <w:rPr>
                   <w:rStyle w:val="Hyperlink"/>
@@ -4432,7 +5532,7 @@
             <w:pPr>
               <w:spacing w:after="40" w:before="0"/>
             </w:pPr>
-            <w:hyperlink w:history="1" r:id="rIdtpfa2flvymuzursdwbdnw">
+            <w:hyperlink w:history="1" r:id="rId0hjnz29lhyzh2gi1fjvx5">
               <w:r>
                 <w:rPr>
                   <w:rStyle w:val="Hyperlink"/>
@@ -4532,7 +5632,7 @@
             <w:pPr>
               <w:spacing w:after="40" w:before="0"/>
             </w:pPr>
-            <w:hyperlink w:history="1" r:id="rIdpbb90no_6rw-hoc1bj570">
+            <w:hyperlink w:history="1" r:id="rIdyr5m9stbiybnfxmr-d6n7">
               <w:r>
                 <w:rPr>
                   <w:rStyle w:val="Hyperlink"/>
@@ -4635,7 +5735,7 @@
             <w:pPr>
               <w:spacing w:after="40" w:before="0"/>
             </w:pPr>
-            <w:hyperlink w:history="1" r:id="rIdawvbs2ftt4xrl7vymt8uq">
+            <w:hyperlink w:history="1" r:id="rIdfancy-n7zb1rhjav0_ywc">
               <w:r>
                 <w:rPr>
                   <w:rStyle w:val="Hyperlink"/>
@@ -4919,7 +6019,7 @@
             <w:pPr>
               <w:spacing w:after="40" w:before="0"/>
             </w:pPr>
-            <w:hyperlink w:history="1" r:id="rIdoqqy0o1yfsjflekkrxjsr">
+            <w:hyperlink w:history="1" r:id="rIddee7thrhppwlbnks84-sl">
               <w:r>
                 <w:rPr>
                   <w:rStyle w:val="Hyperlink"/>
@@ -5063,7 +6163,7 @@
             <w:pPr>
               <w:spacing w:after="40" w:before="0"/>
             </w:pPr>
-            <w:hyperlink w:history="1" r:id="rIdv4ug4le9xwvxhvwrlausr">
+            <w:hyperlink w:history="1" r:id="rIdwpnvvix6fkpytbgsag8nw">
               <w:r>
                 <w:rPr>
                   <w:rStyle w:val="Hyperlink"/>
@@ -5207,7 +6307,7 @@
             <w:pPr>
               <w:spacing w:after="40" w:before="0"/>
             </w:pPr>
-            <w:hyperlink w:history="1" r:id="rIdul1dn-uaisjlz6oyimwpg">
+            <w:hyperlink w:history="1" r:id="rIdubtju_pg58mp1m-sapwj1">
               <w:r>
                 <w:rPr>
                   <w:rStyle w:val="Hyperlink"/>
@@ -5349,7 +6449,7 @@
             <w:pPr>
               <w:spacing w:after="40" w:before="0"/>
             </w:pPr>
-            <w:hyperlink w:history="1" r:id="rIdps-uhfduexwhinvftzkg4">
+            <w:hyperlink w:history="1" r:id="rIdukn5q6c9juvhehkfdtt8y">
               <w:r>
                 <w:rPr>
                   <w:rStyle w:val="Hyperlink"/>
@@ -5493,7 +6593,7 @@
             <w:pPr>
               <w:spacing w:after="40" w:before="0"/>
             </w:pPr>
-            <w:hyperlink w:history="1" r:id="rIdjwvvpjohwyhoxjz5t1x_b">
+            <w:hyperlink w:history="1" r:id="rIddteueca39zxnb7ver0wzr">
               <w:r>
                 <w:rPr>
                   <w:rStyle w:val="Hyperlink"/>
@@ -5635,7 +6735,7 @@
             <w:pPr>
               <w:spacing w:after="40" w:before="0"/>
             </w:pPr>
-            <w:hyperlink w:history="1" r:id="rIddwbe9esgjkaac6qfwput_">
+            <w:hyperlink w:history="1" r:id="rIds0qny_6cmacezv0brpbs6">
               <w:r>
                 <w:rPr>
                   <w:rStyle w:val="Hyperlink"/>
@@ -5822,7 +6922,7 @@
               </w:rPr>
               <w:t xml:space="preserve">Default to </w:t>
             </w:r>
-            <w:hyperlink w:history="1" r:id="rIdaavaf5_9vqqukupsp1yr3">
+            <w:hyperlink w:history="1" r:id="rIdmysztvg7g0da69q3jglbi">
               <w:r>
                 <w:rPr>
                   <w:rStyle w:val="Hyperlink"/>
@@ -5888,7 +6988,7 @@
         </w:rPr>
         <w:t xml:space="preserve">•  Pre-Lunch bridge (11:55 AM): </w:t>
       </w:r>
-      <w:hyperlink w:history="1" r:id="rIdurzmfb3yztxjmpcdcssk0">
+      <w:hyperlink w:history="1" r:id="rIdih1ouvx8xliwker6vf1qy">
         <w:r>
           <w:rPr>
             <w:rStyle w:val="Hyperlink"/>
@@ -5924,7 +7024,7 @@
         </w:rPr>
         <w:t xml:space="preserve">•  Post-Lunch return (1:00 PM): </w:t>
       </w:r>
-      <w:hyperlink w:history="1" r:id="rIdtydjghobeecpiuy3hk9fr">
+      <w:hyperlink w:history="1" r:id="rIdnhfbvy4rkdkcitaiailoy">
         <w:r>
           <w:rPr>
             <w:rStyle w:val="Hyperlink"/>
@@ -5945,7 +7045,7 @@
         </w:rPr>
         <w:t xml:space="preserve"> by Dolly Parton, then resume </w:t>
       </w:r>
-      <w:hyperlink w:history="1" r:id="rIdrmubg7napyqg4bnmcaykc">
+      <w:hyperlink w:history="1" r:id="rIdhgxxs-k_e7azn7nmzfdfc">
         <w:r>
           <w:rPr>
             <w:rStyle w:val="Hyperlink"/>
@@ -6192,7 +7292,7 @@
         </w:rPr>
         <w:t xml:space="preserve"> (deck / files / AV lead) · </w:t>
       </w:r>
-      <w:hyperlink w:history="1" r:id="rIdgi_dyhoei5swiwcz36hfb">
+      <w:hyperlink w:history="1" r:id="rIdxuo2tsszvgpkk6wnnr2en">
         <w:r>
           <w:rPr>
             <w:rStyle w:val="Hyperlink"/>
@@ -6211,7 +7311,7 @@
         </w:rPr>
         <w:t xml:space="preserve"> · </w:t>
       </w:r>
-      <w:hyperlink w:history="1" r:id="rIdfifh31grduotjymjlurrt">
+      <w:hyperlink w:history="1" r:id="rIdsz_fjraenj4uj21l1yjy1">
         <w:r>
           <w:rPr>
             <w:rStyle w:val="Hyperlink"/>
@@ -6245,7 +7345,7 @@
         </w:rPr>
         <w:t xml:space="preserve"> (Day-of Show Operations (event lead, run of show)) · </w:t>
       </w:r>
-      <w:hyperlink w:history="1" r:id="rIdyje-oyhologawx1qupf37">
+      <w:hyperlink w:history="1" r:id="rId2b_7er6mm6prwpzxmiooa">
         <w:r>
           <w:rPr>
             <w:rStyle w:val="Hyperlink"/>
@@ -6264,7 +7364,7 @@
         </w:rPr>
         <w:t xml:space="preserve"> · </w:t>
       </w:r>
-      <w:hyperlink w:history="1" r:id="rIdlya1fiihtlcfmi0mhbm1z">
+      <w:hyperlink w:history="1" r:id="rIdcynugtmntbkjh8yzf2_n8">
         <w:r>
           <w:rPr>
             <w:rStyle w:val="Hyperlink"/>
@@ -6298,7 +7398,7 @@
         </w:rPr>
         <w:t xml:space="preserve"> (Venue Liaison (knows the Statler)) · </w:t>
       </w:r>
-      <w:hyperlink w:history="1" r:id="rIdpxi6tm0u640cgttpdithj">
+      <w:hyperlink w:history="1" r:id="rIdanvjo5szttglefnzqnhkh">
         <w:r>
           <w:rPr>
             <w:rStyle w:val="Hyperlink"/>
@@ -6317,7 +7417,7 @@
         </w:rPr>
         <w:t xml:space="preserve"> · </w:t>
       </w:r>
-      <w:hyperlink w:history="1" r:id="rIdy65nqilvchipvg7c0qwtr">
+      <w:hyperlink w:history="1" r:id="rId9go_cscrfe01vdinmmivb">
         <w:r>
           <w:rPr>
             <w:rStyle w:val="Hyperlink"/>
@@ -6351,7 +7451,7 @@
         </w:rPr>
         <w:t xml:space="preserve"> (Encore / Statler AV contact) · </w:t>
       </w:r>
-      <w:hyperlink w:history="1" r:id="rIdjlm84py0pa5xrhe4di7hz">
+      <w:hyperlink w:history="1" r:id="rIdgvvlgtk7yqzt0rmdmatzr">
         <w:r>
           <w:rPr>
             <w:rStyle w:val="Hyperlink"/>
@@ -6370,7 +7470,7 @@
         </w:rPr>
         <w:t xml:space="preserve"> · </w:t>
       </w:r>
-      <w:hyperlink w:history="1" r:id="rIdrisagyjw0ijgx8l_67bnr">
+      <w:hyperlink w:history="1" r:id="rIdgdtnrqqps_mviiul6nrld">
         <w:r>
           <w:rPr>
             <w:rStyle w:val="Hyperlink"/>
@@ -6404,7 +7504,7 @@
         </w:rPr>
         <w:t xml:space="preserve"> (MC (emcee)) · </w:t>
       </w:r>
-      <w:hyperlink w:history="1" r:id="rIdli0afhjlx5pekhepbjcr5">
+      <w:hyperlink w:history="1" r:id="rIduynomyydlnbkfz22dmvxw">
         <w:r>
           <w:rPr>
             <w:rStyle w:val="Hyperlink"/>
@@ -6438,7 +7538,7 @@
         </w:rPr>
         <w:t xml:space="preserve"> (stage-side coordinator (eyes on stage all day, supports MC Max)) · </w:t>
       </w:r>
-      <w:hyperlink w:history="1" r:id="rIdcltryv6ccvp3-sj7lwptq">
+      <w:hyperlink w:history="1" r:id="rIdncdjp7ywakeuqiummuvqd">
         <w:r>
           <w:rPr>
             <w:rStyle w:val="Hyperlink"/>

</xml_diff>

<commit_message>
AV Timeline: merge Left+Right into single 'Side Screens (L+R)' column (they always mirror)
</commit_message>
<xml_diff>
--- a/deliverables/av-package/AV-Timeline.docx
+++ b/deliverables/av-package/AV-Timeline.docx
@@ -102,7 +102,7 @@
             <w:pPr>
               <w:spacing w:after="40" w:before="0"/>
             </w:pPr>
-            <w:hyperlink w:history="1" r:id="rIdxsvjycklvm-ipcxguuksp">
+            <w:hyperlink w:history="1" r:id="rIdyii7i8zrnhveylyuksxqm">
               <w:r>
                 <w:rPr>
                   <w:rStyle w:val="Hyperlink"/>
@@ -180,7 +180,7 @@
             <w:pPr>
               <w:spacing w:after="40" w:before="0"/>
             </w:pPr>
-            <w:hyperlink w:history="1" r:id="rIddtkxf4sywtoac-jiq1vqz">
+            <w:hyperlink w:history="1" r:id="rIdrx0ex-vq_usezi0sdbowt">
               <w:r>
                 <w:rPr>
                   <w:rStyle w:val="Hyperlink"/>
@@ -199,7 +199,7 @@
               </w:rPr>
               <w:t xml:space="preserve"> · </w:t>
             </w:r>
-            <w:hyperlink w:history="1" r:id="rId5t2nk6lvmovht5myasb71">
+            <w:hyperlink w:history="1" r:id="rIdhrbtg05mypabech9xb6cj">
               <w:r>
                 <w:rPr>
                   <w:rStyle w:val="Hyperlink"/>
@@ -218,7 +218,7 @@
               </w:rPr>
               <w:t xml:space="preserve"> · </w:t>
             </w:r>
-            <w:hyperlink w:history="1" r:id="rIdw-m_xohaxj1i0-_oqeobn">
+            <w:hyperlink w:history="1" r:id="rIduikgghhl1jer05m4wmpc-">
               <w:r>
                 <w:rPr>
                   <w:rStyle w:val="Hyperlink"/>
@@ -237,7 +237,7 @@
               </w:rPr>
               <w:t xml:space="preserve"> · </w:t>
             </w:r>
-            <w:hyperlink w:history="1" r:id="rIdtkcbx0hl8bfymd4be0buy">
+            <w:hyperlink w:history="1" r:id="rIdnksl4k9c2cwhcxzrdsod9">
               <w:r>
                 <w:rPr>
                   <w:rStyle w:val="Hyperlink"/>
@@ -511,13 +511,12 @@
         </w:tblBorders>
       </w:tblPr>
       <w:tblGrid>
-        <w:gridCol w:w="1200"/>
+        <w:gridCol w:w="1300"/>
+        <w:gridCol w:w="2800"/>
         <w:gridCol w:w="2600"/>
-        <w:gridCol w:w="1800"/>
-        <w:gridCol w:w="2200"/>
-        <w:gridCol w:w="1800"/>
-        <w:gridCol w:w="2400"/>
-        <w:gridCol w:w="2400"/>
+        <w:gridCol w:w="2500"/>
+        <w:gridCol w:w="2600"/>
+        <w:gridCol w:w="2600"/>
       </w:tblGrid>
       <w:tr>
         <w:trPr>
@@ -525,7 +524,7 @@
         </w:trPr>
         <w:tc>
           <w:tcPr>
-            <w:tcW w:type="dxa" w:w="1200"/>
+            <w:tcW w:type="dxa" w:w="1300"/>
             <w:tcBorders>
               <w:top w:val="single" w:color="D4D1CA" w:sz="4"/>
               <w:left w:val="single" w:color="D4D1CA" w:sz="4"/>
@@ -557,7 +556,7 @@
         </w:tc>
         <w:tc>
           <w:tcPr>
-            <w:tcW w:type="dxa" w:w="2600"/>
+            <w:tcW w:type="dxa" w:w="2800"/>
             <w:tcBorders>
               <w:top w:val="single" w:color="D4D1CA" w:sz="4"/>
               <w:left w:val="single" w:color="D4D1CA" w:sz="4"/>
@@ -589,7 +588,7 @@
         </w:tc>
         <w:tc>
           <w:tcPr>
-            <w:tcW w:type="dxa" w:w="1800"/>
+            <w:tcW w:type="dxa" w:w="2600"/>
             <w:tcBorders>
               <w:top w:val="single" w:color="D4D1CA" w:sz="4"/>
               <w:left w:val="single" w:color="D4D1CA" w:sz="4"/>
@@ -615,13 +614,13 @@
                 <w:sz w:val="20"/>
                 <w:szCs w:val="20"/>
               </w:rPr>
-              <w:t xml:space="preserve">Left Screen</w:t>
-            </w:r>
-          </w:p>
-        </w:tc>
-        <w:tc>
-          <w:tcPr>
-            <w:tcW w:type="dxa" w:w="2200"/>
+              <w:t xml:space="preserve">Main Screen</w:t>
+            </w:r>
+          </w:p>
+        </w:tc>
+        <w:tc>
+          <w:tcPr>
+            <w:tcW w:type="dxa" w:w="2500"/>
             <w:tcBorders>
               <w:top w:val="single" w:color="D4D1CA" w:sz="4"/>
               <w:left w:val="single" w:color="D4D1CA" w:sz="4"/>
@@ -647,13 +646,13 @@
                 <w:sz w:val="20"/>
                 <w:szCs w:val="20"/>
               </w:rPr>
-              <w:t xml:space="preserve">Main Screen</w:t>
-            </w:r>
-          </w:p>
-        </w:tc>
-        <w:tc>
-          <w:tcPr>
-            <w:tcW w:type="dxa" w:w="1800"/>
+              <w:t xml:space="preserve">Side Screens (L + R)</w:t>
+            </w:r>
+          </w:p>
+        </w:tc>
+        <w:tc>
+          <w:tcPr>
+            <w:tcW w:type="dxa" w:w="2600"/>
             <w:tcBorders>
               <w:top w:val="single" w:color="D4D1CA" w:sz="4"/>
               <w:left w:val="single" w:color="D4D1CA" w:sz="4"/>
@@ -679,13 +678,13 @@
                 <w:sz w:val="20"/>
                 <w:szCs w:val="20"/>
               </w:rPr>
-              <w:t xml:space="preserve">Right Screen</w:t>
-            </w:r>
-          </w:p>
-        </w:tc>
-        <w:tc>
-          <w:tcPr>
-            <w:tcW w:type="dxa" w:w="2400"/>
+              <w:t xml:space="preserve">Music / Audio</w:t>
+            </w:r>
+          </w:p>
+        </w:tc>
+        <w:tc>
+          <w:tcPr>
+            <w:tcW w:type="dxa" w:w="2600"/>
             <w:tcBorders>
               <w:top w:val="single" w:color="D4D1CA" w:sz="4"/>
               <w:left w:val="single" w:color="D4D1CA" w:sz="4"/>
@@ -711,24 +710,26 @@
                 <w:sz w:val="20"/>
                 <w:szCs w:val="20"/>
               </w:rPr>
-              <w:t xml:space="preserve">Music / Audio</w:t>
-            </w:r>
-          </w:p>
-        </w:tc>
-        <w:tc>
-          <w:tcPr>
-            <w:tcW w:type="dxa" w:w="2400"/>
-            <w:tcBorders>
-              <w:top w:val="single" w:color="D4D1CA" w:sz="4"/>
-              <w:left w:val="single" w:color="D4D1CA" w:sz="4"/>
-              <w:bottom w:val="single" w:color="D4D1CA" w:sz="4"/>
-              <w:right w:val="single" w:color="D4D1CA" w:sz="4"/>
-            </w:tcBorders>
-            <w:shd w:fill="0B1F3A" w:val="clear"/>
-            <w:tcMar>
-              <w:top w:type="dxa" w:w="100"/>
+              <w:t xml:space="preserve">AV Action</w:t>
+            </w:r>
+          </w:p>
+        </w:tc>
+      </w:tr>
+      <w:tr>
+        <w:tc>
+          <w:tcPr>
+            <w:gridSpan w:val="6"/>
+            <w:tcBorders>
+              <w:top w:val="single" w:color="D4D1CA" w:sz="4"/>
+              <w:left w:val="single" w:color="D4D1CA" w:sz="4"/>
+              <w:bottom w:val="single" w:color="D4D1CA" w:sz="4"/>
+              <w:right w:val="single" w:color="D4D1CA" w:sz="4"/>
+            </w:tcBorders>
+            <w:shd w:fill="E87722" w:val="clear"/>
+            <w:tcMar>
+              <w:top w:type="dxa" w:w="80"/>
               <w:left w:type="dxa" w:w="120"/>
-              <w:bottom w:type="dxa" w:w="100"/>
+              <w:bottom w:type="dxa" w:w="80"/>
               <w:right w:type="dxa" w:w="120"/>
             </w:tcMar>
             <w:vAlign w:val="top"/>
@@ -743,7 +744,7 @@
                 <w:sz w:val="20"/>
                 <w:szCs w:val="20"/>
               </w:rPr>
-              <w:t xml:space="preserve">AV Action</w:t>
+              <w:t xml:space="preserve">FREE MORNING PROGRAM</w:t>
             </w:r>
           </w:p>
         </w:tc>
@@ -751,41 +752,7 @@
       <w:tr>
         <w:tc>
           <w:tcPr>
-            <w:gridSpan w:val="7"/>
-            <w:tcBorders>
-              <w:top w:val="single" w:color="D4D1CA" w:sz="4"/>
-              <w:left w:val="single" w:color="D4D1CA" w:sz="4"/>
-              <w:bottom w:val="single" w:color="D4D1CA" w:sz="4"/>
-              <w:right w:val="single" w:color="D4D1CA" w:sz="4"/>
-            </w:tcBorders>
-            <w:shd w:fill="E87722" w:val="clear"/>
-            <w:tcMar>
-              <w:top w:type="dxa" w:w="80"/>
-              <w:left w:type="dxa" w:w="120"/>
-              <w:bottom w:type="dxa" w:w="80"/>
-              <w:right w:type="dxa" w:w="120"/>
-            </w:tcMar>
-            <w:vAlign w:val="top"/>
-          </w:tcPr>
-          <w:p>
-            <w:r>
-              <w:rPr>
-                <w:rFonts w:ascii="Calibri" w:cs="Calibri" w:eastAsia="Calibri" w:hAnsi="Calibri"/>
-                <w:b/>
-                <w:bCs/>
-                <w:color w:val="FFFFFF"/>
-                <w:sz w:val="20"/>
-                <w:szCs w:val="20"/>
-              </w:rPr>
-              <w:t xml:space="preserve">FREE MORNING PROGRAM</w:t>
-            </w:r>
-          </w:p>
-        </w:tc>
-      </w:tr>
-      <w:tr>
-        <w:tc>
-          <w:tcPr>
-            <w:tcW w:type="dxa" w:w="1200"/>
+            <w:tcW w:type="dxa" w:w="1300"/>
             <w:tcBorders>
               <w:top w:val="single" w:color="D4D1CA" w:sz="4"/>
               <w:left w:val="single" w:color="D4D1CA" w:sz="4"/>
@@ -816,6 +783,37 @@
         </w:tc>
         <w:tc>
           <w:tcPr>
+            <w:tcW w:type="dxa" w:w="2800"/>
+            <w:tcBorders>
+              <w:top w:val="single" w:color="D4D1CA" w:sz="4"/>
+              <w:left w:val="single" w:color="D4D1CA" w:sz="4"/>
+              <w:bottom w:val="single" w:color="D4D1CA" w:sz="4"/>
+              <w:right w:val="single" w:color="D4D1CA" w:sz="4"/>
+            </w:tcBorders>
+            <w:tcMar>
+              <w:top w:type="dxa" w:w="80"/>
+              <w:left w:type="dxa" w:w="100"/>
+              <w:bottom w:type="dxa" w:w="80"/>
+              <w:right w:type="dxa" w:w="100"/>
+            </w:tcMar>
+            <w:vAlign w:val="top"/>
+          </w:tcPr>
+          <w:p>
+            <w:pPr>
+              <w:spacing w:after="40" w:before="0"/>
+            </w:pPr>
+            <w:r>
+              <w:rPr>
+                <w:rFonts w:ascii="Calibri" w:cs="Calibri" w:eastAsia="Calibri" w:hAnsi="Calibri"/>
+                <w:sz w:val="18"/>
+                <w:szCs w:val="18"/>
+              </w:rPr>
+              <w:t xml:space="preserve">Coffee, Snacks &amp; Registration</w:t>
+            </w:r>
+          </w:p>
+        </w:tc>
+        <w:tc>
+          <w:tcPr>
             <w:tcW w:type="dxa" w:w="2600"/>
             <w:tcBorders>
               <w:top w:val="single" w:color="D4D1CA" w:sz="4"/>
@@ -838,16 +836,26 @@
             <w:r>
               <w:rPr>
                 <w:rFonts w:ascii="Calibri" w:cs="Calibri" w:eastAsia="Calibri" w:hAnsi="Calibri"/>
-                <w:sz w:val="18"/>
-                <w:szCs w:val="18"/>
-              </w:rPr>
-              <w:t xml:space="preserve">Coffee, Snacks &amp; Registration</w:t>
-            </w:r>
-          </w:p>
-        </w:tc>
-        <w:tc>
-          <w:tcPr>
-            <w:tcW w:type="dxa" w:w="1800"/>
+                <w:b/>
+                <w:bCs/>
+                <w:sz w:val="18"/>
+                <w:szCs w:val="18"/>
+              </w:rPr>
+              <w:t xml:space="preserve">Sponsors loop: </w:t>
+            </w:r>
+            <w:r>
+              <w:rPr>
+                <w:rFonts w:ascii="Calibri" w:cs="Calibri" w:eastAsia="Calibri" w:hAnsi="Calibri"/>
+                <w:sz w:val="18"/>
+                <w:szCs w:val="18"/>
+              </w:rPr>
+              <w:t xml:space="preserve">timer page (countdown to 8:00 with scrolling sponsor logos)</w:t>
+            </w:r>
+          </w:p>
+        </w:tc>
+        <w:tc>
+          <w:tcPr>
+            <w:tcW w:type="dxa" w:w="2500"/>
             <w:tcBorders>
               <w:top w:val="single" w:color="D4D1CA" w:sz="4"/>
               <w:left w:val="single" w:color="D4D1CA" w:sz="4"/>
@@ -881,101 +889,26 @@
         </w:tc>
         <w:tc>
           <w:tcPr>
-            <w:tcW w:type="dxa" w:w="2200"/>
-            <w:tcBorders>
-              <w:top w:val="single" w:color="D4D1CA" w:sz="4"/>
-              <w:left w:val="single" w:color="D4D1CA" w:sz="4"/>
-              <w:bottom w:val="single" w:color="D4D1CA" w:sz="4"/>
-              <w:right w:val="single" w:color="D4D1CA" w:sz="4"/>
-            </w:tcBorders>
-            <w:tcMar>
-              <w:top w:type="dxa" w:w="80"/>
-              <w:left w:type="dxa" w:w="100"/>
-              <w:bottom w:type="dxa" w:w="80"/>
-              <w:right w:type="dxa" w:w="100"/>
-            </w:tcMar>
-            <w:vAlign w:val="top"/>
-          </w:tcPr>
-          <w:p>
-            <w:pPr>
-              <w:spacing w:after="40" w:before="0"/>
-            </w:pPr>
-            <w:r>
-              <w:rPr>
-                <w:rFonts w:ascii="Calibri" w:cs="Calibri" w:eastAsia="Calibri" w:hAnsi="Calibri"/>
-                <w:b/>
-                <w:bCs/>
-                <w:sz w:val="18"/>
-                <w:szCs w:val="18"/>
-              </w:rPr>
-              <w:t xml:space="preserve">Sponsors loop: </w:t>
-            </w:r>
-            <w:r>
-              <w:rPr>
-                <w:rFonts w:ascii="Calibri" w:cs="Calibri" w:eastAsia="Calibri" w:hAnsi="Calibri"/>
-                <w:sz w:val="18"/>
-                <w:szCs w:val="18"/>
-              </w:rPr>
-              <w:t xml:space="preserve">timer page (countdown to 8:00 with scrolling sponsor logos)</w:t>
-            </w:r>
-          </w:p>
-        </w:tc>
-        <w:tc>
-          <w:tcPr>
-            <w:tcW w:type="dxa" w:w="1800"/>
-            <w:tcBorders>
-              <w:top w:val="single" w:color="D4D1CA" w:sz="4"/>
-              <w:left w:val="single" w:color="D4D1CA" w:sz="4"/>
-              <w:bottom w:val="single" w:color="D4D1CA" w:sz="4"/>
-              <w:right w:val="single" w:color="D4D1CA" w:sz="4"/>
-            </w:tcBorders>
-            <w:tcMar>
-              <w:top w:type="dxa" w:w="80"/>
-              <w:left w:type="dxa" w:w="100"/>
-              <w:bottom w:type="dxa" w:w="80"/>
-              <w:right w:type="dxa" w:w="100"/>
-            </w:tcMar>
-            <w:vAlign w:val="top"/>
-          </w:tcPr>
-          <w:p>
-            <w:pPr>
-              <w:spacing w:after="40" w:before="0"/>
-            </w:pPr>
-            <w:r>
-              <w:rPr>
-                <w:rFonts w:ascii="Calibri" w:cs="Calibri" w:eastAsia="Calibri" w:hAnsi="Calibri"/>
-                <w:b/>
-                <w:bCs/>
-                <w:color w:val="B0000A"/>
-                <w:sz w:val="18"/>
-                <w:szCs w:val="18"/>
-              </w:rPr>
-              <w:t xml:space="preserve">TBD (walkthrough)</w:t>
-            </w:r>
-          </w:p>
-        </w:tc>
-        <w:tc>
-          <w:tcPr>
-            <w:tcW w:type="dxa" w:w="2400"/>
-            <w:tcBorders>
-              <w:top w:val="single" w:color="D4D1CA" w:sz="4"/>
-              <w:left w:val="single" w:color="D4D1CA" w:sz="4"/>
-              <w:bottom w:val="single" w:color="D4D1CA" w:sz="4"/>
-              <w:right w:val="single" w:color="D4D1CA" w:sz="4"/>
-            </w:tcBorders>
-            <w:tcMar>
-              <w:top w:type="dxa" w:w="80"/>
-              <w:left w:type="dxa" w:w="100"/>
-              <w:bottom w:type="dxa" w:w="80"/>
-              <w:right w:type="dxa" w:w="100"/>
-            </w:tcMar>
-            <w:vAlign w:val="top"/>
-          </w:tcPr>
-          <w:p>
-            <w:pPr>
-              <w:spacing w:after="40" w:before="0"/>
-            </w:pPr>
-            <w:hyperlink w:history="1" r:id="rIdga3hwqj6u6xdi0fexsjqk">
+            <w:tcW w:type="dxa" w:w="2600"/>
+            <w:tcBorders>
+              <w:top w:val="single" w:color="D4D1CA" w:sz="4"/>
+              <w:left w:val="single" w:color="D4D1CA" w:sz="4"/>
+              <w:bottom w:val="single" w:color="D4D1CA" w:sz="4"/>
+              <w:right w:val="single" w:color="D4D1CA" w:sz="4"/>
+            </w:tcBorders>
+            <w:tcMar>
+              <w:top w:type="dxa" w:w="80"/>
+              <w:left w:type="dxa" w:w="100"/>
+              <w:bottom w:type="dxa" w:w="80"/>
+              <w:right w:type="dxa" w:w="100"/>
+            </w:tcMar>
+            <w:vAlign w:val="top"/>
+          </w:tcPr>
+          <w:p>
+            <w:pPr>
+              <w:spacing w:after="40" w:before="0"/>
+            </w:pPr>
+            <w:hyperlink w:history="1" r:id="rIdtjssnznxynfszc7f-_bpg">
               <w:r>
                 <w:rPr>
                   <w:rStyle w:val="Hyperlink"/>
@@ -990,7 +923,7 @@
         </w:tc>
         <w:tc>
           <w:tcPr>
-            <w:tcW w:type="dxa" w:w="2400"/>
+            <w:tcW w:type="dxa" w:w="2600"/>
             <w:tcBorders>
               <w:top w:val="single" w:color="D4D1CA" w:sz="4"/>
               <w:left w:val="single" w:color="D4D1CA" w:sz="4"/>
@@ -1027,7 +960,7 @@
               </w:rPr>
               <w:t xml:space="preserve">Open </w:t>
             </w:r>
-            <w:hyperlink w:history="1" r:id="rIdjdp7jscxt5z-bivrhtfum">
+            <w:hyperlink w:history="1" r:id="rIdd6hjmw0jyhwirp6n8oj3z">
               <w:r>
                 <w:rPr>
                   <w:rStyle w:val="Hyperlink"/>
@@ -1052,7 +985,7 @@
       <w:tr>
         <w:tc>
           <w:tcPr>
-            <w:tcW w:type="dxa" w:w="1200"/>
+            <w:tcW w:type="dxa" w:w="1300"/>
             <w:tcBorders>
               <w:top w:val="single" w:color="D4D1CA" w:sz="4"/>
               <w:left w:val="single" w:color="D4D1CA" w:sz="4"/>
@@ -1084,6 +1017,54 @@
         </w:tc>
         <w:tc>
           <w:tcPr>
+            <w:tcW w:type="dxa" w:w="2800"/>
+            <w:tcBorders>
+              <w:top w:val="single" w:color="D4D1CA" w:sz="4"/>
+              <w:left w:val="single" w:color="D4D1CA" w:sz="4"/>
+              <w:bottom w:val="single" w:color="D4D1CA" w:sz="4"/>
+              <w:right w:val="single" w:color="D4D1CA" w:sz="4"/>
+            </w:tcBorders>
+            <w:shd w:fill="F5F1EA" w:val="clear"/>
+            <w:tcMar>
+              <w:top w:type="dxa" w:w="80"/>
+              <w:left w:type="dxa" w:w="100"/>
+              <w:bottom w:type="dxa" w:w="80"/>
+              <w:right w:type="dxa" w:w="100"/>
+            </w:tcMar>
+            <w:vAlign w:val="top"/>
+          </w:tcPr>
+          <w:p>
+            <w:pPr>
+              <w:spacing w:after="40" w:before="0"/>
+            </w:pPr>
+            <w:r>
+              <w:rPr>
+                <w:rFonts w:ascii="Calibri" w:cs="Calibri" w:eastAsia="Calibri" w:hAnsi="Calibri"/>
+                <w:b/>
+                <w:bCs/>
+                <w:sz w:val="18"/>
+                <w:szCs w:val="18"/>
+              </w:rPr>
+              <w:t xml:space="preserve">Get a Grip on your Business with EOS</w:t>
+            </w:r>
+          </w:p>
+          <w:p>
+            <w:pPr>
+              <w:spacing w:after="40" w:before="0"/>
+            </w:pPr>
+            <w:r>
+              <w:rPr>
+                <w:rFonts w:ascii="Calibri" w:cs="Calibri" w:eastAsia="Calibri" w:hAnsi="Calibri"/>
+                <w:color w:val="7A7974"/>
+                <w:sz w:val="18"/>
+                <w:szCs w:val="18"/>
+              </w:rPr>
+              <w:t xml:space="preserve">Ann Sheu · Certified EOS Implementer</w:t>
+            </w:r>
+          </w:p>
+        </w:tc>
+        <w:tc>
+          <w:tcPr>
             <w:tcW w:type="dxa" w:w="2600"/>
             <w:tcBorders>
               <w:top w:val="single" w:color="D4D1CA" w:sz="4"/>
@@ -1107,32 +1088,16 @@
             <w:r>
               <w:rPr>
                 <w:rFonts w:ascii="Calibri" w:cs="Calibri" w:eastAsia="Calibri" w:hAnsi="Calibri"/>
-                <w:b/>
-                <w:bCs/>
-                <w:sz w:val="18"/>
-                <w:szCs w:val="18"/>
-              </w:rPr>
-              <w:t xml:space="preserve">Get a Grip on your Business with EOS</w:t>
-            </w:r>
-          </w:p>
-          <w:p>
-            <w:pPr>
-              <w:spacing w:after="40" w:before="0"/>
-            </w:pPr>
-            <w:r>
-              <w:rPr>
-                <w:rFonts w:ascii="Calibri" w:cs="Calibri" w:eastAsia="Calibri" w:hAnsi="Calibri"/>
-                <w:color w:val="7A7974"/>
-                <w:sz w:val="18"/>
-                <w:szCs w:val="18"/>
-              </w:rPr>
-              <w:t xml:space="preserve">Ann Sheu · Certified EOS Implementer</w:t>
-            </w:r>
-          </w:p>
-        </w:tc>
-        <w:tc>
-          <w:tcPr>
-            <w:tcW w:type="dxa" w:w="1800"/>
+                <w:sz w:val="18"/>
+                <w:szCs w:val="18"/>
+              </w:rPr>
+              <w:t xml:space="preserve">Ann's deck (in Speaker Decks/)</w:t>
+            </w:r>
+          </w:p>
+        </w:tc>
+        <w:tc>
+          <w:tcPr>
+            <w:tcW w:type="dxa" w:w="2500"/>
             <w:tcBorders>
               <w:top w:val="single" w:color="D4D1CA" w:sz="4"/>
               <w:left w:val="single" w:color="D4D1CA" w:sz="4"/>
@@ -1167,7 +1132,7 @@
         </w:tc>
         <w:tc>
           <w:tcPr>
-            <w:tcW w:type="dxa" w:w="2200"/>
+            <w:tcW w:type="dxa" w:w="2600"/>
             <w:tcBorders>
               <w:top w:val="single" w:color="D4D1CA" w:sz="4"/>
               <w:left w:val="single" w:color="D4D1CA" w:sz="4"/>
@@ -1190,73 +1155,6 @@
             <w:r>
               <w:rPr>
                 <w:rFonts w:ascii="Calibri" w:cs="Calibri" w:eastAsia="Calibri" w:hAnsi="Calibri"/>
-                <w:sz w:val="18"/>
-                <w:szCs w:val="18"/>
-              </w:rPr>
-              <w:t xml:space="preserve">Ann's deck (in Speaker Decks/)</w:t>
-            </w:r>
-          </w:p>
-        </w:tc>
-        <w:tc>
-          <w:tcPr>
-            <w:tcW w:type="dxa" w:w="1800"/>
-            <w:tcBorders>
-              <w:top w:val="single" w:color="D4D1CA" w:sz="4"/>
-              <w:left w:val="single" w:color="D4D1CA" w:sz="4"/>
-              <w:bottom w:val="single" w:color="D4D1CA" w:sz="4"/>
-              <w:right w:val="single" w:color="D4D1CA" w:sz="4"/>
-            </w:tcBorders>
-            <w:shd w:fill="F5F1EA" w:val="clear"/>
-            <w:tcMar>
-              <w:top w:type="dxa" w:w="80"/>
-              <w:left w:type="dxa" w:w="100"/>
-              <w:bottom w:type="dxa" w:w="80"/>
-              <w:right w:type="dxa" w:w="100"/>
-            </w:tcMar>
-            <w:vAlign w:val="top"/>
-          </w:tcPr>
-          <w:p>
-            <w:pPr>
-              <w:spacing w:after="40" w:before="0"/>
-            </w:pPr>
-            <w:r>
-              <w:rPr>
-                <w:rFonts w:ascii="Calibri" w:cs="Calibri" w:eastAsia="Calibri" w:hAnsi="Calibri"/>
-                <w:b/>
-                <w:bCs/>
-                <w:color w:val="B0000A"/>
-                <w:sz w:val="18"/>
-                <w:szCs w:val="18"/>
-              </w:rPr>
-              <w:t xml:space="preserve">TBD (walkthrough)</w:t>
-            </w:r>
-          </w:p>
-        </w:tc>
-        <w:tc>
-          <w:tcPr>
-            <w:tcW w:type="dxa" w:w="2400"/>
-            <w:tcBorders>
-              <w:top w:val="single" w:color="D4D1CA" w:sz="4"/>
-              <w:left w:val="single" w:color="D4D1CA" w:sz="4"/>
-              <w:bottom w:val="single" w:color="D4D1CA" w:sz="4"/>
-              <w:right w:val="single" w:color="D4D1CA" w:sz="4"/>
-            </w:tcBorders>
-            <w:shd w:fill="F5F1EA" w:val="clear"/>
-            <w:tcMar>
-              <w:top w:type="dxa" w:w="80"/>
-              <w:left w:type="dxa" w:w="100"/>
-              <w:bottom w:type="dxa" w:w="80"/>
-              <w:right w:type="dxa" w:w="100"/>
-            </w:tcMar>
-            <w:vAlign w:val="top"/>
-          </w:tcPr>
-          <w:p>
-            <w:pPr>
-              <w:spacing w:after="40" w:before="0"/>
-            </w:pPr>
-            <w:r>
-              <w:rPr>
-                <w:rFonts w:ascii="Calibri" w:cs="Calibri" w:eastAsia="Calibri" w:hAnsi="Calibri"/>
                 <w:b/>
                 <w:bCs/>
                 <w:sz w:val="18"/>
@@ -1264,7 +1162,7 @@
               </w:rPr>
               <w:t xml:space="preserve">Walk-on: </w:t>
             </w:r>
-            <w:hyperlink w:history="1" r:id="rIdoitcay-hbguneaqjbnfwn">
+            <w:hyperlink w:history="1" r:id="rIdh7o4ybqblzlvdesxecldd">
               <w:r>
                 <w:rPr>
                   <w:rStyle w:val="Hyperlink"/>
@@ -1299,7 +1197,7 @@
         </w:tc>
         <w:tc>
           <w:tcPr>
-            <w:tcW w:type="dxa" w:w="2400"/>
+            <w:tcW w:type="dxa" w:w="2600"/>
             <w:tcBorders>
               <w:top w:val="single" w:color="D4D1CA" w:sz="4"/>
               <w:left w:val="single" w:color="D4D1CA" w:sz="4"/>
@@ -1333,7 +1231,7 @@
       <w:tr>
         <w:tc>
           <w:tcPr>
-            <w:tcW w:type="dxa" w:w="1200"/>
+            <w:tcW w:type="dxa" w:w="1300"/>
             <w:tcBorders>
               <w:top w:val="single" w:color="D4D1CA" w:sz="4"/>
               <w:left w:val="single" w:color="D4D1CA" w:sz="4"/>
@@ -1364,6 +1262,37 @@
         </w:tc>
         <w:tc>
           <w:tcPr>
+            <w:tcW w:type="dxa" w:w="2800"/>
+            <w:tcBorders>
+              <w:top w:val="single" w:color="D4D1CA" w:sz="4"/>
+              <w:left w:val="single" w:color="D4D1CA" w:sz="4"/>
+              <w:bottom w:val="single" w:color="D4D1CA" w:sz="4"/>
+              <w:right w:val="single" w:color="D4D1CA" w:sz="4"/>
+            </w:tcBorders>
+            <w:tcMar>
+              <w:top w:type="dxa" w:w="80"/>
+              <w:left w:type="dxa" w:w="100"/>
+              <w:bottom w:type="dxa" w:w="80"/>
+              <w:right w:type="dxa" w:w="100"/>
+            </w:tcMar>
+            <w:vAlign w:val="top"/>
+          </w:tcPr>
+          <w:p>
+            <w:pPr>
+              <w:spacing w:after="40" w:before="0"/>
+            </w:pPr>
+            <w:r>
+              <w:rPr>
+                <w:rFonts w:ascii="Calibri" w:cs="Calibri" w:eastAsia="Calibri" w:hAnsi="Calibri"/>
+                <w:sz w:val="18"/>
+                <w:szCs w:val="18"/>
+              </w:rPr>
+              <w:t xml:space="preserve">Break (15 min)</w:t>
+            </w:r>
+          </w:p>
+        </w:tc>
+        <w:tc>
+          <w:tcPr>
             <w:tcW w:type="dxa" w:w="2600"/>
             <w:tcBorders>
               <w:top w:val="single" w:color="D4D1CA" w:sz="4"/>
@@ -1386,16 +1315,26 @@
             <w:r>
               <w:rPr>
                 <w:rFonts w:ascii="Calibri" w:cs="Calibri" w:eastAsia="Calibri" w:hAnsi="Calibri"/>
-                <w:sz w:val="18"/>
-                <w:szCs w:val="18"/>
-              </w:rPr>
-              <w:t xml:space="preserve">Break (15 min)</w:t>
-            </w:r>
-          </w:p>
-        </w:tc>
-        <w:tc>
-          <w:tcPr>
-            <w:tcW w:type="dxa" w:w="1800"/>
+                <w:b/>
+                <w:bCs/>
+                <w:sz w:val="18"/>
+                <w:szCs w:val="18"/>
+              </w:rPr>
+              <w:t xml:space="preserve">Celebrations loop: </w:t>
+            </w:r>
+            <w:r>
+              <w:rPr>
+                <w:rFonts w:ascii="Calibri" w:cs="Calibri" w:eastAsia="Calibri" w:hAnsi="Calibri"/>
+                <w:sz w:val="18"/>
+                <w:szCs w:val="18"/>
+              </w:rPr>
+              <w:t xml:space="preserve">run Celebrations-Loop.pptx (F5, kiosk mode)</w:t>
+            </w:r>
+          </w:p>
+        </w:tc>
+        <w:tc>
+          <w:tcPr>
+            <w:tcW w:type="dxa" w:w="2500"/>
             <w:tcBorders>
               <w:top w:val="single" w:color="D4D1CA" w:sz="4"/>
               <w:left w:val="single" w:color="D4D1CA" w:sz="4"/>
@@ -1429,101 +1368,26 @@
         </w:tc>
         <w:tc>
           <w:tcPr>
-            <w:tcW w:type="dxa" w:w="2200"/>
-            <w:tcBorders>
-              <w:top w:val="single" w:color="D4D1CA" w:sz="4"/>
-              <w:left w:val="single" w:color="D4D1CA" w:sz="4"/>
-              <w:bottom w:val="single" w:color="D4D1CA" w:sz="4"/>
-              <w:right w:val="single" w:color="D4D1CA" w:sz="4"/>
-            </w:tcBorders>
-            <w:tcMar>
-              <w:top w:type="dxa" w:w="80"/>
-              <w:left w:type="dxa" w:w="100"/>
-              <w:bottom w:type="dxa" w:w="80"/>
-              <w:right w:type="dxa" w:w="100"/>
-            </w:tcMar>
-            <w:vAlign w:val="top"/>
-          </w:tcPr>
-          <w:p>
-            <w:pPr>
-              <w:spacing w:after="40" w:before="0"/>
-            </w:pPr>
-            <w:r>
-              <w:rPr>
-                <w:rFonts w:ascii="Calibri" w:cs="Calibri" w:eastAsia="Calibri" w:hAnsi="Calibri"/>
-                <w:b/>
-                <w:bCs/>
-                <w:sz w:val="18"/>
-                <w:szCs w:val="18"/>
-              </w:rPr>
-              <w:t xml:space="preserve">Celebrations loop: </w:t>
-            </w:r>
-            <w:r>
-              <w:rPr>
-                <w:rFonts w:ascii="Calibri" w:cs="Calibri" w:eastAsia="Calibri" w:hAnsi="Calibri"/>
-                <w:sz w:val="18"/>
-                <w:szCs w:val="18"/>
-              </w:rPr>
-              <w:t xml:space="preserve">run Celebrations-Loop.pptx (F5, kiosk mode)</w:t>
-            </w:r>
-          </w:p>
-        </w:tc>
-        <w:tc>
-          <w:tcPr>
-            <w:tcW w:type="dxa" w:w="1800"/>
-            <w:tcBorders>
-              <w:top w:val="single" w:color="D4D1CA" w:sz="4"/>
-              <w:left w:val="single" w:color="D4D1CA" w:sz="4"/>
-              <w:bottom w:val="single" w:color="D4D1CA" w:sz="4"/>
-              <w:right w:val="single" w:color="D4D1CA" w:sz="4"/>
-            </w:tcBorders>
-            <w:tcMar>
-              <w:top w:type="dxa" w:w="80"/>
-              <w:left w:type="dxa" w:w="100"/>
-              <w:bottom w:type="dxa" w:w="80"/>
-              <w:right w:type="dxa" w:w="100"/>
-            </w:tcMar>
-            <w:vAlign w:val="top"/>
-          </w:tcPr>
-          <w:p>
-            <w:pPr>
-              <w:spacing w:after="40" w:before="0"/>
-            </w:pPr>
-            <w:r>
-              <w:rPr>
-                <w:rFonts w:ascii="Calibri" w:cs="Calibri" w:eastAsia="Calibri" w:hAnsi="Calibri"/>
-                <w:b/>
-                <w:bCs/>
-                <w:color w:val="B0000A"/>
-                <w:sz w:val="18"/>
-                <w:szCs w:val="18"/>
-              </w:rPr>
-              <w:t xml:space="preserve">TBD (walkthrough)</w:t>
-            </w:r>
-          </w:p>
-        </w:tc>
-        <w:tc>
-          <w:tcPr>
-            <w:tcW w:type="dxa" w:w="2400"/>
-            <w:tcBorders>
-              <w:top w:val="single" w:color="D4D1CA" w:sz="4"/>
-              <w:left w:val="single" w:color="D4D1CA" w:sz="4"/>
-              <w:bottom w:val="single" w:color="D4D1CA" w:sz="4"/>
-              <w:right w:val="single" w:color="D4D1CA" w:sz="4"/>
-            </w:tcBorders>
-            <w:tcMar>
-              <w:top w:type="dxa" w:w="80"/>
-              <w:left w:type="dxa" w:w="100"/>
-              <w:bottom w:type="dxa" w:w="80"/>
-              <w:right w:type="dxa" w:w="100"/>
-            </w:tcMar>
-            <w:vAlign w:val="top"/>
-          </w:tcPr>
-          <w:p>
-            <w:pPr>
-              <w:spacing w:after="40" w:before="0"/>
-            </w:pPr>
-            <w:hyperlink w:history="1" r:id="rIdwcqis82n0_f0uaxt6bf4j">
+            <w:tcW w:type="dxa" w:w="2600"/>
+            <w:tcBorders>
+              <w:top w:val="single" w:color="D4D1CA" w:sz="4"/>
+              <w:left w:val="single" w:color="D4D1CA" w:sz="4"/>
+              <w:bottom w:val="single" w:color="D4D1CA" w:sz="4"/>
+              <w:right w:val="single" w:color="D4D1CA" w:sz="4"/>
+            </w:tcBorders>
+            <w:tcMar>
+              <w:top w:type="dxa" w:w="80"/>
+              <w:left w:type="dxa" w:w="100"/>
+              <w:bottom w:type="dxa" w:w="80"/>
+              <w:right w:type="dxa" w:w="100"/>
+            </w:tcMar>
+            <w:vAlign w:val="top"/>
+          </w:tcPr>
+          <w:p>
+            <w:pPr>
+              <w:spacing w:after="40" w:before="0"/>
+            </w:pPr>
+            <w:hyperlink w:history="1" r:id="rId1eujphpkz3s4ot6g12ado">
               <w:r>
                 <w:rPr>
                   <w:rStyle w:val="Hyperlink"/>
@@ -1538,7 +1402,7 @@
         </w:tc>
         <w:tc>
           <w:tcPr>
-            <w:tcW w:type="dxa" w:w="2400"/>
+            <w:tcW w:type="dxa" w:w="2600"/>
             <w:tcBorders>
               <w:top w:val="single" w:color="D4D1CA" w:sz="4"/>
               <w:left w:val="single" w:color="D4D1CA" w:sz="4"/>
@@ -1635,7 +1499,7 @@
       <w:tr>
         <w:tc>
           <w:tcPr>
-            <w:tcW w:type="dxa" w:w="1200"/>
+            <w:tcW w:type="dxa" w:w="1300"/>
             <w:tcBorders>
               <w:top w:val="single" w:color="D4D1CA" w:sz="4"/>
               <w:left w:val="single" w:color="D4D1CA" w:sz="4"/>
@@ -1667,6 +1531,54 @@
         </w:tc>
         <w:tc>
           <w:tcPr>
+            <w:tcW w:type="dxa" w:w="2800"/>
+            <w:tcBorders>
+              <w:top w:val="single" w:color="D4D1CA" w:sz="4"/>
+              <w:left w:val="single" w:color="D4D1CA" w:sz="4"/>
+              <w:bottom w:val="single" w:color="D4D1CA" w:sz="4"/>
+              <w:right w:val="single" w:color="D4D1CA" w:sz="4"/>
+            </w:tcBorders>
+            <w:shd w:fill="F5F1EA" w:val="clear"/>
+            <w:tcMar>
+              <w:top w:type="dxa" w:w="80"/>
+              <w:left w:type="dxa" w:w="100"/>
+              <w:bottom w:type="dxa" w:w="80"/>
+              <w:right w:type="dxa" w:w="100"/>
+            </w:tcMar>
+            <w:vAlign w:val="top"/>
+          </w:tcPr>
+          <w:p>
+            <w:pPr>
+              <w:spacing w:after="40" w:before="0"/>
+            </w:pPr>
+            <w:r>
+              <w:rPr>
+                <w:rFonts w:ascii="Calibri" w:cs="Calibri" w:eastAsia="Calibri" w:hAnsi="Calibri"/>
+                <w:b/>
+                <w:bCs/>
+                <w:sz w:val="18"/>
+                <w:szCs w:val="18"/>
+              </w:rPr>
+              <w:t xml:space="preserve">Journey with an EOS Implementer</w:t>
+            </w:r>
+          </w:p>
+          <w:p>
+            <w:pPr>
+              <w:spacing w:after="40" w:before="0"/>
+            </w:pPr>
+            <w:r>
+              <w:rPr>
+                <w:rFonts w:ascii="Calibri" w:cs="Calibri" w:eastAsia="Calibri" w:hAnsi="Calibri"/>
+                <w:color w:val="7A7974"/>
+                <w:sz w:val="18"/>
+                <w:szCs w:val="18"/>
+              </w:rPr>
+              <w:t xml:space="preserve">Brian Dosal · Strety</w:t>
+            </w:r>
+          </w:p>
+        </w:tc>
+        <w:tc>
+          <w:tcPr>
             <w:tcW w:type="dxa" w:w="2600"/>
             <w:tcBorders>
               <w:top w:val="single" w:color="D4D1CA" w:sz="4"/>
@@ -1690,32 +1602,16 @@
             <w:r>
               <w:rPr>
                 <w:rFonts w:ascii="Calibri" w:cs="Calibri" w:eastAsia="Calibri" w:hAnsi="Calibri"/>
-                <w:b/>
-                <w:bCs/>
-                <w:sz w:val="18"/>
-                <w:szCs w:val="18"/>
-              </w:rPr>
-              <w:t xml:space="preserve">Journey with an EOS Implementer</w:t>
-            </w:r>
-          </w:p>
-          <w:p>
-            <w:pPr>
-              <w:spacing w:after="40" w:before="0"/>
-            </w:pPr>
-            <w:r>
-              <w:rPr>
-                <w:rFonts w:ascii="Calibri" w:cs="Calibri" w:eastAsia="Calibri" w:hAnsi="Calibri"/>
-                <w:color w:val="7A7974"/>
-                <w:sz w:val="18"/>
-                <w:szCs w:val="18"/>
-              </w:rPr>
-              <w:t xml:space="preserve">Brian Dosal · Strety</w:t>
-            </w:r>
-          </w:p>
-        </w:tc>
-        <w:tc>
-          <w:tcPr>
-            <w:tcW w:type="dxa" w:w="1800"/>
+                <w:sz w:val="18"/>
+                <w:szCs w:val="18"/>
+              </w:rPr>
+              <w:t xml:space="preserve">Brian's deck (in Speaker Decks/)</w:t>
+            </w:r>
+          </w:p>
+        </w:tc>
+        <w:tc>
+          <w:tcPr>
+            <w:tcW w:type="dxa" w:w="2500"/>
             <w:tcBorders>
               <w:top w:val="single" w:color="D4D1CA" w:sz="4"/>
               <w:left w:val="single" w:color="D4D1CA" w:sz="4"/>
@@ -1750,7 +1646,7 @@
         </w:tc>
         <w:tc>
           <w:tcPr>
-            <w:tcW w:type="dxa" w:w="2200"/>
+            <w:tcW w:type="dxa" w:w="2600"/>
             <w:tcBorders>
               <w:top w:val="single" w:color="D4D1CA" w:sz="4"/>
               <w:left w:val="single" w:color="D4D1CA" w:sz="4"/>
@@ -1773,73 +1669,6 @@
             <w:r>
               <w:rPr>
                 <w:rFonts w:ascii="Calibri" w:cs="Calibri" w:eastAsia="Calibri" w:hAnsi="Calibri"/>
-                <w:sz w:val="18"/>
-                <w:szCs w:val="18"/>
-              </w:rPr>
-              <w:t xml:space="preserve">Brian's deck (in Speaker Decks/)</w:t>
-            </w:r>
-          </w:p>
-        </w:tc>
-        <w:tc>
-          <w:tcPr>
-            <w:tcW w:type="dxa" w:w="1800"/>
-            <w:tcBorders>
-              <w:top w:val="single" w:color="D4D1CA" w:sz="4"/>
-              <w:left w:val="single" w:color="D4D1CA" w:sz="4"/>
-              <w:bottom w:val="single" w:color="D4D1CA" w:sz="4"/>
-              <w:right w:val="single" w:color="D4D1CA" w:sz="4"/>
-            </w:tcBorders>
-            <w:shd w:fill="F5F1EA" w:val="clear"/>
-            <w:tcMar>
-              <w:top w:type="dxa" w:w="80"/>
-              <w:left w:type="dxa" w:w="100"/>
-              <w:bottom w:type="dxa" w:w="80"/>
-              <w:right w:type="dxa" w:w="100"/>
-            </w:tcMar>
-            <w:vAlign w:val="top"/>
-          </w:tcPr>
-          <w:p>
-            <w:pPr>
-              <w:spacing w:after="40" w:before="0"/>
-            </w:pPr>
-            <w:r>
-              <w:rPr>
-                <w:rFonts w:ascii="Calibri" w:cs="Calibri" w:eastAsia="Calibri" w:hAnsi="Calibri"/>
-                <w:b/>
-                <w:bCs/>
-                <w:color w:val="B0000A"/>
-                <w:sz w:val="18"/>
-                <w:szCs w:val="18"/>
-              </w:rPr>
-              <w:t xml:space="preserve">TBD (walkthrough)</w:t>
-            </w:r>
-          </w:p>
-        </w:tc>
-        <w:tc>
-          <w:tcPr>
-            <w:tcW w:type="dxa" w:w="2400"/>
-            <w:tcBorders>
-              <w:top w:val="single" w:color="D4D1CA" w:sz="4"/>
-              <w:left w:val="single" w:color="D4D1CA" w:sz="4"/>
-              <w:bottom w:val="single" w:color="D4D1CA" w:sz="4"/>
-              <w:right w:val="single" w:color="D4D1CA" w:sz="4"/>
-            </w:tcBorders>
-            <w:shd w:fill="F5F1EA" w:val="clear"/>
-            <w:tcMar>
-              <w:top w:type="dxa" w:w="80"/>
-              <w:left w:type="dxa" w:w="100"/>
-              <w:bottom w:type="dxa" w:w="80"/>
-              <w:right w:type="dxa" w:w="100"/>
-            </w:tcMar>
-            <w:vAlign w:val="top"/>
-          </w:tcPr>
-          <w:p>
-            <w:pPr>
-              <w:spacing w:after="40" w:before="0"/>
-            </w:pPr>
-            <w:r>
-              <w:rPr>
-                <w:rFonts w:ascii="Calibri" w:cs="Calibri" w:eastAsia="Calibri" w:hAnsi="Calibri"/>
                 <w:b/>
                 <w:bCs/>
                 <w:sz w:val="18"/>
@@ -1847,7 +1676,7 @@
               </w:rPr>
               <w:t xml:space="preserve">Walk-on: </w:t>
             </w:r>
-            <w:hyperlink w:history="1" r:id="rIdy76btka7jtdkd31icef28">
+            <w:hyperlink w:history="1" r:id="rIdhlevrqte1pg_jmxcwgojr">
               <w:r>
                 <w:rPr>
                   <w:rStyle w:val="Hyperlink"/>
@@ -1872,7 +1701,7 @@
         </w:tc>
         <w:tc>
           <w:tcPr>
-            <w:tcW w:type="dxa" w:w="2400"/>
+            <w:tcW w:type="dxa" w:w="2600"/>
             <w:tcBorders>
               <w:top w:val="single" w:color="D4D1CA" w:sz="4"/>
               <w:left w:val="single" w:color="D4D1CA" w:sz="4"/>
@@ -1906,7 +1735,7 @@
       <w:tr>
         <w:tc>
           <w:tcPr>
-            <w:tcW w:type="dxa" w:w="1200"/>
+            <w:tcW w:type="dxa" w:w="1300"/>
             <w:tcBorders>
               <w:top w:val="single" w:color="D4D1CA" w:sz="4"/>
               <w:left w:val="single" w:color="D4D1CA" w:sz="4"/>
@@ -1937,6 +1766,37 @@
         </w:tc>
         <w:tc>
           <w:tcPr>
+            <w:tcW w:type="dxa" w:w="2800"/>
+            <w:tcBorders>
+              <w:top w:val="single" w:color="D4D1CA" w:sz="4"/>
+              <w:left w:val="single" w:color="D4D1CA" w:sz="4"/>
+              <w:bottom w:val="single" w:color="D4D1CA" w:sz="4"/>
+              <w:right w:val="single" w:color="D4D1CA" w:sz="4"/>
+            </w:tcBorders>
+            <w:tcMar>
+              <w:top w:type="dxa" w:w="80"/>
+              <w:left w:type="dxa" w:w="100"/>
+              <w:bottom w:type="dxa" w:w="80"/>
+              <w:right w:type="dxa" w:w="100"/>
+            </w:tcMar>
+            <w:vAlign w:val="top"/>
+          </w:tcPr>
+          <w:p>
+            <w:pPr>
+              <w:spacing w:after="40" w:before="0"/>
+            </w:pPr>
+            <w:r>
+              <w:rPr>
+                <w:rFonts w:ascii="Calibri" w:cs="Calibri" w:eastAsia="Calibri" w:hAnsi="Calibri"/>
+                <w:sz w:val="18"/>
+                <w:szCs w:val="18"/>
+              </w:rPr>
+              <w:t xml:space="preserve">Break (15 min)</w:t>
+            </w:r>
+          </w:p>
+        </w:tc>
+        <w:tc>
+          <w:tcPr>
             <w:tcW w:type="dxa" w:w="2600"/>
             <w:tcBorders>
               <w:top w:val="single" w:color="D4D1CA" w:sz="4"/>
@@ -1959,16 +1819,26 @@
             <w:r>
               <w:rPr>
                 <w:rFonts w:ascii="Calibri" w:cs="Calibri" w:eastAsia="Calibri" w:hAnsi="Calibri"/>
-                <w:sz w:val="18"/>
-                <w:szCs w:val="18"/>
-              </w:rPr>
-              <w:t xml:space="preserve">Break (15 min)</w:t>
-            </w:r>
-          </w:p>
-        </w:tc>
-        <w:tc>
-          <w:tcPr>
-            <w:tcW w:type="dxa" w:w="1800"/>
+                <w:b/>
+                <w:bCs/>
+                <w:sz w:val="18"/>
+                <w:szCs w:val="18"/>
+              </w:rPr>
+              <w:t xml:space="preserve">Sponsors loop: </w:t>
+            </w:r>
+            <w:r>
+              <w:rPr>
+                <w:rFonts w:ascii="Calibri" w:cs="Calibri" w:eastAsia="Calibri" w:hAnsi="Calibri"/>
+                <w:sz w:val="18"/>
+                <w:szCs w:val="18"/>
+              </w:rPr>
+              <w:t xml:space="preserve">timer page (countdown to 10:55 with scrolling sponsor logos)</w:t>
+            </w:r>
+          </w:p>
+        </w:tc>
+        <w:tc>
+          <w:tcPr>
+            <w:tcW w:type="dxa" w:w="2500"/>
             <w:tcBorders>
               <w:top w:val="single" w:color="D4D1CA" w:sz="4"/>
               <w:left w:val="single" w:color="D4D1CA" w:sz="4"/>
@@ -2002,101 +1872,26 @@
         </w:tc>
         <w:tc>
           <w:tcPr>
-            <w:tcW w:type="dxa" w:w="2200"/>
-            <w:tcBorders>
-              <w:top w:val="single" w:color="D4D1CA" w:sz="4"/>
-              <w:left w:val="single" w:color="D4D1CA" w:sz="4"/>
-              <w:bottom w:val="single" w:color="D4D1CA" w:sz="4"/>
-              <w:right w:val="single" w:color="D4D1CA" w:sz="4"/>
-            </w:tcBorders>
-            <w:tcMar>
-              <w:top w:type="dxa" w:w="80"/>
-              <w:left w:type="dxa" w:w="100"/>
-              <w:bottom w:type="dxa" w:w="80"/>
-              <w:right w:type="dxa" w:w="100"/>
-            </w:tcMar>
-            <w:vAlign w:val="top"/>
-          </w:tcPr>
-          <w:p>
-            <w:pPr>
-              <w:spacing w:after="40" w:before="0"/>
-            </w:pPr>
-            <w:r>
-              <w:rPr>
-                <w:rFonts w:ascii="Calibri" w:cs="Calibri" w:eastAsia="Calibri" w:hAnsi="Calibri"/>
-                <w:b/>
-                <w:bCs/>
-                <w:sz w:val="18"/>
-                <w:szCs w:val="18"/>
-              </w:rPr>
-              <w:t xml:space="preserve">Sponsors loop: </w:t>
-            </w:r>
-            <w:r>
-              <w:rPr>
-                <w:rFonts w:ascii="Calibri" w:cs="Calibri" w:eastAsia="Calibri" w:hAnsi="Calibri"/>
-                <w:sz w:val="18"/>
-                <w:szCs w:val="18"/>
-              </w:rPr>
-              <w:t xml:space="preserve">timer page (countdown to 10:55 with scrolling sponsor logos)</w:t>
-            </w:r>
-          </w:p>
-        </w:tc>
-        <w:tc>
-          <w:tcPr>
-            <w:tcW w:type="dxa" w:w="1800"/>
-            <w:tcBorders>
-              <w:top w:val="single" w:color="D4D1CA" w:sz="4"/>
-              <w:left w:val="single" w:color="D4D1CA" w:sz="4"/>
-              <w:bottom w:val="single" w:color="D4D1CA" w:sz="4"/>
-              <w:right w:val="single" w:color="D4D1CA" w:sz="4"/>
-            </w:tcBorders>
-            <w:tcMar>
-              <w:top w:type="dxa" w:w="80"/>
-              <w:left w:type="dxa" w:w="100"/>
-              <w:bottom w:type="dxa" w:w="80"/>
-              <w:right w:type="dxa" w:w="100"/>
-            </w:tcMar>
-            <w:vAlign w:val="top"/>
-          </w:tcPr>
-          <w:p>
-            <w:pPr>
-              <w:spacing w:after="40" w:before="0"/>
-            </w:pPr>
-            <w:r>
-              <w:rPr>
-                <w:rFonts w:ascii="Calibri" w:cs="Calibri" w:eastAsia="Calibri" w:hAnsi="Calibri"/>
-                <w:b/>
-                <w:bCs/>
-                <w:color w:val="B0000A"/>
-                <w:sz w:val="18"/>
-                <w:szCs w:val="18"/>
-              </w:rPr>
-              <w:t xml:space="preserve">TBD (walkthrough)</w:t>
-            </w:r>
-          </w:p>
-        </w:tc>
-        <w:tc>
-          <w:tcPr>
-            <w:tcW w:type="dxa" w:w="2400"/>
-            <w:tcBorders>
-              <w:top w:val="single" w:color="D4D1CA" w:sz="4"/>
-              <w:left w:val="single" w:color="D4D1CA" w:sz="4"/>
-              <w:bottom w:val="single" w:color="D4D1CA" w:sz="4"/>
-              <w:right w:val="single" w:color="D4D1CA" w:sz="4"/>
-            </w:tcBorders>
-            <w:tcMar>
-              <w:top w:type="dxa" w:w="80"/>
-              <w:left w:type="dxa" w:w="100"/>
-              <w:bottom w:type="dxa" w:w="80"/>
-              <w:right w:type="dxa" w:w="100"/>
-            </w:tcMar>
-            <w:vAlign w:val="top"/>
-          </w:tcPr>
-          <w:p>
-            <w:pPr>
-              <w:spacing w:after="40" w:before="0"/>
-            </w:pPr>
-            <w:hyperlink w:history="1" r:id="rIdk4fbhe4i2ljbd1zol2mme">
+            <w:tcW w:type="dxa" w:w="2600"/>
+            <w:tcBorders>
+              <w:top w:val="single" w:color="D4D1CA" w:sz="4"/>
+              <w:left w:val="single" w:color="D4D1CA" w:sz="4"/>
+              <w:bottom w:val="single" w:color="D4D1CA" w:sz="4"/>
+              <w:right w:val="single" w:color="D4D1CA" w:sz="4"/>
+            </w:tcBorders>
+            <w:tcMar>
+              <w:top w:type="dxa" w:w="80"/>
+              <w:left w:type="dxa" w:w="100"/>
+              <w:bottom w:type="dxa" w:w="80"/>
+              <w:right w:type="dxa" w:w="100"/>
+            </w:tcMar>
+            <w:vAlign w:val="top"/>
+          </w:tcPr>
+          <w:p>
+            <w:pPr>
+              <w:spacing w:after="40" w:before="0"/>
+            </w:pPr>
+            <w:hyperlink w:history="1" r:id="rIdkzx1ayxfpoy3nwsi-x0ef">
               <w:r>
                 <w:rPr>
                   <w:rStyle w:val="Hyperlink"/>
@@ -2111,7 +1906,7 @@
         </w:tc>
         <w:tc>
           <w:tcPr>
-            <w:tcW w:type="dxa" w:w="2400"/>
+            <w:tcW w:type="dxa" w:w="2600"/>
             <w:tcBorders>
               <w:top w:val="single" w:color="D4D1CA" w:sz="4"/>
               <w:left w:val="single" w:color="D4D1CA" w:sz="4"/>
@@ -2166,7 +1961,7 @@
               </w:rPr>
               <w:t xml:space="preserve"> to exit Celebrations loop. One-click: </w:t>
             </w:r>
-            <w:hyperlink w:history="1" r:id="rIdc97tmb9h1g-codmaffb8k">
+            <w:hyperlink w:history="1" r:id="rIdmmogihiq2gt6xcrb8-lv1">
               <w:r>
                 <w:rPr>
                   <w:rStyle w:val="Hyperlink"/>
@@ -2191,7 +1986,7 @@
       <w:tr>
         <w:tc>
           <w:tcPr>
-            <w:tcW w:type="dxa" w:w="1200"/>
+            <w:tcW w:type="dxa" w:w="1300"/>
             <w:tcBorders>
               <w:top w:val="single" w:color="D4D1CA" w:sz="4"/>
               <w:left w:val="single" w:color="D4D1CA" w:sz="4"/>
@@ -2223,6 +2018,54 @@
         </w:tc>
         <w:tc>
           <w:tcPr>
+            <w:tcW w:type="dxa" w:w="2800"/>
+            <w:tcBorders>
+              <w:top w:val="single" w:color="D4D1CA" w:sz="4"/>
+              <w:left w:val="single" w:color="D4D1CA" w:sz="4"/>
+              <w:bottom w:val="single" w:color="D4D1CA" w:sz="4"/>
+              <w:right w:val="single" w:color="D4D1CA" w:sz="4"/>
+            </w:tcBorders>
+            <w:shd w:fill="F5F1EA" w:val="clear"/>
+            <w:tcMar>
+              <w:top w:type="dxa" w:w="80"/>
+              <w:left w:type="dxa" w:w="100"/>
+              <w:bottom w:type="dxa" w:w="80"/>
+              <w:right w:type="dxa" w:w="100"/>
+            </w:tcMar>
+            <w:vAlign w:val="top"/>
+          </w:tcPr>
+          <w:p>
+            <w:pPr>
+              <w:spacing w:after="40" w:before="0"/>
+            </w:pPr>
+            <w:r>
+              <w:rPr>
+                <w:rFonts w:ascii="Calibri" w:cs="Calibri" w:eastAsia="Calibri" w:hAnsi="Calibri"/>
+                <w:b/>
+                <w:bCs/>
+                <w:sz w:val="18"/>
+                <w:szCs w:val="18"/>
+              </w:rPr>
+              <w:t xml:space="preserve">Your Sales Team Isn't the Problem. Your System Is.</w:t>
+            </w:r>
+          </w:p>
+          <w:p>
+            <w:pPr>
+              <w:spacing w:after="40" w:before="0"/>
+            </w:pPr>
+            <w:r>
+              <w:rPr>
+                <w:rFonts w:ascii="Calibri" w:cs="Calibri" w:eastAsia="Calibri" w:hAnsi="Calibri"/>
+                <w:color w:val="7A7974"/>
+                <w:sz w:val="18"/>
+                <w:szCs w:val="18"/>
+              </w:rPr>
+              <w:t xml:space="preserve">Steve Heroux</w:t>
+            </w:r>
+          </w:p>
+        </w:tc>
+        <w:tc>
+          <w:tcPr>
             <w:tcW w:type="dxa" w:w="2600"/>
             <w:tcBorders>
               <w:top w:val="single" w:color="D4D1CA" w:sz="4"/>
@@ -2246,32 +2089,16 @@
             <w:r>
               <w:rPr>
                 <w:rFonts w:ascii="Calibri" w:cs="Calibri" w:eastAsia="Calibri" w:hAnsi="Calibri"/>
-                <w:b/>
-                <w:bCs/>
-                <w:sz w:val="18"/>
-                <w:szCs w:val="18"/>
-              </w:rPr>
-              <w:t xml:space="preserve">Your Sales Team Isn't the Problem. Your System Is.</w:t>
-            </w:r>
-          </w:p>
-          <w:p>
-            <w:pPr>
-              <w:spacing w:after="40" w:before="0"/>
-            </w:pPr>
-            <w:r>
-              <w:rPr>
-                <w:rFonts w:ascii="Calibri" w:cs="Calibri" w:eastAsia="Calibri" w:hAnsi="Calibri"/>
-                <w:color w:val="7A7974"/>
-                <w:sz w:val="18"/>
-                <w:szCs w:val="18"/>
-              </w:rPr>
-              <w:t xml:space="preserve">Steve Heroux</w:t>
-            </w:r>
-          </w:p>
-        </w:tc>
-        <w:tc>
-          <w:tcPr>
-            <w:tcW w:type="dxa" w:w="1800"/>
+                <w:sz w:val="18"/>
+                <w:szCs w:val="18"/>
+              </w:rPr>
+              <w:t xml:space="preserve">Steve's deck (in Speaker Decks/)</w:t>
+            </w:r>
+          </w:p>
+        </w:tc>
+        <w:tc>
+          <w:tcPr>
+            <w:tcW w:type="dxa" w:w="2500"/>
             <w:tcBorders>
               <w:top w:val="single" w:color="D4D1CA" w:sz="4"/>
               <w:left w:val="single" w:color="D4D1CA" w:sz="4"/>
@@ -2306,7 +2133,7 @@
         </w:tc>
         <w:tc>
           <w:tcPr>
-            <w:tcW w:type="dxa" w:w="2200"/>
+            <w:tcW w:type="dxa" w:w="2600"/>
             <w:tcBorders>
               <w:top w:val="single" w:color="D4D1CA" w:sz="4"/>
               <w:left w:val="single" w:color="D4D1CA" w:sz="4"/>
@@ -2329,73 +2156,6 @@
             <w:r>
               <w:rPr>
                 <w:rFonts w:ascii="Calibri" w:cs="Calibri" w:eastAsia="Calibri" w:hAnsi="Calibri"/>
-                <w:sz w:val="18"/>
-                <w:szCs w:val="18"/>
-              </w:rPr>
-              <w:t xml:space="preserve">Steve's deck (in Speaker Decks/)</w:t>
-            </w:r>
-          </w:p>
-        </w:tc>
-        <w:tc>
-          <w:tcPr>
-            <w:tcW w:type="dxa" w:w="1800"/>
-            <w:tcBorders>
-              <w:top w:val="single" w:color="D4D1CA" w:sz="4"/>
-              <w:left w:val="single" w:color="D4D1CA" w:sz="4"/>
-              <w:bottom w:val="single" w:color="D4D1CA" w:sz="4"/>
-              <w:right w:val="single" w:color="D4D1CA" w:sz="4"/>
-            </w:tcBorders>
-            <w:shd w:fill="F5F1EA" w:val="clear"/>
-            <w:tcMar>
-              <w:top w:type="dxa" w:w="80"/>
-              <w:left w:type="dxa" w:w="100"/>
-              <w:bottom w:type="dxa" w:w="80"/>
-              <w:right w:type="dxa" w:w="100"/>
-            </w:tcMar>
-            <w:vAlign w:val="top"/>
-          </w:tcPr>
-          <w:p>
-            <w:pPr>
-              <w:spacing w:after="40" w:before="0"/>
-            </w:pPr>
-            <w:r>
-              <w:rPr>
-                <w:rFonts w:ascii="Calibri" w:cs="Calibri" w:eastAsia="Calibri" w:hAnsi="Calibri"/>
-                <w:b/>
-                <w:bCs/>
-                <w:color w:val="B0000A"/>
-                <w:sz w:val="18"/>
-                <w:szCs w:val="18"/>
-              </w:rPr>
-              <w:t xml:space="preserve">TBD (walkthrough)</w:t>
-            </w:r>
-          </w:p>
-        </w:tc>
-        <w:tc>
-          <w:tcPr>
-            <w:tcW w:type="dxa" w:w="2400"/>
-            <w:tcBorders>
-              <w:top w:val="single" w:color="D4D1CA" w:sz="4"/>
-              <w:left w:val="single" w:color="D4D1CA" w:sz="4"/>
-              <w:bottom w:val="single" w:color="D4D1CA" w:sz="4"/>
-              <w:right w:val="single" w:color="D4D1CA" w:sz="4"/>
-            </w:tcBorders>
-            <w:shd w:fill="F5F1EA" w:val="clear"/>
-            <w:tcMar>
-              <w:top w:type="dxa" w:w="80"/>
-              <w:left w:type="dxa" w:w="100"/>
-              <w:bottom w:type="dxa" w:w="80"/>
-              <w:right w:type="dxa" w:w="100"/>
-            </w:tcMar>
-            <w:vAlign w:val="top"/>
-          </w:tcPr>
-          <w:p>
-            <w:pPr>
-              <w:spacing w:after="40" w:before="0"/>
-            </w:pPr>
-            <w:r>
-              <w:rPr>
-                <w:rFonts w:ascii="Calibri" w:cs="Calibri" w:eastAsia="Calibri" w:hAnsi="Calibri"/>
                 <w:b/>
                 <w:bCs/>
                 <w:sz w:val="18"/>
@@ -2403,7 +2163,7 @@
               </w:rPr>
               <w:t xml:space="preserve">Walk-on: </w:t>
             </w:r>
-            <w:hyperlink w:history="1" r:id="rIdx3l371ypbvdc0hw6uwo90">
+            <w:hyperlink w:history="1" r:id="rIdyhykvmqdmfdm5umtuuhsd">
               <w:r>
                 <w:rPr>
                   <w:rStyle w:val="Hyperlink"/>
@@ -2428,7 +2188,7 @@
         </w:tc>
         <w:tc>
           <w:tcPr>
-            <w:tcW w:type="dxa" w:w="2400"/>
+            <w:tcW w:type="dxa" w:w="2600"/>
             <w:tcBorders>
               <w:top w:val="single" w:color="D4D1CA" w:sz="4"/>
               <w:left w:val="single" w:color="D4D1CA" w:sz="4"/>
@@ -2462,7 +2222,7 @@
       <w:tr>
         <w:tc>
           <w:tcPr>
-            <w:tcW w:type="dxa" w:w="1200"/>
+            <w:tcW w:type="dxa" w:w="1300"/>
             <w:tcBorders>
               <w:top w:val="single" w:color="D4D1CA" w:sz="4"/>
               <w:left w:val="single" w:color="D4D1CA" w:sz="4"/>
@@ -2493,6 +2253,37 @@
         </w:tc>
         <w:tc>
           <w:tcPr>
+            <w:tcW w:type="dxa" w:w="2800"/>
+            <w:tcBorders>
+              <w:top w:val="single" w:color="D4D1CA" w:sz="4"/>
+              <w:left w:val="single" w:color="D4D1CA" w:sz="4"/>
+              <w:bottom w:val="single" w:color="D4D1CA" w:sz="4"/>
+              <w:right w:val="single" w:color="D4D1CA" w:sz="4"/>
+            </w:tcBorders>
+            <w:tcMar>
+              <w:top w:type="dxa" w:w="80"/>
+              <w:left w:type="dxa" w:w="100"/>
+              <w:bottom w:type="dxa" w:w="80"/>
+              <w:right w:type="dxa" w:w="100"/>
+            </w:tcMar>
+            <w:vAlign w:val="top"/>
+          </w:tcPr>
+          <w:p>
+            <w:pPr>
+              <w:spacing w:after="40" w:before="0"/>
+            </w:pPr>
+            <w:r>
+              <w:rPr>
+                <w:rFonts w:ascii="Calibri" w:cs="Calibri" w:eastAsia="Calibri" w:hAnsi="Calibri"/>
+                <w:sz w:val="18"/>
+                <w:szCs w:val="18"/>
+              </w:rPr>
+              <w:t xml:space="preserve">Emcee bridge to Lunch</w:t>
+            </w:r>
+          </w:p>
+        </w:tc>
+        <w:tc>
+          <w:tcPr>
             <w:tcW w:type="dxa" w:w="2600"/>
             <w:tcBorders>
               <w:top w:val="single" w:color="D4D1CA" w:sz="4"/>
@@ -2515,16 +2306,26 @@
             <w:r>
               <w:rPr>
                 <w:rFonts w:ascii="Calibri" w:cs="Calibri" w:eastAsia="Calibri" w:hAnsi="Calibri"/>
-                <w:sz w:val="18"/>
-                <w:szCs w:val="18"/>
-              </w:rPr>
-              <w:t xml:space="preserve">Emcee bridge to Lunch</w:t>
-            </w:r>
-          </w:p>
-        </w:tc>
-        <w:tc>
-          <w:tcPr>
-            <w:tcW w:type="dxa" w:w="1800"/>
+                <w:b/>
+                <w:bCs/>
+                <w:sz w:val="18"/>
+                <w:szCs w:val="18"/>
+              </w:rPr>
+              <w:t xml:space="preserve">Celebrations loop: </w:t>
+            </w:r>
+            <w:r>
+              <w:rPr>
+                <w:rFonts w:ascii="Calibri" w:cs="Calibri" w:eastAsia="Calibri" w:hAnsi="Calibri"/>
+                <w:sz w:val="18"/>
+                <w:szCs w:val="18"/>
+              </w:rPr>
+              <w:t xml:space="preserve">run Celebrations-Loop.pptx (F5, kiosk mode) — loops through the bridge until Walt takes the stage at 12:00</w:t>
+            </w:r>
+          </w:p>
+        </w:tc>
+        <w:tc>
+          <w:tcPr>
+            <w:tcW w:type="dxa" w:w="2500"/>
             <w:tcBorders>
               <w:top w:val="single" w:color="D4D1CA" w:sz="4"/>
               <w:left w:val="single" w:color="D4D1CA" w:sz="4"/>
@@ -2558,82 +2359,7 @@
         </w:tc>
         <w:tc>
           <w:tcPr>
-            <w:tcW w:type="dxa" w:w="2200"/>
-            <w:tcBorders>
-              <w:top w:val="single" w:color="D4D1CA" w:sz="4"/>
-              <w:left w:val="single" w:color="D4D1CA" w:sz="4"/>
-              <w:bottom w:val="single" w:color="D4D1CA" w:sz="4"/>
-              <w:right w:val="single" w:color="D4D1CA" w:sz="4"/>
-            </w:tcBorders>
-            <w:tcMar>
-              <w:top w:type="dxa" w:w="80"/>
-              <w:left w:type="dxa" w:w="100"/>
-              <w:bottom w:type="dxa" w:w="80"/>
-              <w:right w:type="dxa" w:w="100"/>
-            </w:tcMar>
-            <w:vAlign w:val="top"/>
-          </w:tcPr>
-          <w:p>
-            <w:pPr>
-              <w:spacing w:after="40" w:before="0"/>
-            </w:pPr>
-            <w:r>
-              <w:rPr>
-                <w:rFonts w:ascii="Calibri" w:cs="Calibri" w:eastAsia="Calibri" w:hAnsi="Calibri"/>
-                <w:b/>
-                <w:bCs/>
-                <w:sz w:val="18"/>
-                <w:szCs w:val="18"/>
-              </w:rPr>
-              <w:t xml:space="preserve">Celebrations loop: </w:t>
-            </w:r>
-            <w:r>
-              <w:rPr>
-                <w:rFonts w:ascii="Calibri" w:cs="Calibri" w:eastAsia="Calibri" w:hAnsi="Calibri"/>
-                <w:sz w:val="18"/>
-                <w:szCs w:val="18"/>
-              </w:rPr>
-              <w:t xml:space="preserve">run Celebrations-Loop.pptx (F5, kiosk mode) — loops through the bridge until Walt takes the stage at 12:00</w:t>
-            </w:r>
-          </w:p>
-        </w:tc>
-        <w:tc>
-          <w:tcPr>
-            <w:tcW w:type="dxa" w:w="1800"/>
-            <w:tcBorders>
-              <w:top w:val="single" w:color="D4D1CA" w:sz="4"/>
-              <w:left w:val="single" w:color="D4D1CA" w:sz="4"/>
-              <w:bottom w:val="single" w:color="D4D1CA" w:sz="4"/>
-              <w:right w:val="single" w:color="D4D1CA" w:sz="4"/>
-            </w:tcBorders>
-            <w:tcMar>
-              <w:top w:type="dxa" w:w="80"/>
-              <w:left w:type="dxa" w:w="100"/>
-              <w:bottom w:type="dxa" w:w="80"/>
-              <w:right w:type="dxa" w:w="100"/>
-            </w:tcMar>
-            <w:vAlign w:val="top"/>
-          </w:tcPr>
-          <w:p>
-            <w:pPr>
-              <w:spacing w:after="40" w:before="0"/>
-            </w:pPr>
-            <w:r>
-              <w:rPr>
-                <w:rFonts w:ascii="Calibri" w:cs="Calibri" w:eastAsia="Calibri" w:hAnsi="Calibri"/>
-                <w:b/>
-                <w:bCs/>
-                <w:color w:val="B0000A"/>
-                <w:sz w:val="18"/>
-                <w:szCs w:val="18"/>
-              </w:rPr>
-              <w:t xml:space="preserve">TBD (walkthrough)</w:t>
-            </w:r>
-          </w:p>
-        </w:tc>
-        <w:tc>
-          <w:tcPr>
-            <w:tcW w:type="dxa" w:w="2400"/>
+            <w:tcW w:type="dxa" w:w="2600"/>
             <w:tcBorders>
               <w:top w:val="single" w:color="D4D1CA" w:sz="4"/>
               <w:left w:val="single" w:color="D4D1CA" w:sz="4"/>
@@ -2662,7 +2388,7 @@
               </w:rPr>
               <w:t xml:space="preserve">Pre-Lunch: </w:t>
             </w:r>
-            <w:hyperlink w:history="1" r:id="rIdh6pykl7kwvqj_-e52ef7a">
+            <w:hyperlink w:history="1" r:id="rIdpscsh6bzilt_4ded7obqj">
               <w:r>
                 <w:rPr>
                   <w:rStyle w:val="Hyperlink"/>
@@ -2687,7 +2413,7 @@
         </w:tc>
         <w:tc>
           <w:tcPr>
-            <w:tcW w:type="dxa" w:w="2400"/>
+            <w:tcW w:type="dxa" w:w="2600"/>
             <w:tcBorders>
               <w:top w:val="single" w:color="D4D1CA" w:sz="4"/>
               <w:left w:val="single" w:color="D4D1CA" w:sz="4"/>
@@ -2766,7 +2492,7 @@
       <w:tr>
         <w:tc>
           <w:tcPr>
-            <w:gridSpan w:val="7"/>
+            <w:gridSpan w:val="6"/>
             <w:tcBorders>
               <w:top w:val="single" w:color="D4D1CA" w:sz="4"/>
               <w:left w:val="single" w:color="D4D1CA" w:sz="4"/>
@@ -2800,7 +2526,7 @@
       <w:tr>
         <w:tc>
           <w:tcPr>
-            <w:tcW w:type="dxa" w:w="1200"/>
+            <w:tcW w:type="dxa" w:w="1300"/>
             <w:tcBorders>
               <w:top w:val="single" w:color="D4D1CA" w:sz="4"/>
               <w:left w:val="single" w:color="D4D1CA" w:sz="4"/>
@@ -2832,6 +2558,54 @@
         </w:tc>
         <w:tc>
           <w:tcPr>
+            <w:tcW w:type="dxa" w:w="2800"/>
+            <w:tcBorders>
+              <w:top w:val="single" w:color="D4D1CA" w:sz="4"/>
+              <w:left w:val="single" w:color="D4D1CA" w:sz="4"/>
+              <w:bottom w:val="single" w:color="D4D1CA" w:sz="4"/>
+              <w:right w:val="single" w:color="D4D1CA" w:sz="4"/>
+            </w:tcBorders>
+            <w:shd w:fill="F5F1EA" w:val="clear"/>
+            <w:tcMar>
+              <w:top w:type="dxa" w:w="80"/>
+              <w:left w:type="dxa" w:w="100"/>
+              <w:bottom w:type="dxa" w:w="80"/>
+              <w:right w:type="dxa" w:w="100"/>
+            </w:tcMar>
+            <w:vAlign w:val="top"/>
+          </w:tcPr>
+          <w:p>
+            <w:pPr>
+              <w:spacing w:after="40" w:before="0"/>
+            </w:pPr>
+            <w:r>
+              <w:rPr>
+                <w:rFonts w:ascii="Calibri" w:cs="Calibri" w:eastAsia="Calibri" w:hAnsi="Calibri"/>
+                <w:b/>
+                <w:bCs/>
+                <w:sz w:val="18"/>
+                <w:szCs w:val="18"/>
+              </w:rPr>
+              <w:t xml:space="preserve">Lunch and Learn: Healthy Matters</w:t>
+            </w:r>
+          </w:p>
+          <w:p>
+            <w:pPr>
+              <w:spacing w:after="40" w:before="0"/>
+            </w:pPr>
+            <w:r>
+              <w:rPr>
+                <w:rFonts w:ascii="Calibri" w:cs="Calibri" w:eastAsia="Calibri" w:hAnsi="Calibri"/>
+                <w:color w:val="7A7974"/>
+                <w:sz w:val="18"/>
+                <w:szCs w:val="18"/>
+              </w:rPr>
+              <w:t xml:space="preserve">Walt Brown · 7 Critical Needs</w:t>
+            </w:r>
+          </w:p>
+        </w:tc>
+        <w:tc>
+          <w:tcPr>
             <w:tcW w:type="dxa" w:w="2600"/>
             <w:tcBorders>
               <w:top w:val="single" w:color="D4D1CA" w:sz="4"/>
@@ -2855,32 +2629,16 @@
             <w:r>
               <w:rPr>
                 <w:rFonts w:ascii="Calibri" w:cs="Calibri" w:eastAsia="Calibri" w:hAnsi="Calibri"/>
-                <w:b/>
-                <w:bCs/>
-                <w:sz w:val="18"/>
-                <w:szCs w:val="18"/>
-              </w:rPr>
-              <w:t xml:space="preserve">Lunch and Learn: Healthy Matters</w:t>
-            </w:r>
-          </w:p>
-          <w:p>
-            <w:pPr>
-              <w:spacing w:after="40" w:before="0"/>
-            </w:pPr>
-            <w:r>
-              <w:rPr>
-                <w:rFonts w:ascii="Calibri" w:cs="Calibri" w:eastAsia="Calibri" w:hAnsi="Calibri"/>
-                <w:color w:val="7A7974"/>
-                <w:sz w:val="18"/>
-                <w:szCs w:val="18"/>
-              </w:rPr>
-              <w:t xml:space="preserve">Walt Brown · 7 Critical Needs</w:t>
-            </w:r>
-          </w:p>
-        </w:tc>
-        <w:tc>
-          <w:tcPr>
-            <w:tcW w:type="dxa" w:w="1800"/>
+                <w:sz w:val="18"/>
+                <w:szCs w:val="18"/>
+              </w:rPr>
+              <w:t xml:space="preserve">Walt's deck (in Speaker Decks/)</w:t>
+            </w:r>
+          </w:p>
+        </w:tc>
+        <w:tc>
+          <w:tcPr>
+            <w:tcW w:type="dxa" w:w="2500"/>
             <w:tcBorders>
               <w:top w:val="single" w:color="D4D1CA" w:sz="4"/>
               <w:left w:val="single" w:color="D4D1CA" w:sz="4"/>
@@ -2915,7 +2673,7 @@
         </w:tc>
         <w:tc>
           <w:tcPr>
-            <w:tcW w:type="dxa" w:w="2200"/>
+            <w:tcW w:type="dxa" w:w="2600"/>
             <w:tcBorders>
               <w:top w:val="single" w:color="D4D1CA" w:sz="4"/>
               <w:left w:val="single" w:color="D4D1CA" w:sz="4"/>
@@ -2938,73 +2696,6 @@
             <w:r>
               <w:rPr>
                 <w:rFonts w:ascii="Calibri" w:cs="Calibri" w:eastAsia="Calibri" w:hAnsi="Calibri"/>
-                <w:sz w:val="18"/>
-                <w:szCs w:val="18"/>
-              </w:rPr>
-              <w:t xml:space="preserve">Walt's deck (in Speaker Decks/)</w:t>
-            </w:r>
-          </w:p>
-        </w:tc>
-        <w:tc>
-          <w:tcPr>
-            <w:tcW w:type="dxa" w:w="1800"/>
-            <w:tcBorders>
-              <w:top w:val="single" w:color="D4D1CA" w:sz="4"/>
-              <w:left w:val="single" w:color="D4D1CA" w:sz="4"/>
-              <w:bottom w:val="single" w:color="D4D1CA" w:sz="4"/>
-              <w:right w:val="single" w:color="D4D1CA" w:sz="4"/>
-            </w:tcBorders>
-            <w:shd w:fill="F5F1EA" w:val="clear"/>
-            <w:tcMar>
-              <w:top w:type="dxa" w:w="80"/>
-              <w:left w:type="dxa" w:w="100"/>
-              <w:bottom w:type="dxa" w:w="80"/>
-              <w:right w:type="dxa" w:w="100"/>
-            </w:tcMar>
-            <w:vAlign w:val="top"/>
-          </w:tcPr>
-          <w:p>
-            <w:pPr>
-              <w:spacing w:after="40" w:before="0"/>
-            </w:pPr>
-            <w:r>
-              <w:rPr>
-                <w:rFonts w:ascii="Calibri" w:cs="Calibri" w:eastAsia="Calibri" w:hAnsi="Calibri"/>
-                <w:b/>
-                <w:bCs/>
-                <w:color w:val="B0000A"/>
-                <w:sz w:val="18"/>
-                <w:szCs w:val="18"/>
-              </w:rPr>
-              <w:t xml:space="preserve">TBD (walkthrough)</w:t>
-            </w:r>
-          </w:p>
-        </w:tc>
-        <w:tc>
-          <w:tcPr>
-            <w:tcW w:type="dxa" w:w="2400"/>
-            <w:tcBorders>
-              <w:top w:val="single" w:color="D4D1CA" w:sz="4"/>
-              <w:left w:val="single" w:color="D4D1CA" w:sz="4"/>
-              <w:bottom w:val="single" w:color="D4D1CA" w:sz="4"/>
-              <w:right w:val="single" w:color="D4D1CA" w:sz="4"/>
-            </w:tcBorders>
-            <w:shd w:fill="F5F1EA" w:val="clear"/>
-            <w:tcMar>
-              <w:top w:type="dxa" w:w="80"/>
-              <w:left w:type="dxa" w:w="100"/>
-              <w:bottom w:type="dxa" w:w="80"/>
-              <w:right w:type="dxa" w:w="100"/>
-            </w:tcMar>
-            <w:vAlign w:val="top"/>
-          </w:tcPr>
-          <w:p>
-            <w:pPr>
-              <w:spacing w:after="40" w:before="0"/>
-            </w:pPr>
-            <w:r>
-              <w:rPr>
-                <w:rFonts w:ascii="Calibri" w:cs="Calibri" w:eastAsia="Calibri" w:hAnsi="Calibri"/>
                 <w:b/>
                 <w:bCs/>
                 <w:sz w:val="18"/>
@@ -3012,7 +2703,7 @@
               </w:rPr>
               <w:t xml:space="preserve">Walk-on: </w:t>
             </w:r>
-            <w:hyperlink w:history="1" r:id="rIdm4c_cfhhwsiceiarhnlnw">
+            <w:hyperlink w:history="1" r:id="rIdfqe76uygpoifyraurqisj">
               <w:r>
                 <w:rPr>
                   <w:rStyle w:val="Hyperlink"/>
@@ -3037,7 +2728,7 @@
         </w:tc>
         <w:tc>
           <w:tcPr>
-            <w:tcW w:type="dxa" w:w="2400"/>
+            <w:tcW w:type="dxa" w:w="2600"/>
             <w:tcBorders>
               <w:top w:val="single" w:color="D4D1CA" w:sz="4"/>
               <w:left w:val="single" w:color="D4D1CA" w:sz="4"/>
@@ -3107,7 +2798,7 @@
       <w:tr>
         <w:tc>
           <w:tcPr>
-            <w:tcW w:type="dxa" w:w="1200"/>
+            <w:tcW w:type="dxa" w:w="1300"/>
             <w:tcBorders>
               <w:top w:val="single" w:color="D4D1CA" w:sz="4"/>
               <w:left w:val="single" w:color="D4D1CA" w:sz="4"/>
@@ -3138,6 +2829,37 @@
         </w:tc>
         <w:tc>
           <w:tcPr>
+            <w:tcW w:type="dxa" w:w="2800"/>
+            <w:tcBorders>
+              <w:top w:val="single" w:color="D4D1CA" w:sz="4"/>
+              <w:left w:val="single" w:color="D4D1CA" w:sz="4"/>
+              <w:bottom w:val="single" w:color="D4D1CA" w:sz="4"/>
+              <w:right w:val="single" w:color="D4D1CA" w:sz="4"/>
+            </w:tcBorders>
+            <w:tcMar>
+              <w:top w:type="dxa" w:w="80"/>
+              <w:left w:type="dxa" w:w="100"/>
+              <w:bottom w:type="dxa" w:w="80"/>
+              <w:right w:type="dxa" w:w="100"/>
+            </w:tcMar>
+            <w:vAlign w:val="top"/>
+          </w:tcPr>
+          <w:p>
+            <w:pPr>
+              <w:spacing w:after="40" w:before="0"/>
+            </w:pPr>
+            <w:r>
+              <w:rPr>
+                <w:rFonts w:ascii="Calibri" w:cs="Calibri" w:eastAsia="Calibri" w:hAnsi="Calibri"/>
+                <w:sz w:val="18"/>
+                <w:szCs w:val="18"/>
+              </w:rPr>
+              <w:t xml:space="preserve">Break / Bridge (10 min)</w:t>
+            </w:r>
+          </w:p>
+        </w:tc>
+        <w:tc>
+          <w:tcPr>
             <w:tcW w:type="dxa" w:w="2600"/>
             <w:tcBorders>
               <w:top w:val="single" w:color="D4D1CA" w:sz="4"/>
@@ -3160,16 +2882,26 @@
             <w:r>
               <w:rPr>
                 <w:rFonts w:ascii="Calibri" w:cs="Calibri" w:eastAsia="Calibri" w:hAnsi="Calibri"/>
-                <w:sz w:val="18"/>
-                <w:szCs w:val="18"/>
-              </w:rPr>
-              <w:t xml:space="preserve">Break / Bridge (10 min)</w:t>
-            </w:r>
-          </w:p>
-        </w:tc>
-        <w:tc>
-          <w:tcPr>
-            <w:tcW w:type="dxa" w:w="1800"/>
+                <w:b/>
+                <w:bCs/>
+                <w:sz w:val="18"/>
+                <w:szCs w:val="18"/>
+              </w:rPr>
+              <w:t xml:space="preserve">Sponsors loop: </w:t>
+            </w:r>
+            <w:r>
+              <w:rPr>
+                <w:rFonts w:ascii="Calibri" w:cs="Calibri" w:eastAsia="Calibri" w:hAnsi="Calibri"/>
+                <w:sz w:val="18"/>
+                <w:szCs w:val="18"/>
+              </w:rPr>
+              <w:t xml:space="preserve">timer page (countdown to 1:10 with scrolling sponsor logos)</w:t>
+            </w:r>
+          </w:p>
+        </w:tc>
+        <w:tc>
+          <w:tcPr>
+            <w:tcW w:type="dxa" w:w="2500"/>
             <w:tcBorders>
               <w:top w:val="single" w:color="D4D1CA" w:sz="4"/>
               <w:left w:val="single" w:color="D4D1CA" w:sz="4"/>
@@ -3203,82 +2935,7 @@
         </w:tc>
         <w:tc>
           <w:tcPr>
-            <w:tcW w:type="dxa" w:w="2200"/>
-            <w:tcBorders>
-              <w:top w:val="single" w:color="D4D1CA" w:sz="4"/>
-              <w:left w:val="single" w:color="D4D1CA" w:sz="4"/>
-              <w:bottom w:val="single" w:color="D4D1CA" w:sz="4"/>
-              <w:right w:val="single" w:color="D4D1CA" w:sz="4"/>
-            </w:tcBorders>
-            <w:tcMar>
-              <w:top w:type="dxa" w:w="80"/>
-              <w:left w:type="dxa" w:w="100"/>
-              <w:bottom w:type="dxa" w:w="80"/>
-              <w:right w:type="dxa" w:w="100"/>
-            </w:tcMar>
-            <w:vAlign w:val="top"/>
-          </w:tcPr>
-          <w:p>
-            <w:pPr>
-              <w:spacing w:after="40" w:before="0"/>
-            </w:pPr>
-            <w:r>
-              <w:rPr>
-                <w:rFonts w:ascii="Calibri" w:cs="Calibri" w:eastAsia="Calibri" w:hAnsi="Calibri"/>
-                <w:b/>
-                <w:bCs/>
-                <w:sz w:val="18"/>
-                <w:szCs w:val="18"/>
-              </w:rPr>
-              <w:t xml:space="preserve">Sponsors loop: </w:t>
-            </w:r>
-            <w:r>
-              <w:rPr>
-                <w:rFonts w:ascii="Calibri" w:cs="Calibri" w:eastAsia="Calibri" w:hAnsi="Calibri"/>
-                <w:sz w:val="18"/>
-                <w:szCs w:val="18"/>
-              </w:rPr>
-              <w:t xml:space="preserve">timer page (countdown to 1:10 with scrolling sponsor logos)</w:t>
-            </w:r>
-          </w:p>
-        </w:tc>
-        <w:tc>
-          <w:tcPr>
-            <w:tcW w:type="dxa" w:w="1800"/>
-            <w:tcBorders>
-              <w:top w:val="single" w:color="D4D1CA" w:sz="4"/>
-              <w:left w:val="single" w:color="D4D1CA" w:sz="4"/>
-              <w:bottom w:val="single" w:color="D4D1CA" w:sz="4"/>
-              <w:right w:val="single" w:color="D4D1CA" w:sz="4"/>
-            </w:tcBorders>
-            <w:tcMar>
-              <w:top w:type="dxa" w:w="80"/>
-              <w:left w:type="dxa" w:w="100"/>
-              <w:bottom w:type="dxa" w:w="80"/>
-              <w:right w:type="dxa" w:w="100"/>
-            </w:tcMar>
-            <w:vAlign w:val="top"/>
-          </w:tcPr>
-          <w:p>
-            <w:pPr>
-              <w:spacing w:after="40" w:before="0"/>
-            </w:pPr>
-            <w:r>
-              <w:rPr>
-                <w:rFonts w:ascii="Calibri" w:cs="Calibri" w:eastAsia="Calibri" w:hAnsi="Calibri"/>
-                <w:b/>
-                <w:bCs/>
-                <w:color w:val="B0000A"/>
-                <w:sz w:val="18"/>
-                <w:szCs w:val="18"/>
-              </w:rPr>
-              <w:t xml:space="preserve">TBD (walkthrough)</w:t>
-            </w:r>
-          </w:p>
-        </w:tc>
-        <w:tc>
-          <w:tcPr>
-            <w:tcW w:type="dxa" w:w="2400"/>
+            <w:tcW w:type="dxa" w:w="2600"/>
             <w:tcBorders>
               <w:top w:val="single" w:color="D4D1CA" w:sz="4"/>
               <w:left w:val="single" w:color="D4D1CA" w:sz="4"/>
@@ -3307,7 +2964,7 @@
               </w:rPr>
               <w:t xml:space="preserve">Post-Lunch: </w:t>
             </w:r>
-            <w:hyperlink w:history="1" r:id="rIdt0yeg0xgczb5xi7sayua3">
+            <w:hyperlink w:history="1" r:id="rIdlj-tslhzjnrkg0fb2kkt8">
               <w:r>
                 <w:rPr>
                   <w:rStyle w:val="Hyperlink"/>
@@ -3328,7 +2985,7 @@
               </w:rPr>
               <w:t xml:space="preserve"> — Dolly Parton, then </w:t>
             </w:r>
-            <w:hyperlink w:history="1" r:id="rIdopbxepx0xpqi0zwa61-45">
+            <w:hyperlink w:history="1" r:id="rId7-jt00v9gf30gxjasrdm2">
               <w:r>
                 <w:rPr>
                   <w:rStyle w:val="Hyperlink"/>
@@ -3343,7 +3000,7 @@
         </w:tc>
         <w:tc>
           <w:tcPr>
-            <w:tcW w:type="dxa" w:w="2400"/>
+            <w:tcW w:type="dxa" w:w="2600"/>
             <w:tcBorders>
               <w:top w:val="single" w:color="D4D1CA" w:sz="4"/>
               <w:left w:val="single" w:color="D4D1CA" w:sz="4"/>
@@ -3398,7 +3055,7 @@
               </w:rPr>
               <w:t xml:space="preserve"> to exit lunch Celebrations loop. Play post-lunch song. One-click: </w:t>
             </w:r>
-            <w:hyperlink w:history="1" r:id="rId1vaql4wtwqbt_gfpnpdmr">
+            <w:hyperlink w:history="1" r:id="rIdoh8zuyohscuelemeewq2s">
               <w:r>
                 <w:rPr>
                   <w:rStyle w:val="Hyperlink"/>
@@ -3423,7 +3080,7 @@
       <w:tr>
         <w:tc>
           <w:tcPr>
-            <w:gridSpan w:val="7"/>
+            <w:gridSpan w:val="6"/>
             <w:tcBorders>
               <w:top w:val="single" w:color="D4D1CA" w:sz="4"/>
               <w:left w:val="single" w:color="D4D1CA" w:sz="4"/>
@@ -3457,7 +3114,7 @@
       <w:tr>
         <w:tc>
           <w:tcPr>
-            <w:tcW w:type="dxa" w:w="1200"/>
+            <w:tcW w:type="dxa" w:w="1300"/>
             <w:tcBorders>
               <w:top w:val="single" w:color="D4D1CA" w:sz="4"/>
               <w:left w:val="single" w:color="D4D1CA" w:sz="4"/>
@@ -3489,6 +3146,54 @@
         </w:tc>
         <w:tc>
           <w:tcPr>
+            <w:tcW w:type="dxa" w:w="2800"/>
+            <w:tcBorders>
+              <w:top w:val="single" w:color="D4D1CA" w:sz="4"/>
+              <w:left w:val="single" w:color="D4D1CA" w:sz="4"/>
+              <w:bottom w:val="single" w:color="D4D1CA" w:sz="4"/>
+              <w:right w:val="single" w:color="D4D1CA" w:sz="4"/>
+            </w:tcBorders>
+            <w:shd w:fill="F5F1EA" w:val="clear"/>
+            <w:tcMar>
+              <w:top w:type="dxa" w:w="80"/>
+              <w:left w:type="dxa" w:w="100"/>
+              <w:bottom w:type="dxa" w:w="80"/>
+              <w:right w:type="dxa" w:w="100"/>
+            </w:tcMar>
+            <w:vAlign w:val="top"/>
+          </w:tcPr>
+          <w:p>
+            <w:pPr>
+              <w:spacing w:after="40" w:before="0"/>
+            </w:pPr>
+            <w:r>
+              <w:rPr>
+                <w:rFonts w:ascii="Calibri" w:cs="Calibri" w:eastAsia="Calibri" w:hAnsi="Calibri"/>
+                <w:b/>
+                <w:bCs/>
+                <w:sz w:val="18"/>
+                <w:szCs w:val="18"/>
+              </w:rPr>
+              <w:t xml:space="preserve">Profit Power: Stronger — or Just Bigger?</w:t>
+            </w:r>
+          </w:p>
+          <w:p>
+            <w:pPr>
+              <w:spacing w:after="40" w:before="0"/>
+            </w:pPr>
+            <w:r>
+              <w:rPr>
+                <w:rFonts w:ascii="Calibri" w:cs="Calibri" w:eastAsia="Calibri" w:hAnsi="Calibri"/>
+                <w:color w:val="7A7974"/>
+                <w:sz w:val="18"/>
+                <w:szCs w:val="18"/>
+              </w:rPr>
+              <w:t xml:space="preserve">Mark Stanley</w:t>
+            </w:r>
+          </w:p>
+        </w:tc>
+        <w:tc>
+          <w:tcPr>
             <w:tcW w:type="dxa" w:w="2600"/>
             <w:tcBorders>
               <w:top w:val="single" w:color="D4D1CA" w:sz="4"/>
@@ -3512,32 +3217,16 @@
             <w:r>
               <w:rPr>
                 <w:rFonts w:ascii="Calibri" w:cs="Calibri" w:eastAsia="Calibri" w:hAnsi="Calibri"/>
-                <w:b/>
-                <w:bCs/>
-                <w:sz w:val="18"/>
-                <w:szCs w:val="18"/>
-              </w:rPr>
-              <w:t xml:space="preserve">Profit Power: Stronger — or Just Bigger?</w:t>
-            </w:r>
-          </w:p>
-          <w:p>
-            <w:pPr>
-              <w:spacing w:after="40" w:before="0"/>
-            </w:pPr>
-            <w:r>
-              <w:rPr>
-                <w:rFonts w:ascii="Calibri" w:cs="Calibri" w:eastAsia="Calibri" w:hAnsi="Calibri"/>
-                <w:color w:val="7A7974"/>
-                <w:sz w:val="18"/>
-                <w:szCs w:val="18"/>
-              </w:rPr>
-              <w:t xml:space="preserve">Mark Stanley</w:t>
-            </w:r>
-          </w:p>
-        </w:tc>
-        <w:tc>
-          <w:tcPr>
-            <w:tcW w:type="dxa" w:w="1800"/>
+                <w:sz w:val="18"/>
+                <w:szCs w:val="18"/>
+              </w:rPr>
+              <w:t xml:space="preserve">Mark's deck (in Speaker Decks/)</w:t>
+            </w:r>
+          </w:p>
+        </w:tc>
+        <w:tc>
+          <w:tcPr>
+            <w:tcW w:type="dxa" w:w="2500"/>
             <w:tcBorders>
               <w:top w:val="single" w:color="D4D1CA" w:sz="4"/>
               <w:left w:val="single" w:color="D4D1CA" w:sz="4"/>
@@ -3572,7 +3261,7 @@
         </w:tc>
         <w:tc>
           <w:tcPr>
-            <w:tcW w:type="dxa" w:w="2200"/>
+            <w:tcW w:type="dxa" w:w="2600"/>
             <w:tcBorders>
               <w:top w:val="single" w:color="D4D1CA" w:sz="4"/>
               <w:left w:val="single" w:color="D4D1CA" w:sz="4"/>
@@ -3595,73 +3284,6 @@
             <w:r>
               <w:rPr>
                 <w:rFonts w:ascii="Calibri" w:cs="Calibri" w:eastAsia="Calibri" w:hAnsi="Calibri"/>
-                <w:sz w:val="18"/>
-                <w:szCs w:val="18"/>
-              </w:rPr>
-              <w:t xml:space="preserve">Mark's deck (in Speaker Decks/)</w:t>
-            </w:r>
-          </w:p>
-        </w:tc>
-        <w:tc>
-          <w:tcPr>
-            <w:tcW w:type="dxa" w:w="1800"/>
-            <w:tcBorders>
-              <w:top w:val="single" w:color="D4D1CA" w:sz="4"/>
-              <w:left w:val="single" w:color="D4D1CA" w:sz="4"/>
-              <w:bottom w:val="single" w:color="D4D1CA" w:sz="4"/>
-              <w:right w:val="single" w:color="D4D1CA" w:sz="4"/>
-            </w:tcBorders>
-            <w:shd w:fill="F5F1EA" w:val="clear"/>
-            <w:tcMar>
-              <w:top w:type="dxa" w:w="80"/>
-              <w:left w:type="dxa" w:w="100"/>
-              <w:bottom w:type="dxa" w:w="80"/>
-              <w:right w:type="dxa" w:w="100"/>
-            </w:tcMar>
-            <w:vAlign w:val="top"/>
-          </w:tcPr>
-          <w:p>
-            <w:pPr>
-              <w:spacing w:after="40" w:before="0"/>
-            </w:pPr>
-            <w:r>
-              <w:rPr>
-                <w:rFonts w:ascii="Calibri" w:cs="Calibri" w:eastAsia="Calibri" w:hAnsi="Calibri"/>
-                <w:b/>
-                <w:bCs/>
-                <w:color w:val="B0000A"/>
-                <w:sz w:val="18"/>
-                <w:szCs w:val="18"/>
-              </w:rPr>
-              <w:t xml:space="preserve">TBD (walkthrough)</w:t>
-            </w:r>
-          </w:p>
-        </w:tc>
-        <w:tc>
-          <w:tcPr>
-            <w:tcW w:type="dxa" w:w="2400"/>
-            <w:tcBorders>
-              <w:top w:val="single" w:color="D4D1CA" w:sz="4"/>
-              <w:left w:val="single" w:color="D4D1CA" w:sz="4"/>
-              <w:bottom w:val="single" w:color="D4D1CA" w:sz="4"/>
-              <w:right w:val="single" w:color="D4D1CA" w:sz="4"/>
-            </w:tcBorders>
-            <w:shd w:fill="F5F1EA" w:val="clear"/>
-            <w:tcMar>
-              <w:top w:type="dxa" w:w="80"/>
-              <w:left w:type="dxa" w:w="100"/>
-              <w:bottom w:type="dxa" w:w="80"/>
-              <w:right w:type="dxa" w:w="100"/>
-            </w:tcMar>
-            <w:vAlign w:val="top"/>
-          </w:tcPr>
-          <w:p>
-            <w:pPr>
-              <w:spacing w:after="40" w:before="0"/>
-            </w:pPr>
-            <w:r>
-              <w:rPr>
-                <w:rFonts w:ascii="Calibri" w:cs="Calibri" w:eastAsia="Calibri" w:hAnsi="Calibri"/>
                 <w:b/>
                 <w:bCs/>
                 <w:sz w:val="18"/>
@@ -3669,7 +3291,7 @@
               </w:rPr>
               <w:t xml:space="preserve">Walk-on: </w:t>
             </w:r>
-            <w:hyperlink w:history="1" r:id="rIdot_-sbjzyczlnp1s7jedw">
+            <w:hyperlink w:history="1" r:id="rIdu19jqqituaqktyglwyavp">
               <w:r>
                 <w:rPr>
                   <w:rStyle w:val="Hyperlink"/>
@@ -3694,7 +3316,7 @@
         </w:tc>
         <w:tc>
           <w:tcPr>
-            <w:tcW w:type="dxa" w:w="2400"/>
+            <w:tcW w:type="dxa" w:w="2600"/>
             <w:tcBorders>
               <w:top w:val="single" w:color="D4D1CA" w:sz="4"/>
               <w:left w:val="single" w:color="D4D1CA" w:sz="4"/>
@@ -3746,7 +3368,7 @@
       <w:tr>
         <w:tc>
           <w:tcPr>
-            <w:tcW w:type="dxa" w:w="1200"/>
+            <w:tcW w:type="dxa" w:w="1300"/>
             <w:tcBorders>
               <w:top w:val="single" w:color="D4D1CA" w:sz="4"/>
               <w:left w:val="single" w:color="D4D1CA" w:sz="4"/>
@@ -3777,6 +3399,37 @@
         </w:tc>
         <w:tc>
           <w:tcPr>
+            <w:tcW w:type="dxa" w:w="2800"/>
+            <w:tcBorders>
+              <w:top w:val="single" w:color="D4D1CA" w:sz="4"/>
+              <w:left w:val="single" w:color="D4D1CA" w:sz="4"/>
+              <w:bottom w:val="single" w:color="D4D1CA" w:sz="4"/>
+              <w:right w:val="single" w:color="D4D1CA" w:sz="4"/>
+            </w:tcBorders>
+            <w:tcMar>
+              <w:top w:type="dxa" w:w="80"/>
+              <w:left w:type="dxa" w:w="100"/>
+              <w:bottom w:type="dxa" w:w="80"/>
+              <w:right w:type="dxa" w:w="100"/>
+            </w:tcMar>
+            <w:vAlign w:val="top"/>
+          </w:tcPr>
+          <w:p>
+            <w:pPr>
+              <w:spacing w:after="40" w:before="0"/>
+            </w:pPr>
+            <w:r>
+              <w:rPr>
+                <w:rFonts w:ascii="Calibri" w:cs="Calibri" w:eastAsia="Calibri" w:hAnsi="Calibri"/>
+                <w:sz w:val="18"/>
+                <w:szCs w:val="18"/>
+              </w:rPr>
+              <w:t xml:space="preserve">Afternoon Break (15 min)</w:t>
+            </w:r>
+          </w:p>
+        </w:tc>
+        <w:tc>
+          <w:tcPr>
             <w:tcW w:type="dxa" w:w="2600"/>
             <w:tcBorders>
               <w:top w:val="single" w:color="D4D1CA" w:sz="4"/>
@@ -3799,16 +3452,26 @@
             <w:r>
               <w:rPr>
                 <w:rFonts w:ascii="Calibri" w:cs="Calibri" w:eastAsia="Calibri" w:hAnsi="Calibri"/>
-                <w:sz w:val="18"/>
-                <w:szCs w:val="18"/>
-              </w:rPr>
-              <w:t xml:space="preserve">Afternoon Break (15 min)</w:t>
-            </w:r>
-          </w:p>
-        </w:tc>
-        <w:tc>
-          <w:tcPr>
-            <w:tcW w:type="dxa" w:w="1800"/>
+                <w:b/>
+                <w:bCs/>
+                <w:sz w:val="18"/>
+                <w:szCs w:val="18"/>
+              </w:rPr>
+              <w:t xml:space="preserve">Celebrations loop: </w:t>
+            </w:r>
+            <w:r>
+              <w:rPr>
+                <w:rFonts w:ascii="Calibri" w:cs="Calibri" w:eastAsia="Calibri" w:hAnsi="Calibri"/>
+                <w:sz w:val="18"/>
+                <w:szCs w:val="18"/>
+              </w:rPr>
+              <w:t xml:space="preserve">run Celebrations-Loop.pptx (F5, kiosk mode)</w:t>
+            </w:r>
+          </w:p>
+        </w:tc>
+        <w:tc>
+          <w:tcPr>
+            <w:tcW w:type="dxa" w:w="2500"/>
             <w:tcBorders>
               <w:top w:val="single" w:color="D4D1CA" w:sz="4"/>
               <w:left w:val="single" w:color="D4D1CA" w:sz="4"/>
@@ -3842,101 +3505,26 @@
         </w:tc>
         <w:tc>
           <w:tcPr>
-            <w:tcW w:type="dxa" w:w="2200"/>
-            <w:tcBorders>
-              <w:top w:val="single" w:color="D4D1CA" w:sz="4"/>
-              <w:left w:val="single" w:color="D4D1CA" w:sz="4"/>
-              <w:bottom w:val="single" w:color="D4D1CA" w:sz="4"/>
-              <w:right w:val="single" w:color="D4D1CA" w:sz="4"/>
-            </w:tcBorders>
-            <w:tcMar>
-              <w:top w:type="dxa" w:w="80"/>
-              <w:left w:type="dxa" w:w="100"/>
-              <w:bottom w:type="dxa" w:w="80"/>
-              <w:right w:type="dxa" w:w="100"/>
-            </w:tcMar>
-            <w:vAlign w:val="top"/>
-          </w:tcPr>
-          <w:p>
-            <w:pPr>
-              <w:spacing w:after="40" w:before="0"/>
-            </w:pPr>
-            <w:r>
-              <w:rPr>
-                <w:rFonts w:ascii="Calibri" w:cs="Calibri" w:eastAsia="Calibri" w:hAnsi="Calibri"/>
-                <w:b/>
-                <w:bCs/>
-                <w:sz w:val="18"/>
-                <w:szCs w:val="18"/>
-              </w:rPr>
-              <w:t xml:space="preserve">Celebrations loop: </w:t>
-            </w:r>
-            <w:r>
-              <w:rPr>
-                <w:rFonts w:ascii="Calibri" w:cs="Calibri" w:eastAsia="Calibri" w:hAnsi="Calibri"/>
-                <w:sz w:val="18"/>
-                <w:szCs w:val="18"/>
-              </w:rPr>
-              <w:t xml:space="preserve">run Celebrations-Loop.pptx (F5, kiosk mode)</w:t>
-            </w:r>
-          </w:p>
-        </w:tc>
-        <w:tc>
-          <w:tcPr>
-            <w:tcW w:type="dxa" w:w="1800"/>
-            <w:tcBorders>
-              <w:top w:val="single" w:color="D4D1CA" w:sz="4"/>
-              <w:left w:val="single" w:color="D4D1CA" w:sz="4"/>
-              <w:bottom w:val="single" w:color="D4D1CA" w:sz="4"/>
-              <w:right w:val="single" w:color="D4D1CA" w:sz="4"/>
-            </w:tcBorders>
-            <w:tcMar>
-              <w:top w:type="dxa" w:w="80"/>
-              <w:left w:type="dxa" w:w="100"/>
-              <w:bottom w:type="dxa" w:w="80"/>
-              <w:right w:type="dxa" w:w="100"/>
-            </w:tcMar>
-            <w:vAlign w:val="top"/>
-          </w:tcPr>
-          <w:p>
-            <w:pPr>
-              <w:spacing w:after="40" w:before="0"/>
-            </w:pPr>
-            <w:r>
-              <w:rPr>
-                <w:rFonts w:ascii="Calibri" w:cs="Calibri" w:eastAsia="Calibri" w:hAnsi="Calibri"/>
-                <w:b/>
-                <w:bCs/>
-                <w:color w:val="B0000A"/>
-                <w:sz w:val="18"/>
-                <w:szCs w:val="18"/>
-              </w:rPr>
-              <w:t xml:space="preserve">TBD (walkthrough)</w:t>
-            </w:r>
-          </w:p>
-        </w:tc>
-        <w:tc>
-          <w:tcPr>
-            <w:tcW w:type="dxa" w:w="2400"/>
-            <w:tcBorders>
-              <w:top w:val="single" w:color="D4D1CA" w:sz="4"/>
-              <w:left w:val="single" w:color="D4D1CA" w:sz="4"/>
-              <w:bottom w:val="single" w:color="D4D1CA" w:sz="4"/>
-              <w:right w:val="single" w:color="D4D1CA" w:sz="4"/>
-            </w:tcBorders>
-            <w:tcMar>
-              <w:top w:type="dxa" w:w="80"/>
-              <w:left w:type="dxa" w:w="100"/>
-              <w:bottom w:type="dxa" w:w="80"/>
-              <w:right w:type="dxa" w:w="100"/>
-            </w:tcMar>
-            <w:vAlign w:val="top"/>
-          </w:tcPr>
-          <w:p>
-            <w:pPr>
-              <w:spacing w:after="40" w:before="0"/>
-            </w:pPr>
-            <w:hyperlink w:history="1" r:id="rIdp8_dvklz1jq5-_fyc7g5p">
+            <w:tcW w:type="dxa" w:w="2600"/>
+            <w:tcBorders>
+              <w:top w:val="single" w:color="D4D1CA" w:sz="4"/>
+              <w:left w:val="single" w:color="D4D1CA" w:sz="4"/>
+              <w:bottom w:val="single" w:color="D4D1CA" w:sz="4"/>
+              <w:right w:val="single" w:color="D4D1CA" w:sz="4"/>
+            </w:tcBorders>
+            <w:tcMar>
+              <w:top w:type="dxa" w:w="80"/>
+              <w:left w:type="dxa" w:w="100"/>
+              <w:bottom w:type="dxa" w:w="80"/>
+              <w:right w:type="dxa" w:w="100"/>
+            </w:tcMar>
+            <w:vAlign w:val="top"/>
+          </w:tcPr>
+          <w:p>
+            <w:pPr>
+              <w:spacing w:after="40" w:before="0"/>
+            </w:pPr>
+            <w:hyperlink w:history="1" r:id="rId0o9hq67j7jmdz-bpewn-b">
               <w:r>
                 <w:rPr>
                   <w:rStyle w:val="Hyperlink"/>
@@ -3951,7 +3539,7 @@
         </w:tc>
         <w:tc>
           <w:tcPr>
-            <w:tcW w:type="dxa" w:w="2400"/>
+            <w:tcW w:type="dxa" w:w="2600"/>
             <w:tcBorders>
               <w:top w:val="single" w:color="D4D1CA" w:sz="4"/>
               <w:left w:val="single" w:color="D4D1CA" w:sz="4"/>
@@ -4048,7 +3636,7 @@
       <w:tr>
         <w:tc>
           <w:tcPr>
-            <w:tcW w:type="dxa" w:w="1200"/>
+            <w:tcW w:type="dxa" w:w="1300"/>
             <w:tcBorders>
               <w:top w:val="single" w:color="D4D1CA" w:sz="4"/>
               <w:left w:val="single" w:color="D4D1CA" w:sz="4"/>
@@ -4080,6 +3668,54 @@
         </w:tc>
         <w:tc>
           <w:tcPr>
+            <w:tcW w:type="dxa" w:w="2800"/>
+            <w:tcBorders>
+              <w:top w:val="single" w:color="D4D1CA" w:sz="4"/>
+              <w:left w:val="single" w:color="D4D1CA" w:sz="4"/>
+              <w:bottom w:val="single" w:color="D4D1CA" w:sz="4"/>
+              <w:right w:val="single" w:color="D4D1CA" w:sz="4"/>
+            </w:tcBorders>
+            <w:shd w:fill="F5F1EA" w:val="clear"/>
+            <w:tcMar>
+              <w:top w:type="dxa" w:w="80"/>
+              <w:left w:type="dxa" w:w="100"/>
+              <w:bottom w:type="dxa" w:w="80"/>
+              <w:right w:type="dxa" w:w="100"/>
+            </w:tcMar>
+            <w:vAlign w:val="top"/>
+          </w:tcPr>
+          <w:p>
+            <w:pPr>
+              <w:spacing w:after="40" w:before="0"/>
+            </w:pPr>
+            <w:r>
+              <w:rPr>
+                <w:rFonts w:ascii="Calibri" w:cs="Calibri" w:eastAsia="Calibri" w:hAnsi="Calibri"/>
+                <w:b/>
+                <w:bCs/>
+                <w:sz w:val="18"/>
+                <w:szCs w:val="18"/>
+              </w:rPr>
+              <w:t xml:space="preserve">Rollout, Reworked: Running EOS Company-Wide</w:t>
+            </w:r>
+          </w:p>
+          <w:p>
+            <w:pPr>
+              <w:spacing w:after="40" w:before="0"/>
+            </w:pPr>
+            <w:r>
+              <w:rPr>
+                <w:rFonts w:ascii="Calibri" w:cs="Calibri" w:eastAsia="Calibri" w:hAnsi="Calibri"/>
+                <w:color w:val="7A7974"/>
+                <w:sz w:val="18"/>
+                <w:szCs w:val="18"/>
+              </w:rPr>
+              <w:t xml:space="preserve">Beth Fahey</w:t>
+            </w:r>
+          </w:p>
+        </w:tc>
+        <w:tc>
+          <w:tcPr>
             <w:tcW w:type="dxa" w:w="2600"/>
             <w:tcBorders>
               <w:top w:val="single" w:color="D4D1CA" w:sz="4"/>
@@ -4103,32 +3739,16 @@
             <w:r>
               <w:rPr>
                 <w:rFonts w:ascii="Calibri" w:cs="Calibri" w:eastAsia="Calibri" w:hAnsi="Calibri"/>
-                <w:b/>
-                <w:bCs/>
-                <w:sz w:val="18"/>
-                <w:szCs w:val="18"/>
-              </w:rPr>
-              <w:t xml:space="preserve">Rollout, Reworked: Running EOS Company-Wide</w:t>
-            </w:r>
-          </w:p>
-          <w:p>
-            <w:pPr>
-              <w:spacing w:after="40" w:before="0"/>
-            </w:pPr>
-            <w:r>
-              <w:rPr>
-                <w:rFonts w:ascii="Calibri" w:cs="Calibri" w:eastAsia="Calibri" w:hAnsi="Calibri"/>
-                <w:color w:val="7A7974"/>
-                <w:sz w:val="18"/>
-                <w:szCs w:val="18"/>
-              </w:rPr>
-              <w:t xml:space="preserve">Beth Fahey</w:t>
-            </w:r>
-          </w:p>
-        </w:tc>
-        <w:tc>
-          <w:tcPr>
-            <w:tcW w:type="dxa" w:w="1800"/>
+                <w:sz w:val="18"/>
+                <w:szCs w:val="18"/>
+              </w:rPr>
+              <w:t xml:space="preserve">Beth's deck (in Speaker Decks/)</w:t>
+            </w:r>
+          </w:p>
+        </w:tc>
+        <w:tc>
+          <w:tcPr>
+            <w:tcW w:type="dxa" w:w="2500"/>
             <w:tcBorders>
               <w:top w:val="single" w:color="D4D1CA" w:sz="4"/>
               <w:left w:val="single" w:color="D4D1CA" w:sz="4"/>
@@ -4163,7 +3783,7 @@
         </w:tc>
         <w:tc>
           <w:tcPr>
-            <w:tcW w:type="dxa" w:w="2200"/>
+            <w:tcW w:type="dxa" w:w="2600"/>
             <w:tcBorders>
               <w:top w:val="single" w:color="D4D1CA" w:sz="4"/>
               <w:left w:val="single" w:color="D4D1CA" w:sz="4"/>
@@ -4186,73 +3806,6 @@
             <w:r>
               <w:rPr>
                 <w:rFonts w:ascii="Calibri" w:cs="Calibri" w:eastAsia="Calibri" w:hAnsi="Calibri"/>
-                <w:sz w:val="18"/>
-                <w:szCs w:val="18"/>
-              </w:rPr>
-              <w:t xml:space="preserve">Beth's deck (in Speaker Decks/)</w:t>
-            </w:r>
-          </w:p>
-        </w:tc>
-        <w:tc>
-          <w:tcPr>
-            <w:tcW w:type="dxa" w:w="1800"/>
-            <w:tcBorders>
-              <w:top w:val="single" w:color="D4D1CA" w:sz="4"/>
-              <w:left w:val="single" w:color="D4D1CA" w:sz="4"/>
-              <w:bottom w:val="single" w:color="D4D1CA" w:sz="4"/>
-              <w:right w:val="single" w:color="D4D1CA" w:sz="4"/>
-            </w:tcBorders>
-            <w:shd w:fill="F5F1EA" w:val="clear"/>
-            <w:tcMar>
-              <w:top w:type="dxa" w:w="80"/>
-              <w:left w:type="dxa" w:w="100"/>
-              <w:bottom w:type="dxa" w:w="80"/>
-              <w:right w:type="dxa" w:w="100"/>
-            </w:tcMar>
-            <w:vAlign w:val="top"/>
-          </w:tcPr>
-          <w:p>
-            <w:pPr>
-              <w:spacing w:after="40" w:before="0"/>
-            </w:pPr>
-            <w:r>
-              <w:rPr>
-                <w:rFonts w:ascii="Calibri" w:cs="Calibri" w:eastAsia="Calibri" w:hAnsi="Calibri"/>
-                <w:b/>
-                <w:bCs/>
-                <w:color w:val="B0000A"/>
-                <w:sz w:val="18"/>
-                <w:szCs w:val="18"/>
-              </w:rPr>
-              <w:t xml:space="preserve">TBD (walkthrough)</w:t>
-            </w:r>
-          </w:p>
-        </w:tc>
-        <w:tc>
-          <w:tcPr>
-            <w:tcW w:type="dxa" w:w="2400"/>
-            <w:tcBorders>
-              <w:top w:val="single" w:color="D4D1CA" w:sz="4"/>
-              <w:left w:val="single" w:color="D4D1CA" w:sz="4"/>
-              <w:bottom w:val="single" w:color="D4D1CA" w:sz="4"/>
-              <w:right w:val="single" w:color="D4D1CA" w:sz="4"/>
-            </w:tcBorders>
-            <w:shd w:fill="F5F1EA" w:val="clear"/>
-            <w:tcMar>
-              <w:top w:type="dxa" w:w="80"/>
-              <w:left w:type="dxa" w:w="100"/>
-              <w:bottom w:type="dxa" w:w="80"/>
-              <w:right w:type="dxa" w:w="100"/>
-            </w:tcMar>
-            <w:vAlign w:val="top"/>
-          </w:tcPr>
-          <w:p>
-            <w:pPr>
-              <w:spacing w:after="40" w:before="0"/>
-            </w:pPr>
-            <w:r>
-              <w:rPr>
-                <w:rFonts w:ascii="Calibri" w:cs="Calibri" w:eastAsia="Calibri" w:hAnsi="Calibri"/>
                 <w:b/>
                 <w:bCs/>
                 <w:sz w:val="18"/>
@@ -4260,7 +3813,7 @@
               </w:rPr>
               <w:t xml:space="preserve">Walk-on: </w:t>
             </w:r>
-            <w:hyperlink w:history="1" r:id="rIdt94okvofcetpyfxlrai05">
+            <w:hyperlink w:history="1" r:id="rIdvkfw9nueepjmj3elbgirw">
               <w:r>
                 <w:rPr>
                   <w:rStyle w:val="Hyperlink"/>
@@ -4285,7 +3838,7 @@
         </w:tc>
         <w:tc>
           <w:tcPr>
-            <w:tcW w:type="dxa" w:w="2400"/>
+            <w:tcW w:type="dxa" w:w="2600"/>
             <w:tcBorders>
               <w:top w:val="single" w:color="D4D1CA" w:sz="4"/>
               <w:left w:val="single" w:color="D4D1CA" w:sz="4"/>
@@ -4337,7 +3890,7 @@
       <w:tr>
         <w:tc>
           <w:tcPr>
-            <w:tcW w:type="dxa" w:w="1200"/>
+            <w:tcW w:type="dxa" w:w="1300"/>
             <w:tcBorders>
               <w:top w:val="single" w:color="D4D1CA" w:sz="4"/>
               <w:left w:val="single" w:color="D4D1CA" w:sz="4"/>
@@ -4368,6 +3921,37 @@
         </w:tc>
         <w:tc>
           <w:tcPr>
+            <w:tcW w:type="dxa" w:w="2800"/>
+            <w:tcBorders>
+              <w:top w:val="single" w:color="D4D1CA" w:sz="4"/>
+              <w:left w:val="single" w:color="D4D1CA" w:sz="4"/>
+              <w:bottom w:val="single" w:color="D4D1CA" w:sz="4"/>
+              <w:right w:val="single" w:color="D4D1CA" w:sz="4"/>
+            </w:tcBorders>
+            <w:tcMar>
+              <w:top w:type="dxa" w:w="80"/>
+              <w:left w:type="dxa" w:w="100"/>
+              <w:bottom w:type="dxa" w:w="80"/>
+              <w:right w:type="dxa" w:w="100"/>
+            </w:tcMar>
+            <w:vAlign w:val="top"/>
+          </w:tcPr>
+          <w:p>
+            <w:pPr>
+              <w:spacing w:after="40" w:before="0"/>
+            </w:pPr>
+            <w:r>
+              <w:rPr>
+                <w:rFonts w:ascii="Calibri" w:cs="Calibri" w:eastAsia="Calibri" w:hAnsi="Calibri"/>
+                <w:sz w:val="18"/>
+                <w:szCs w:val="18"/>
+              </w:rPr>
+              <w:t xml:space="preserve">Final Break (20 min)</w:t>
+            </w:r>
+          </w:p>
+        </w:tc>
+        <w:tc>
+          <w:tcPr>
             <w:tcW w:type="dxa" w:w="2600"/>
             <w:tcBorders>
               <w:top w:val="single" w:color="D4D1CA" w:sz="4"/>
@@ -4390,16 +3974,26 @@
             <w:r>
               <w:rPr>
                 <w:rFonts w:ascii="Calibri" w:cs="Calibri" w:eastAsia="Calibri" w:hAnsi="Calibri"/>
-                <w:sz w:val="18"/>
-                <w:szCs w:val="18"/>
-              </w:rPr>
-              <w:t xml:space="preserve">Final Break (20 min)</w:t>
-            </w:r>
-          </w:p>
-        </w:tc>
-        <w:tc>
-          <w:tcPr>
-            <w:tcW w:type="dxa" w:w="1800"/>
+                <w:b/>
+                <w:bCs/>
+                <w:sz w:val="18"/>
+                <w:szCs w:val="18"/>
+              </w:rPr>
+              <w:t xml:space="preserve">Sponsors loop: </w:t>
+            </w:r>
+            <w:r>
+              <w:rPr>
+                <w:rFonts w:ascii="Calibri" w:cs="Calibri" w:eastAsia="Calibri" w:hAnsi="Calibri"/>
+                <w:sz w:val="18"/>
+                <w:szCs w:val="18"/>
+              </w:rPr>
+              <w:t xml:space="preserve">timer page (countdown to 4:45 with scrolling sponsor logos)</w:t>
+            </w:r>
+          </w:p>
+        </w:tc>
+        <w:tc>
+          <w:tcPr>
+            <w:tcW w:type="dxa" w:w="2500"/>
             <w:tcBorders>
               <w:top w:val="single" w:color="D4D1CA" w:sz="4"/>
               <w:left w:val="single" w:color="D4D1CA" w:sz="4"/>
@@ -4433,101 +4027,26 @@
         </w:tc>
         <w:tc>
           <w:tcPr>
-            <w:tcW w:type="dxa" w:w="2200"/>
-            <w:tcBorders>
-              <w:top w:val="single" w:color="D4D1CA" w:sz="4"/>
-              <w:left w:val="single" w:color="D4D1CA" w:sz="4"/>
-              <w:bottom w:val="single" w:color="D4D1CA" w:sz="4"/>
-              <w:right w:val="single" w:color="D4D1CA" w:sz="4"/>
-            </w:tcBorders>
-            <w:tcMar>
-              <w:top w:type="dxa" w:w="80"/>
-              <w:left w:type="dxa" w:w="100"/>
-              <w:bottom w:type="dxa" w:w="80"/>
-              <w:right w:type="dxa" w:w="100"/>
-            </w:tcMar>
-            <w:vAlign w:val="top"/>
-          </w:tcPr>
-          <w:p>
-            <w:pPr>
-              <w:spacing w:after="40" w:before="0"/>
-            </w:pPr>
-            <w:r>
-              <w:rPr>
-                <w:rFonts w:ascii="Calibri" w:cs="Calibri" w:eastAsia="Calibri" w:hAnsi="Calibri"/>
-                <w:b/>
-                <w:bCs/>
-                <w:sz w:val="18"/>
-                <w:szCs w:val="18"/>
-              </w:rPr>
-              <w:t xml:space="preserve">Sponsors loop: </w:t>
-            </w:r>
-            <w:r>
-              <w:rPr>
-                <w:rFonts w:ascii="Calibri" w:cs="Calibri" w:eastAsia="Calibri" w:hAnsi="Calibri"/>
-                <w:sz w:val="18"/>
-                <w:szCs w:val="18"/>
-              </w:rPr>
-              <w:t xml:space="preserve">timer page (countdown to 4:45 with scrolling sponsor logos)</w:t>
-            </w:r>
-          </w:p>
-        </w:tc>
-        <w:tc>
-          <w:tcPr>
-            <w:tcW w:type="dxa" w:w="1800"/>
-            <w:tcBorders>
-              <w:top w:val="single" w:color="D4D1CA" w:sz="4"/>
-              <w:left w:val="single" w:color="D4D1CA" w:sz="4"/>
-              <w:bottom w:val="single" w:color="D4D1CA" w:sz="4"/>
-              <w:right w:val="single" w:color="D4D1CA" w:sz="4"/>
-            </w:tcBorders>
-            <w:tcMar>
-              <w:top w:type="dxa" w:w="80"/>
-              <w:left w:type="dxa" w:w="100"/>
-              <w:bottom w:type="dxa" w:w="80"/>
-              <w:right w:type="dxa" w:w="100"/>
-            </w:tcMar>
-            <w:vAlign w:val="top"/>
-          </w:tcPr>
-          <w:p>
-            <w:pPr>
-              <w:spacing w:after="40" w:before="0"/>
-            </w:pPr>
-            <w:r>
-              <w:rPr>
-                <w:rFonts w:ascii="Calibri" w:cs="Calibri" w:eastAsia="Calibri" w:hAnsi="Calibri"/>
-                <w:b/>
-                <w:bCs/>
-                <w:color w:val="B0000A"/>
-                <w:sz w:val="18"/>
-                <w:szCs w:val="18"/>
-              </w:rPr>
-              <w:t xml:space="preserve">TBD (walkthrough)</w:t>
-            </w:r>
-          </w:p>
-        </w:tc>
-        <w:tc>
-          <w:tcPr>
-            <w:tcW w:type="dxa" w:w="2400"/>
-            <w:tcBorders>
-              <w:top w:val="single" w:color="D4D1CA" w:sz="4"/>
-              <w:left w:val="single" w:color="D4D1CA" w:sz="4"/>
-              <w:bottom w:val="single" w:color="D4D1CA" w:sz="4"/>
-              <w:right w:val="single" w:color="D4D1CA" w:sz="4"/>
-            </w:tcBorders>
-            <w:tcMar>
-              <w:top w:type="dxa" w:w="80"/>
-              <w:left w:type="dxa" w:w="100"/>
-              <w:bottom w:type="dxa" w:w="80"/>
-              <w:right w:type="dxa" w:w="100"/>
-            </w:tcMar>
-            <w:vAlign w:val="top"/>
-          </w:tcPr>
-          <w:p>
-            <w:pPr>
-              <w:spacing w:after="40" w:before="0"/>
-            </w:pPr>
-            <w:hyperlink w:history="1" r:id="rIdpq4ngcv_jj_urmui6u9_e">
+            <w:tcW w:type="dxa" w:w="2600"/>
+            <w:tcBorders>
+              <w:top w:val="single" w:color="D4D1CA" w:sz="4"/>
+              <w:left w:val="single" w:color="D4D1CA" w:sz="4"/>
+              <w:bottom w:val="single" w:color="D4D1CA" w:sz="4"/>
+              <w:right w:val="single" w:color="D4D1CA" w:sz="4"/>
+            </w:tcBorders>
+            <w:tcMar>
+              <w:top w:type="dxa" w:w="80"/>
+              <w:left w:type="dxa" w:w="100"/>
+              <w:bottom w:type="dxa" w:w="80"/>
+              <w:right w:type="dxa" w:w="100"/>
+            </w:tcMar>
+            <w:vAlign w:val="top"/>
+          </w:tcPr>
+          <w:p>
+            <w:pPr>
+              <w:spacing w:after="40" w:before="0"/>
+            </w:pPr>
+            <w:hyperlink w:history="1" r:id="rIdxqnpbkddqbsqhij7imf6h">
               <w:r>
                 <w:rPr>
                   <w:rStyle w:val="Hyperlink"/>
@@ -4542,7 +4061,7 @@
         </w:tc>
         <w:tc>
           <w:tcPr>
-            <w:tcW w:type="dxa" w:w="2400"/>
+            <w:tcW w:type="dxa" w:w="2600"/>
             <w:tcBorders>
               <w:top w:val="single" w:color="D4D1CA" w:sz="4"/>
               <w:left w:val="single" w:color="D4D1CA" w:sz="4"/>
@@ -4597,7 +4116,7 @@
               </w:rPr>
               <w:t xml:space="preserve"> to exit Celebrations loop. One-click: </w:t>
             </w:r>
-            <w:hyperlink w:history="1" r:id="rId97juj-nl82frxdku3bhlw">
+            <w:hyperlink w:history="1" r:id="rIduomerv76vsi2lvquuu21w">
               <w:r>
                 <w:rPr>
                   <w:rStyle w:val="Hyperlink"/>
@@ -4622,7 +4141,7 @@
       <w:tr>
         <w:tc>
           <w:tcPr>
-            <w:tcW w:type="dxa" w:w="1200"/>
+            <w:tcW w:type="dxa" w:w="1300"/>
             <w:tcBorders>
               <w:top w:val="single" w:color="D4D1CA" w:sz="4"/>
               <w:left w:val="single" w:color="D4D1CA" w:sz="4"/>
@@ -4654,6 +4173,54 @@
         </w:tc>
         <w:tc>
           <w:tcPr>
+            <w:tcW w:type="dxa" w:w="2800"/>
+            <w:tcBorders>
+              <w:top w:val="single" w:color="D4D1CA" w:sz="4"/>
+              <w:left w:val="single" w:color="D4D1CA" w:sz="4"/>
+              <w:bottom w:val="single" w:color="D4D1CA" w:sz="4"/>
+              <w:right w:val="single" w:color="D4D1CA" w:sz="4"/>
+            </w:tcBorders>
+            <w:shd w:fill="F5F1EA" w:val="clear"/>
+            <w:tcMar>
+              <w:top w:type="dxa" w:w="80"/>
+              <w:left w:type="dxa" w:w="100"/>
+              <w:bottom w:type="dxa" w:w="80"/>
+              <w:right w:type="dxa" w:w="100"/>
+            </w:tcMar>
+            <w:vAlign w:val="top"/>
+          </w:tcPr>
+          <w:p>
+            <w:pPr>
+              <w:spacing w:after="40" w:before="0"/>
+            </w:pPr>
+            <w:r>
+              <w:rPr>
+                <w:rFonts w:ascii="Calibri" w:cs="Calibri" w:eastAsia="Calibri" w:hAnsi="Calibri"/>
+                <w:b/>
+                <w:bCs/>
+                <w:sz w:val="18"/>
+                <w:szCs w:val="18"/>
+              </w:rPr>
+              <w:t xml:space="preserve">The 10 Pillars of Visionary Greatness</w:t>
+            </w:r>
+          </w:p>
+          <w:p>
+            <w:pPr>
+              <w:spacing w:after="40" w:before="0"/>
+            </w:pPr>
+            <w:r>
+              <w:rPr>
+                <w:rFonts w:ascii="Calibri" w:cs="Calibri" w:eastAsia="Calibri" w:hAnsi="Calibri"/>
+                <w:color w:val="7A7974"/>
+                <w:sz w:val="18"/>
+                <w:szCs w:val="18"/>
+              </w:rPr>
+              <w:t xml:space="preserve">Mark C. Winters</w:t>
+            </w:r>
+          </w:p>
+        </w:tc>
+        <w:tc>
+          <w:tcPr>
             <w:tcW w:type="dxa" w:w="2600"/>
             <w:tcBorders>
               <w:top w:val="single" w:color="D4D1CA" w:sz="4"/>
@@ -4677,32 +4244,16 @@
             <w:r>
               <w:rPr>
                 <w:rFonts w:ascii="Calibri" w:cs="Calibri" w:eastAsia="Calibri" w:hAnsi="Calibri"/>
-                <w:b/>
-                <w:bCs/>
-                <w:sz w:val="18"/>
-                <w:szCs w:val="18"/>
-              </w:rPr>
-              <w:t xml:space="preserve">The 10 Pillars of Visionary Greatness</w:t>
-            </w:r>
-          </w:p>
-          <w:p>
-            <w:pPr>
-              <w:spacing w:after="40" w:before="0"/>
-            </w:pPr>
-            <w:r>
-              <w:rPr>
-                <w:rFonts w:ascii="Calibri" w:cs="Calibri" w:eastAsia="Calibri" w:hAnsi="Calibri"/>
-                <w:color w:val="7A7974"/>
-                <w:sz w:val="18"/>
-                <w:szCs w:val="18"/>
-              </w:rPr>
-              <w:t xml:space="preserve">Mark C. Winters</w:t>
-            </w:r>
-          </w:p>
-        </w:tc>
-        <w:tc>
-          <w:tcPr>
-            <w:tcW w:type="dxa" w:w="1800"/>
+                <w:sz w:val="18"/>
+                <w:szCs w:val="18"/>
+              </w:rPr>
+              <w:t xml:space="preserve">Winters' deck (in Speaker Decks/)</w:t>
+            </w:r>
+          </w:p>
+        </w:tc>
+        <w:tc>
+          <w:tcPr>
+            <w:tcW w:type="dxa" w:w="2500"/>
             <w:tcBorders>
               <w:top w:val="single" w:color="D4D1CA" w:sz="4"/>
               <w:left w:val="single" w:color="D4D1CA" w:sz="4"/>
@@ -4737,7 +4288,7 @@
         </w:tc>
         <w:tc>
           <w:tcPr>
-            <w:tcW w:type="dxa" w:w="2200"/>
+            <w:tcW w:type="dxa" w:w="2600"/>
             <w:tcBorders>
               <w:top w:val="single" w:color="D4D1CA" w:sz="4"/>
               <w:left w:val="single" w:color="D4D1CA" w:sz="4"/>
@@ -4760,35 +4311,13 @@
             <w:r>
               <w:rPr>
                 <w:rFonts w:ascii="Calibri" w:cs="Calibri" w:eastAsia="Calibri" w:hAnsi="Calibri"/>
-                <w:sz w:val="18"/>
-                <w:szCs w:val="18"/>
-              </w:rPr>
-              <w:t xml:space="preserve">Winters' deck (in Speaker Decks/)</w:t>
-            </w:r>
-          </w:p>
-        </w:tc>
-        <w:tc>
-          <w:tcPr>
-            <w:tcW w:type="dxa" w:w="1800"/>
-            <w:tcBorders>
-              <w:top w:val="single" w:color="D4D1CA" w:sz="4"/>
-              <w:left w:val="single" w:color="D4D1CA" w:sz="4"/>
-              <w:bottom w:val="single" w:color="D4D1CA" w:sz="4"/>
-              <w:right w:val="single" w:color="D4D1CA" w:sz="4"/>
-            </w:tcBorders>
-            <w:shd w:fill="F5F1EA" w:val="clear"/>
-            <w:tcMar>
-              <w:top w:type="dxa" w:w="80"/>
-              <w:left w:type="dxa" w:w="100"/>
-              <w:bottom w:type="dxa" w:w="80"/>
-              <w:right w:type="dxa" w:w="100"/>
-            </w:tcMar>
-            <w:vAlign w:val="top"/>
-          </w:tcPr>
-          <w:p>
-            <w:pPr>
-              <w:spacing w:after="40" w:before="0"/>
-            </w:pPr>
+                <w:b/>
+                <w:bCs/>
+                <w:sz w:val="18"/>
+                <w:szCs w:val="18"/>
+              </w:rPr>
+              <w:t xml:space="preserve">Walk-on: </w:t>
+            </w:r>
             <w:r>
               <w:rPr>
                 <w:rFonts w:ascii="Calibri" w:cs="Calibri" w:eastAsia="Calibri" w:hAnsi="Calibri"/>
@@ -4798,58 +4327,13 @@
                 <w:sz w:val="18"/>
                 <w:szCs w:val="18"/>
               </w:rPr>
-              <w:t xml:space="preserve">TBD (walkthrough)</w:t>
-            </w:r>
-          </w:p>
-        </w:tc>
-        <w:tc>
-          <w:tcPr>
-            <w:tcW w:type="dxa" w:w="2400"/>
-            <w:tcBorders>
-              <w:top w:val="single" w:color="D4D1CA" w:sz="4"/>
-              <w:left w:val="single" w:color="D4D1CA" w:sz="4"/>
-              <w:bottom w:val="single" w:color="D4D1CA" w:sz="4"/>
-              <w:right w:val="single" w:color="D4D1CA" w:sz="4"/>
-            </w:tcBorders>
-            <w:shd w:fill="F5F1EA" w:val="clear"/>
-            <w:tcMar>
-              <w:top w:type="dxa" w:w="80"/>
-              <w:left w:type="dxa" w:w="100"/>
-              <w:bottom w:type="dxa" w:w="80"/>
-              <w:right w:type="dxa" w:w="100"/>
-            </w:tcMar>
-            <w:vAlign w:val="top"/>
-          </w:tcPr>
-          <w:p>
-            <w:pPr>
-              <w:spacing w:after="40" w:before="0"/>
-            </w:pPr>
-            <w:r>
-              <w:rPr>
-                <w:rFonts w:ascii="Calibri" w:cs="Calibri" w:eastAsia="Calibri" w:hAnsi="Calibri"/>
-                <w:b/>
-                <w:bCs/>
-                <w:sz w:val="18"/>
-                <w:szCs w:val="18"/>
-              </w:rPr>
-              <w:t xml:space="preserve">Walk-on: </w:t>
-            </w:r>
-            <w:r>
-              <w:rPr>
-                <w:rFonts w:ascii="Calibri" w:cs="Calibri" w:eastAsia="Calibri" w:hAnsi="Calibri"/>
-                <w:b/>
-                <w:bCs/>
-                <w:color w:val="B0000A"/>
-                <w:sz w:val="18"/>
-                <w:szCs w:val="18"/>
-              </w:rPr>
               <w:t xml:space="preserve">TBD — awaiting Mark C. Winters</w:t>
             </w:r>
           </w:p>
         </w:tc>
         <w:tc>
           <w:tcPr>
-            <w:tcW w:type="dxa" w:w="2400"/>
+            <w:tcW w:type="dxa" w:w="2600"/>
             <w:tcBorders>
               <w:top w:val="single" w:color="D4D1CA" w:sz="4"/>
               <w:left w:val="single" w:color="D4D1CA" w:sz="4"/>
@@ -4901,7 +4385,7 @@
       <w:tr>
         <w:tc>
           <w:tcPr>
-            <w:gridSpan w:val="7"/>
+            <w:gridSpan w:val="6"/>
             <w:tcBorders>
               <w:top w:val="single" w:color="D4D1CA" w:sz="4"/>
               <w:left w:val="single" w:color="D4D1CA" w:sz="4"/>
@@ -4935,7 +4419,7 @@
       <w:tr>
         <w:tc>
           <w:tcPr>
-            <w:tcW w:type="dxa" w:w="1200"/>
+            <w:tcW w:type="dxa" w:w="1300"/>
             <w:tcBorders>
               <w:top w:val="single" w:color="D4D1CA" w:sz="4"/>
               <w:left w:val="single" w:color="D4D1CA" w:sz="4"/>
@@ -4966,6 +4450,53 @@
         </w:tc>
         <w:tc>
           <w:tcPr>
+            <w:tcW w:type="dxa" w:w="2800"/>
+            <w:tcBorders>
+              <w:top w:val="single" w:color="D4D1CA" w:sz="4"/>
+              <w:left w:val="single" w:color="D4D1CA" w:sz="4"/>
+              <w:bottom w:val="single" w:color="D4D1CA" w:sz="4"/>
+              <w:right w:val="single" w:color="D4D1CA" w:sz="4"/>
+            </w:tcBorders>
+            <w:tcMar>
+              <w:top w:type="dxa" w:w="80"/>
+              <w:left w:type="dxa" w:w="100"/>
+              <w:bottom w:type="dxa" w:w="80"/>
+              <w:right w:type="dxa" w:w="100"/>
+            </w:tcMar>
+            <w:vAlign w:val="top"/>
+          </w:tcPr>
+          <w:p>
+            <w:pPr>
+              <w:spacing w:after="40" w:before="0"/>
+            </w:pPr>
+            <w:r>
+              <w:rPr>
+                <w:rFonts w:ascii="Calibri" w:cs="Calibri" w:eastAsia="Calibri" w:hAnsi="Calibri"/>
+                <w:b/>
+                <w:bCs/>
+                <w:sz w:val="18"/>
+                <w:szCs w:val="18"/>
+              </w:rPr>
+              <w:t xml:space="preserve">Happy Hour + Networking</w:t>
+            </w:r>
+          </w:p>
+          <w:p>
+            <w:pPr>
+              <w:spacing w:after="40" w:before="0"/>
+            </w:pPr>
+            <w:r>
+              <w:rPr>
+                <w:rFonts w:ascii="Calibri" w:cs="Calibri" w:eastAsia="Calibri" w:hAnsi="Calibri"/>
+                <w:color w:val="7A7974"/>
+                <w:sz w:val="18"/>
+                <w:szCs w:val="18"/>
+              </w:rPr>
+              <w:t xml:space="preserve">Sponsored by Ninety.io</w:t>
+            </w:r>
+          </w:p>
+        </w:tc>
+        <w:tc>
+          <w:tcPr>
             <w:tcW w:type="dxa" w:w="2600"/>
             <w:tcBorders>
               <w:top w:val="single" w:color="D4D1CA" w:sz="4"/>
@@ -4988,32 +4519,16 @@
             <w:r>
               <w:rPr>
                 <w:rFonts w:ascii="Calibri" w:cs="Calibri" w:eastAsia="Calibri" w:hAnsi="Calibri"/>
-                <w:b/>
-                <w:bCs/>
-                <w:sz w:val="18"/>
-                <w:szCs w:val="18"/>
-              </w:rPr>
-              <w:t xml:space="preserve">Happy Hour + Networking</w:t>
-            </w:r>
-          </w:p>
-          <w:p>
-            <w:pPr>
-              <w:spacing w:after="40" w:before="0"/>
-            </w:pPr>
-            <w:r>
-              <w:rPr>
-                <w:rFonts w:ascii="Calibri" w:cs="Calibri" w:eastAsia="Calibri" w:hAnsi="Calibri"/>
-                <w:color w:val="7A7974"/>
-                <w:sz w:val="18"/>
-                <w:szCs w:val="18"/>
-              </w:rPr>
-              <w:t xml:space="preserve">Sponsored by Ninety.io</w:t>
-            </w:r>
-          </w:p>
-        </w:tc>
-        <w:tc>
-          <w:tcPr>
-            <w:tcW w:type="dxa" w:w="1800"/>
+                <w:sz w:val="18"/>
+                <w:szCs w:val="18"/>
+              </w:rPr>
+              <w:t xml:space="preserve">Celebrations Loop OR timer page (any static screen)</w:t>
+            </w:r>
+          </w:p>
+        </w:tc>
+        <w:tc>
+          <w:tcPr>
+            <w:tcW w:type="dxa" w:w="2500"/>
             <w:tcBorders>
               <w:top w:val="single" w:color="D4D1CA" w:sz="4"/>
               <w:left w:val="single" w:color="D4D1CA" w:sz="4"/>
@@ -5047,72 +4562,7 @@
         </w:tc>
         <w:tc>
           <w:tcPr>
-            <w:tcW w:type="dxa" w:w="2200"/>
-            <w:tcBorders>
-              <w:top w:val="single" w:color="D4D1CA" w:sz="4"/>
-              <w:left w:val="single" w:color="D4D1CA" w:sz="4"/>
-              <w:bottom w:val="single" w:color="D4D1CA" w:sz="4"/>
-              <w:right w:val="single" w:color="D4D1CA" w:sz="4"/>
-            </w:tcBorders>
-            <w:tcMar>
-              <w:top w:type="dxa" w:w="80"/>
-              <w:left w:type="dxa" w:w="100"/>
-              <w:bottom w:type="dxa" w:w="80"/>
-              <w:right w:type="dxa" w:w="100"/>
-            </w:tcMar>
-            <w:vAlign w:val="top"/>
-          </w:tcPr>
-          <w:p>
-            <w:pPr>
-              <w:spacing w:after="40" w:before="0"/>
-            </w:pPr>
-            <w:r>
-              <w:rPr>
-                <w:rFonts w:ascii="Calibri" w:cs="Calibri" w:eastAsia="Calibri" w:hAnsi="Calibri"/>
-                <w:sz w:val="18"/>
-                <w:szCs w:val="18"/>
-              </w:rPr>
-              <w:t xml:space="preserve">Celebrations Loop OR timer page (any static screen)</w:t>
-            </w:r>
-          </w:p>
-        </w:tc>
-        <w:tc>
-          <w:tcPr>
-            <w:tcW w:type="dxa" w:w="1800"/>
-            <w:tcBorders>
-              <w:top w:val="single" w:color="D4D1CA" w:sz="4"/>
-              <w:left w:val="single" w:color="D4D1CA" w:sz="4"/>
-              <w:bottom w:val="single" w:color="D4D1CA" w:sz="4"/>
-              <w:right w:val="single" w:color="D4D1CA" w:sz="4"/>
-            </w:tcBorders>
-            <w:tcMar>
-              <w:top w:type="dxa" w:w="80"/>
-              <w:left w:type="dxa" w:w="100"/>
-              <w:bottom w:type="dxa" w:w="80"/>
-              <w:right w:type="dxa" w:w="100"/>
-            </w:tcMar>
-            <w:vAlign w:val="top"/>
-          </w:tcPr>
-          <w:p>
-            <w:pPr>
-              <w:spacing w:after="40" w:before="0"/>
-            </w:pPr>
-            <w:r>
-              <w:rPr>
-                <w:rFonts w:ascii="Calibri" w:cs="Calibri" w:eastAsia="Calibri" w:hAnsi="Calibri"/>
-                <w:b/>
-                <w:bCs/>
-                <w:color w:val="B0000A"/>
-                <w:sz w:val="18"/>
-                <w:szCs w:val="18"/>
-              </w:rPr>
-              <w:t xml:space="preserve">TBD (walkthrough)</w:t>
-            </w:r>
-          </w:p>
-        </w:tc>
-        <w:tc>
-          <w:tcPr>
-            <w:tcW w:type="dxa" w:w="2400"/>
+            <w:tcW w:type="dxa" w:w="2600"/>
             <w:tcBorders>
               <w:top w:val="single" w:color="D4D1CA" w:sz="4"/>
               <w:left w:val="single" w:color="D4D1CA" w:sz="4"/>
@@ -5143,7 +4593,7 @@
         </w:tc>
         <w:tc>
           <w:tcPr>
-            <w:tcW w:type="dxa" w:w="2400"/>
+            <w:tcW w:type="dxa" w:w="2600"/>
             <w:tcBorders>
               <w:top w:val="single" w:color="D4D1CA" w:sz="4"/>
               <w:left w:val="single" w:color="D4D1CA" w:sz="4"/>
@@ -5429,7 +4879,7 @@
             <w:pPr>
               <w:spacing w:after="40" w:before="0"/>
             </w:pPr>
-            <w:hyperlink w:history="1" r:id="rId7sxtykm6pji7qft6ydbov">
+            <w:hyperlink w:history="1" r:id="rIdpdon94slkpmj-f1e1w6l5">
               <w:r>
                 <w:rPr>
                   <w:rStyle w:val="Hyperlink"/>
@@ -5532,7 +4982,7 @@
             <w:pPr>
               <w:spacing w:after="40" w:before="0"/>
             </w:pPr>
-            <w:hyperlink w:history="1" r:id="rId0hjnz29lhyzh2gi1fjvx5">
+            <w:hyperlink w:history="1" r:id="rIdgsj9rplgq-rakzi7bvllf">
               <w:r>
                 <w:rPr>
                   <w:rStyle w:val="Hyperlink"/>
@@ -5632,7 +5082,7 @@
             <w:pPr>
               <w:spacing w:after="40" w:before="0"/>
             </w:pPr>
-            <w:hyperlink w:history="1" r:id="rIdyr5m9stbiybnfxmr-d6n7">
+            <w:hyperlink w:history="1" r:id="rIdy36rwfs_m9i0_ciqrwivj">
               <w:r>
                 <w:rPr>
                   <w:rStyle w:val="Hyperlink"/>
@@ -5735,7 +5185,7 @@
             <w:pPr>
               <w:spacing w:after="40" w:before="0"/>
             </w:pPr>
-            <w:hyperlink w:history="1" r:id="rIdfancy-n7zb1rhjav0_ywc">
+            <w:hyperlink w:history="1" r:id="rIdodpond7bcihxjntqsyqvi">
               <w:r>
                 <w:rPr>
                   <w:rStyle w:val="Hyperlink"/>
@@ -6019,7 +5469,7 @@
             <w:pPr>
               <w:spacing w:after="40" w:before="0"/>
             </w:pPr>
-            <w:hyperlink w:history="1" r:id="rIddee7thrhppwlbnks84-sl">
+            <w:hyperlink w:history="1" r:id="rId3kuhtwedifsqrt-z_nd6n">
               <w:r>
                 <w:rPr>
                   <w:rStyle w:val="Hyperlink"/>
@@ -6163,7 +5613,7 @@
             <w:pPr>
               <w:spacing w:after="40" w:before="0"/>
             </w:pPr>
-            <w:hyperlink w:history="1" r:id="rIdwpnvvix6fkpytbgsag8nw">
+            <w:hyperlink w:history="1" r:id="rIdxqws4qgjh9a5l4o3uwluk">
               <w:r>
                 <w:rPr>
                   <w:rStyle w:val="Hyperlink"/>
@@ -6307,7 +5757,7 @@
             <w:pPr>
               <w:spacing w:after="40" w:before="0"/>
             </w:pPr>
-            <w:hyperlink w:history="1" r:id="rIdubtju_pg58mp1m-sapwj1">
+            <w:hyperlink w:history="1" r:id="rId0xinurxjjek6jnltekttu">
               <w:r>
                 <w:rPr>
                   <w:rStyle w:val="Hyperlink"/>
@@ -6449,7 +5899,7 @@
             <w:pPr>
               <w:spacing w:after="40" w:before="0"/>
             </w:pPr>
-            <w:hyperlink w:history="1" r:id="rIdukn5q6c9juvhehkfdtt8y">
+            <w:hyperlink w:history="1" r:id="rIdgutxzcduk_ctl8whn7ptc">
               <w:r>
                 <w:rPr>
                   <w:rStyle w:val="Hyperlink"/>
@@ -6593,7 +6043,7 @@
             <w:pPr>
               <w:spacing w:after="40" w:before="0"/>
             </w:pPr>
-            <w:hyperlink w:history="1" r:id="rIddteueca39zxnb7ver0wzr">
+            <w:hyperlink w:history="1" r:id="rIdunlzpmlmd570azpqar8gr">
               <w:r>
                 <w:rPr>
                   <w:rStyle w:val="Hyperlink"/>
@@ -6735,7 +6185,7 @@
             <w:pPr>
               <w:spacing w:after="40" w:before="0"/>
             </w:pPr>
-            <w:hyperlink w:history="1" r:id="rIds0qny_6cmacezv0brpbs6">
+            <w:hyperlink w:history="1" r:id="rIdgzkeoats80myhte5cvcew">
               <w:r>
                 <w:rPr>
                   <w:rStyle w:val="Hyperlink"/>
@@ -6922,7 +6372,7 @@
               </w:rPr>
               <w:t xml:space="preserve">Default to </w:t>
             </w:r>
-            <w:hyperlink w:history="1" r:id="rIdmysztvg7g0da69q3jglbi">
+            <w:hyperlink w:history="1" r:id="rId_cibzvy-zzq-11dbg3h0q">
               <w:r>
                 <w:rPr>
                   <w:rStyle w:val="Hyperlink"/>
@@ -6988,7 +6438,7 @@
         </w:rPr>
         <w:t xml:space="preserve">•  Pre-Lunch bridge (11:55 AM): </w:t>
       </w:r>
-      <w:hyperlink w:history="1" r:id="rIdih1ouvx8xliwker6vf1qy">
+      <w:hyperlink w:history="1" r:id="rIdnjxife7xxzgu0nwgkkxi8">
         <w:r>
           <w:rPr>
             <w:rStyle w:val="Hyperlink"/>
@@ -7024,7 +6474,7 @@
         </w:rPr>
         <w:t xml:space="preserve">•  Post-Lunch return (1:00 PM): </w:t>
       </w:r>
-      <w:hyperlink w:history="1" r:id="rIdnhfbvy4rkdkcitaiailoy">
+      <w:hyperlink w:history="1" r:id="rIdjiurfgm7mwyfgecixs2tc">
         <w:r>
           <w:rPr>
             <w:rStyle w:val="Hyperlink"/>
@@ -7045,7 +6495,7 @@
         </w:rPr>
         <w:t xml:space="preserve"> by Dolly Parton, then resume </w:t>
       </w:r>
-      <w:hyperlink w:history="1" r:id="rIdhgxxs-k_e7azn7nmzfdfc">
+      <w:hyperlink w:history="1" r:id="rIde78qqdwn4bkki0vrgrnr4">
         <w:r>
           <w:rPr>
             <w:rStyle w:val="Hyperlink"/>
@@ -7292,7 +6742,7 @@
         </w:rPr>
         <w:t xml:space="preserve"> (deck / files / AV lead) · </w:t>
       </w:r>
-      <w:hyperlink w:history="1" r:id="rIdxuo2tsszvgpkk6wnnr2en">
+      <w:hyperlink w:history="1" r:id="rId6yemceeckyot9vtf1dllo">
         <w:r>
           <w:rPr>
             <w:rStyle w:val="Hyperlink"/>
@@ -7311,7 +6761,7 @@
         </w:rPr>
         <w:t xml:space="preserve"> · </w:t>
       </w:r>
-      <w:hyperlink w:history="1" r:id="rIdsz_fjraenj4uj21l1yjy1">
+      <w:hyperlink w:history="1" r:id="rIdbbrzvztbwgxgptnak1k34">
         <w:r>
           <w:rPr>
             <w:rStyle w:val="Hyperlink"/>
@@ -7345,7 +6795,7 @@
         </w:rPr>
         <w:t xml:space="preserve"> (Day-of Show Operations (event lead, run of show)) · </w:t>
       </w:r>
-      <w:hyperlink w:history="1" r:id="rId2b_7er6mm6prwpzxmiooa">
+      <w:hyperlink w:history="1" r:id="rIdrtwljbqcymvtleddihj9w">
         <w:r>
           <w:rPr>
             <w:rStyle w:val="Hyperlink"/>
@@ -7364,7 +6814,7 @@
         </w:rPr>
         <w:t xml:space="preserve"> · </w:t>
       </w:r>
-      <w:hyperlink w:history="1" r:id="rIdcynugtmntbkjh8yzf2_n8">
+      <w:hyperlink w:history="1" r:id="rId24vsmjexd4mr7ev4cewhy">
         <w:r>
           <w:rPr>
             <w:rStyle w:val="Hyperlink"/>
@@ -7398,7 +6848,7 @@
         </w:rPr>
         <w:t xml:space="preserve"> (Venue Liaison (knows the Statler)) · </w:t>
       </w:r>
-      <w:hyperlink w:history="1" r:id="rIdanvjo5szttglefnzqnhkh">
+      <w:hyperlink w:history="1" r:id="rId5nl3hjibllrb_glqlnuob">
         <w:r>
           <w:rPr>
             <w:rStyle w:val="Hyperlink"/>
@@ -7417,7 +6867,7 @@
         </w:rPr>
         <w:t xml:space="preserve"> · </w:t>
       </w:r>
-      <w:hyperlink w:history="1" r:id="rId9go_cscrfe01vdinmmivb">
+      <w:hyperlink w:history="1" r:id="rIddamc9gxxmxbpfxc4tqrpk">
         <w:r>
           <w:rPr>
             <w:rStyle w:val="Hyperlink"/>
@@ -7451,7 +6901,7 @@
         </w:rPr>
         <w:t xml:space="preserve"> (Encore / Statler AV contact) · </w:t>
       </w:r>
-      <w:hyperlink w:history="1" r:id="rIdgvvlgtk7yqzt0rmdmatzr">
+      <w:hyperlink w:history="1" r:id="rIdksdfvhqpqtm-rtdym9uip">
         <w:r>
           <w:rPr>
             <w:rStyle w:val="Hyperlink"/>
@@ -7470,7 +6920,7 @@
         </w:rPr>
         <w:t xml:space="preserve"> · </w:t>
       </w:r>
-      <w:hyperlink w:history="1" r:id="rIdgdtnrqqps_mviiul6nrld">
+      <w:hyperlink w:history="1" r:id="rIdqont0cmcpuel2uh1avbao">
         <w:r>
           <w:rPr>
             <w:rStyle w:val="Hyperlink"/>
@@ -7504,7 +6954,7 @@
         </w:rPr>
         <w:t xml:space="preserve"> (MC (emcee)) · </w:t>
       </w:r>
-      <w:hyperlink w:history="1" r:id="rIduynomyydlnbkfz22dmvxw">
+      <w:hyperlink w:history="1" r:id="rIdozzdkya1qnrjvtdvfoi7z">
         <w:r>
           <w:rPr>
             <w:rStyle w:val="Hyperlink"/>
@@ -7538,7 +6988,7 @@
         </w:rPr>
         <w:t xml:space="preserve"> (stage-side coordinator (eyes on stage all day, supports MC Max)) · </w:t>
       </w:r>
-      <w:hyperlink w:history="1" r:id="rIdncdjp7ywakeuqiummuvqd">
+      <w:hyperlink w:history="1" r:id="rIduh-dlvda4zx3sijdrb2qv">
         <w:r>
           <w:rPr>
             <w:rStyle w:val="Hyperlink"/>

</xml_diff>

<commit_message>
AV Timeline: fill Side Screens (breaks=countdown, speakers=live camera feed)
</commit_message>
<xml_diff>
--- a/deliverables/av-package/AV-Timeline.docx
+++ b/deliverables/av-package/AV-Timeline.docx
@@ -102,7 +102,7 @@
             <w:pPr>
               <w:spacing w:after="40" w:before="0"/>
             </w:pPr>
-            <w:hyperlink w:history="1" r:id="rIdyii7i8zrnhveylyuksxqm">
+            <w:hyperlink w:history="1" r:id="rIdctyeiythcokjs4jy7dxoc">
               <w:r>
                 <w:rPr>
                   <w:rStyle w:val="Hyperlink"/>
@@ -180,7 +180,7 @@
             <w:pPr>
               <w:spacing w:after="40" w:before="0"/>
             </w:pPr>
-            <w:hyperlink w:history="1" r:id="rIdrx0ex-vq_usezi0sdbowt">
+            <w:hyperlink w:history="1" r:id="rIdi68mrltjas7cxahxttvuj">
               <w:r>
                 <w:rPr>
                   <w:rStyle w:val="Hyperlink"/>
@@ -199,7 +199,7 @@
               </w:rPr>
               <w:t xml:space="preserve"> · </w:t>
             </w:r>
-            <w:hyperlink w:history="1" r:id="rIdhrbtg05mypabech9xb6cj">
+            <w:hyperlink w:history="1" r:id="rIdzxixvfudpvjnbybellwwe">
               <w:r>
                 <w:rPr>
                   <w:rStyle w:val="Hyperlink"/>
@@ -218,7 +218,7 @@
               </w:rPr>
               <w:t xml:space="preserve"> · </w:t>
             </w:r>
-            <w:hyperlink w:history="1" r:id="rIduikgghhl1jer05m4wmpc-">
+            <w:hyperlink w:history="1" r:id="rIdb49b2585ozazlln0l5d6b">
               <w:r>
                 <w:rPr>
                   <w:rStyle w:val="Hyperlink"/>
@@ -237,7 +237,7 @@
               </w:rPr>
               <w:t xml:space="preserve"> · </w:t>
             </w:r>
-            <w:hyperlink w:history="1" r:id="rIdnksl4k9c2cwhcxzrdsod9">
+            <w:hyperlink w:history="1" r:id="rIdmoxenabxavd-kre9_akoe">
               <w:r>
                 <w:rPr>
                   <w:rStyle w:val="Hyperlink"/>
@@ -879,11 +879,18 @@
                 <w:rFonts w:ascii="Calibri" w:cs="Calibri" w:eastAsia="Calibri" w:hAnsi="Calibri"/>
                 <w:b/>
                 <w:bCs/>
-                <w:color w:val="B0000A"/>
-                <w:sz w:val="18"/>
-                <w:szCs w:val="18"/>
-              </w:rPr>
-              <w:t xml:space="preserve">TBD (walkthrough)</w:t>
+                <w:sz w:val="18"/>
+                <w:szCs w:val="18"/>
+              </w:rPr>
+              <w:t xml:space="preserve">Countdown</w:t>
+            </w:r>
+            <w:r>
+              <w:rPr>
+                <w:rFonts w:ascii="Calibri" w:cs="Calibri" w:eastAsia="Calibri" w:hAnsi="Calibri"/>
+                <w:sz w:val="18"/>
+                <w:szCs w:val="18"/>
+              </w:rPr>
+              <w:t xml:space="preserve"> to 8:00 AM</w:t>
             </w:r>
           </w:p>
         </w:tc>
@@ -908,7 +915,7 @@
             <w:pPr>
               <w:spacing w:after="40" w:before="0"/>
             </w:pPr>
-            <w:hyperlink w:history="1" r:id="rIdtjssnznxynfszc7f-_bpg">
+            <w:hyperlink w:history="1" r:id="rIdiucy5foyzasqqwb9ojp57">
               <w:r>
                 <w:rPr>
                   <w:rStyle w:val="Hyperlink"/>
@@ -960,7 +967,7 @@
               </w:rPr>
               <w:t xml:space="preserve">Open </w:t>
             </w:r>
-            <w:hyperlink w:history="1" r:id="rIdd6hjmw0jyhwirp6n8oj3z">
+            <w:hyperlink w:history="1" r:id="rId97ekahdoewczvkaboax4l">
               <w:r>
                 <w:rPr>
                   <w:rStyle w:val="Hyperlink"/>
@@ -1122,11 +1129,18 @@
                 <w:rFonts w:ascii="Calibri" w:cs="Calibri" w:eastAsia="Calibri" w:hAnsi="Calibri"/>
                 <w:b/>
                 <w:bCs/>
-                <w:color w:val="B0000A"/>
-                <w:sz w:val="18"/>
-                <w:szCs w:val="18"/>
-              </w:rPr>
-              <w:t xml:space="preserve">TBD (walkthrough)</w:t>
+                <w:sz w:val="18"/>
+                <w:szCs w:val="18"/>
+              </w:rPr>
+              <w:t xml:space="preserve">Live camera feed</w:t>
+            </w:r>
+            <w:r>
+              <w:rPr>
+                <w:rFonts w:ascii="Calibri" w:cs="Calibri" w:eastAsia="Calibri" w:hAnsi="Calibri"/>
+                <w:sz w:val="18"/>
+                <w:szCs w:val="18"/>
+              </w:rPr>
+              <w:t xml:space="preserve"> from the stage</w:t>
             </w:r>
           </w:p>
         </w:tc>
@@ -1162,7 +1176,7 @@
               </w:rPr>
               <w:t xml:space="preserve">Walk-on: </w:t>
             </w:r>
-            <w:hyperlink w:history="1" r:id="rIdh7o4ybqblzlvdesxecldd">
+            <w:hyperlink w:history="1" r:id="rIdxb26s5-tsrsbgu8pogbmt">
               <w:r>
                 <w:rPr>
                   <w:rStyle w:val="Hyperlink"/>
@@ -1358,11 +1372,18 @@
                 <w:rFonts w:ascii="Calibri" w:cs="Calibri" w:eastAsia="Calibri" w:hAnsi="Calibri"/>
                 <w:b/>
                 <w:bCs/>
-                <w:color w:val="B0000A"/>
-                <w:sz w:val="18"/>
-                <w:szCs w:val="18"/>
-              </w:rPr>
-              <w:t xml:space="preserve">TBD (walkthrough)</w:t>
+                <w:sz w:val="18"/>
+                <w:szCs w:val="18"/>
+              </w:rPr>
+              <w:t xml:space="preserve">Countdown</w:t>
+            </w:r>
+            <w:r>
+              <w:rPr>
+                <w:rFonts w:ascii="Calibri" w:cs="Calibri" w:eastAsia="Calibri" w:hAnsi="Calibri"/>
+                <w:sz w:val="18"/>
+                <w:szCs w:val="18"/>
+              </w:rPr>
+              <w:t xml:space="preserve"> to 9:50 AM</w:t>
             </w:r>
           </w:p>
         </w:tc>
@@ -1387,7 +1408,7 @@
             <w:pPr>
               <w:spacing w:after="40" w:before="0"/>
             </w:pPr>
-            <w:hyperlink w:history="1" r:id="rId1eujphpkz3s4ot6g12ado">
+            <w:hyperlink w:history="1" r:id="rIdx64afmr7jam2_ku3ki1-0">
               <w:r>
                 <w:rPr>
                   <w:rStyle w:val="Hyperlink"/>
@@ -1636,11 +1657,18 @@
                 <w:rFonts w:ascii="Calibri" w:cs="Calibri" w:eastAsia="Calibri" w:hAnsi="Calibri"/>
                 <w:b/>
                 <w:bCs/>
-                <w:color w:val="B0000A"/>
-                <w:sz w:val="18"/>
-                <w:szCs w:val="18"/>
-              </w:rPr>
-              <w:t xml:space="preserve">TBD (walkthrough)</w:t>
+                <w:sz w:val="18"/>
+                <w:szCs w:val="18"/>
+              </w:rPr>
+              <w:t xml:space="preserve">Live camera feed</w:t>
+            </w:r>
+            <w:r>
+              <w:rPr>
+                <w:rFonts w:ascii="Calibri" w:cs="Calibri" w:eastAsia="Calibri" w:hAnsi="Calibri"/>
+                <w:sz w:val="18"/>
+                <w:szCs w:val="18"/>
+              </w:rPr>
+              <w:t xml:space="preserve"> from the stage</w:t>
             </w:r>
           </w:p>
         </w:tc>
@@ -1676,7 +1704,7 @@
               </w:rPr>
               <w:t xml:space="preserve">Walk-on: </w:t>
             </w:r>
-            <w:hyperlink w:history="1" r:id="rIdhlevrqte1pg_jmxcwgojr">
+            <w:hyperlink w:history="1" r:id="rIdvcufczcwsv20-lj-dnkq8">
               <w:r>
                 <w:rPr>
                   <w:rStyle w:val="Hyperlink"/>
@@ -1862,11 +1890,18 @@
                 <w:rFonts w:ascii="Calibri" w:cs="Calibri" w:eastAsia="Calibri" w:hAnsi="Calibri"/>
                 <w:b/>
                 <w:bCs/>
-                <w:color w:val="B0000A"/>
-                <w:sz w:val="18"/>
-                <w:szCs w:val="18"/>
-              </w:rPr>
-              <w:t xml:space="preserve">TBD (walkthrough)</w:t>
+                <w:sz w:val="18"/>
+                <w:szCs w:val="18"/>
+              </w:rPr>
+              <w:t xml:space="preserve">Countdown</w:t>
+            </w:r>
+            <w:r>
+              <w:rPr>
+                <w:rFonts w:ascii="Calibri" w:cs="Calibri" w:eastAsia="Calibri" w:hAnsi="Calibri"/>
+                <w:sz w:val="18"/>
+                <w:szCs w:val="18"/>
+              </w:rPr>
+              <w:t xml:space="preserve"> to 10:55 AM</w:t>
             </w:r>
           </w:p>
         </w:tc>
@@ -1891,7 +1926,7 @@
             <w:pPr>
               <w:spacing w:after="40" w:before="0"/>
             </w:pPr>
-            <w:hyperlink w:history="1" r:id="rIdkzx1ayxfpoy3nwsi-x0ef">
+            <w:hyperlink w:history="1" r:id="rIdz937456l9tyyguq7rdn9p">
               <w:r>
                 <w:rPr>
                   <w:rStyle w:val="Hyperlink"/>
@@ -1961,7 +1996,7 @@
               </w:rPr>
               <w:t xml:space="preserve"> to exit Celebrations loop. One-click: </w:t>
             </w:r>
-            <w:hyperlink w:history="1" r:id="rIdmmogihiq2gt6xcrb8-lv1">
+            <w:hyperlink w:history="1" r:id="rIdyeetuknxkstflet_ds7rf">
               <w:r>
                 <w:rPr>
                   <w:rStyle w:val="Hyperlink"/>
@@ -2123,11 +2158,18 @@
                 <w:rFonts w:ascii="Calibri" w:cs="Calibri" w:eastAsia="Calibri" w:hAnsi="Calibri"/>
                 <w:b/>
                 <w:bCs/>
-                <w:color w:val="B0000A"/>
-                <w:sz w:val="18"/>
-                <w:szCs w:val="18"/>
-              </w:rPr>
-              <w:t xml:space="preserve">TBD (walkthrough)</w:t>
+                <w:sz w:val="18"/>
+                <w:szCs w:val="18"/>
+              </w:rPr>
+              <w:t xml:space="preserve">Live camera feed</w:t>
+            </w:r>
+            <w:r>
+              <w:rPr>
+                <w:rFonts w:ascii="Calibri" w:cs="Calibri" w:eastAsia="Calibri" w:hAnsi="Calibri"/>
+                <w:sz w:val="18"/>
+                <w:szCs w:val="18"/>
+              </w:rPr>
+              <w:t xml:space="preserve"> from the stage</w:t>
             </w:r>
           </w:p>
         </w:tc>
@@ -2163,7 +2205,7 @@
               </w:rPr>
               <w:t xml:space="preserve">Walk-on: </w:t>
             </w:r>
-            <w:hyperlink w:history="1" r:id="rIdyhykvmqdmfdm5umtuuhsd">
+            <w:hyperlink w:history="1" r:id="rIdosomfedit1eawo9otkj8k">
               <w:r>
                 <w:rPr>
                   <w:rStyle w:val="Hyperlink"/>
@@ -2349,11 +2391,18 @@
                 <w:rFonts w:ascii="Calibri" w:cs="Calibri" w:eastAsia="Calibri" w:hAnsi="Calibri"/>
                 <w:b/>
                 <w:bCs/>
-                <w:color w:val="B0000A"/>
-                <w:sz w:val="18"/>
-                <w:szCs w:val="18"/>
-              </w:rPr>
-              <w:t xml:space="preserve">TBD (walkthrough)</w:t>
+                <w:sz w:val="18"/>
+                <w:szCs w:val="18"/>
+              </w:rPr>
+              <w:t xml:space="preserve">Live camera feed</w:t>
+            </w:r>
+            <w:r>
+              <w:rPr>
+                <w:rFonts w:ascii="Calibri" w:cs="Calibri" w:eastAsia="Calibri" w:hAnsi="Calibri"/>
+                <w:sz w:val="18"/>
+                <w:szCs w:val="18"/>
+              </w:rPr>
+              <w:t xml:space="preserve"> from the stage</w:t>
             </w:r>
           </w:p>
         </w:tc>
@@ -2388,7 +2437,7 @@
               </w:rPr>
               <w:t xml:space="preserve">Pre-Lunch: </w:t>
             </w:r>
-            <w:hyperlink w:history="1" r:id="rIdpscsh6bzilt_4ded7obqj">
+            <w:hyperlink w:history="1" r:id="rIdatghd_sacub5xnlygwduf">
               <w:r>
                 <w:rPr>
                   <w:rStyle w:val="Hyperlink"/>
@@ -2663,11 +2712,18 @@
                 <w:rFonts w:ascii="Calibri" w:cs="Calibri" w:eastAsia="Calibri" w:hAnsi="Calibri"/>
                 <w:b/>
                 <w:bCs/>
-                <w:color w:val="B0000A"/>
-                <w:sz w:val="18"/>
-                <w:szCs w:val="18"/>
-              </w:rPr>
-              <w:t xml:space="preserve">TBD (walkthrough)</w:t>
+                <w:sz w:val="18"/>
+                <w:szCs w:val="18"/>
+              </w:rPr>
+              <w:t xml:space="preserve">Live camera feed</w:t>
+            </w:r>
+            <w:r>
+              <w:rPr>
+                <w:rFonts w:ascii="Calibri" w:cs="Calibri" w:eastAsia="Calibri" w:hAnsi="Calibri"/>
+                <w:sz w:val="18"/>
+                <w:szCs w:val="18"/>
+              </w:rPr>
+              <w:t xml:space="preserve"> from the stage</w:t>
             </w:r>
           </w:p>
         </w:tc>
@@ -2703,7 +2759,7 @@
               </w:rPr>
               <w:t xml:space="preserve">Walk-on: </w:t>
             </w:r>
-            <w:hyperlink w:history="1" r:id="rIdfqe76uygpoifyraurqisj">
+            <w:hyperlink w:history="1" r:id="rIdxv1zlgn4pdis9gxi4x00b">
               <w:r>
                 <w:rPr>
                   <w:rStyle w:val="Hyperlink"/>
@@ -2925,11 +2981,18 @@
                 <w:rFonts w:ascii="Calibri" w:cs="Calibri" w:eastAsia="Calibri" w:hAnsi="Calibri"/>
                 <w:b/>
                 <w:bCs/>
-                <w:color w:val="B0000A"/>
-                <w:sz w:val="18"/>
-                <w:szCs w:val="18"/>
-              </w:rPr>
-              <w:t xml:space="preserve">TBD (walkthrough)</w:t>
+                <w:sz w:val="18"/>
+                <w:szCs w:val="18"/>
+              </w:rPr>
+              <w:t xml:space="preserve">Countdown</w:t>
+            </w:r>
+            <w:r>
+              <w:rPr>
+                <w:rFonts w:ascii="Calibri" w:cs="Calibri" w:eastAsia="Calibri" w:hAnsi="Calibri"/>
+                <w:sz w:val="18"/>
+                <w:szCs w:val="18"/>
+              </w:rPr>
+              <w:t xml:space="preserve"> to 1:10 PM</w:t>
             </w:r>
           </w:p>
         </w:tc>
@@ -2964,7 +3027,7 @@
               </w:rPr>
               <w:t xml:space="preserve">Post-Lunch: </w:t>
             </w:r>
-            <w:hyperlink w:history="1" r:id="rIdlj-tslhzjnrkg0fb2kkt8">
+            <w:hyperlink w:history="1" r:id="rIdqzazynmmptuqis4v4njoc">
               <w:r>
                 <w:rPr>
                   <w:rStyle w:val="Hyperlink"/>
@@ -2985,7 +3048,7 @@
               </w:rPr>
               <w:t xml:space="preserve"> — Dolly Parton, then </w:t>
             </w:r>
-            <w:hyperlink w:history="1" r:id="rId7-jt00v9gf30gxjasrdm2">
+            <w:hyperlink w:history="1" r:id="rIdxehujufnyzru9ziy48giy">
               <w:r>
                 <w:rPr>
                   <w:rStyle w:val="Hyperlink"/>
@@ -3055,7 +3118,7 @@
               </w:rPr>
               <w:t xml:space="preserve"> to exit lunch Celebrations loop. Play post-lunch song. One-click: </w:t>
             </w:r>
-            <w:hyperlink w:history="1" r:id="rIdoh8zuyohscuelemeewq2s">
+            <w:hyperlink w:history="1" r:id="rIdvvevvxfkn0d0u70cnmudy">
               <w:r>
                 <w:rPr>
                   <w:rStyle w:val="Hyperlink"/>
@@ -3251,11 +3314,18 @@
                 <w:rFonts w:ascii="Calibri" w:cs="Calibri" w:eastAsia="Calibri" w:hAnsi="Calibri"/>
                 <w:b/>
                 <w:bCs/>
-                <w:color w:val="B0000A"/>
-                <w:sz w:val="18"/>
-                <w:szCs w:val="18"/>
-              </w:rPr>
-              <w:t xml:space="preserve">TBD (walkthrough)</w:t>
+                <w:sz w:val="18"/>
+                <w:szCs w:val="18"/>
+              </w:rPr>
+              <w:t xml:space="preserve">Live camera feed</w:t>
+            </w:r>
+            <w:r>
+              <w:rPr>
+                <w:rFonts w:ascii="Calibri" w:cs="Calibri" w:eastAsia="Calibri" w:hAnsi="Calibri"/>
+                <w:sz w:val="18"/>
+                <w:szCs w:val="18"/>
+              </w:rPr>
+              <w:t xml:space="preserve"> from the stage</w:t>
             </w:r>
           </w:p>
         </w:tc>
@@ -3291,7 +3361,7 @@
               </w:rPr>
               <w:t xml:space="preserve">Walk-on: </w:t>
             </w:r>
-            <w:hyperlink w:history="1" r:id="rIdu19jqqituaqktyglwyavp">
+            <w:hyperlink w:history="1" r:id="rIduuwyovgpwvkeltyham8po">
               <w:r>
                 <w:rPr>
                   <w:rStyle w:val="Hyperlink"/>
@@ -3495,11 +3565,18 @@
                 <w:rFonts w:ascii="Calibri" w:cs="Calibri" w:eastAsia="Calibri" w:hAnsi="Calibri"/>
                 <w:b/>
                 <w:bCs/>
-                <w:color w:val="B0000A"/>
-                <w:sz w:val="18"/>
-                <w:szCs w:val="18"/>
-              </w:rPr>
-              <w:t xml:space="preserve">TBD (walkthrough)</w:t>
+                <w:sz w:val="18"/>
+                <w:szCs w:val="18"/>
+              </w:rPr>
+              <w:t xml:space="preserve">Countdown</w:t>
+            </w:r>
+            <w:r>
+              <w:rPr>
+                <w:rFonts w:ascii="Calibri" w:cs="Calibri" w:eastAsia="Calibri" w:hAnsi="Calibri"/>
+                <w:sz w:val="18"/>
+                <w:szCs w:val="18"/>
+              </w:rPr>
+              <w:t xml:space="preserve"> to 2:55 PM</w:t>
             </w:r>
           </w:p>
         </w:tc>
@@ -3524,7 +3601,7 @@
             <w:pPr>
               <w:spacing w:after="40" w:before="0"/>
             </w:pPr>
-            <w:hyperlink w:history="1" r:id="rId0o9hq67j7jmdz-bpewn-b">
+            <w:hyperlink w:history="1" r:id="rId-sgtd2wbyqmtp0_vyafgz">
               <w:r>
                 <w:rPr>
                   <w:rStyle w:val="Hyperlink"/>
@@ -3773,11 +3850,18 @@
                 <w:rFonts w:ascii="Calibri" w:cs="Calibri" w:eastAsia="Calibri" w:hAnsi="Calibri"/>
                 <w:b/>
                 <w:bCs/>
-                <w:color w:val="B0000A"/>
-                <w:sz w:val="18"/>
-                <w:szCs w:val="18"/>
-              </w:rPr>
-              <w:t xml:space="preserve">TBD (walkthrough)</w:t>
+                <w:sz w:val="18"/>
+                <w:szCs w:val="18"/>
+              </w:rPr>
+              <w:t xml:space="preserve">Live camera feed</w:t>
+            </w:r>
+            <w:r>
+              <w:rPr>
+                <w:rFonts w:ascii="Calibri" w:cs="Calibri" w:eastAsia="Calibri" w:hAnsi="Calibri"/>
+                <w:sz w:val="18"/>
+                <w:szCs w:val="18"/>
+              </w:rPr>
+              <w:t xml:space="preserve"> from the stage</w:t>
             </w:r>
           </w:p>
         </w:tc>
@@ -3813,7 +3897,7 @@
               </w:rPr>
               <w:t xml:space="preserve">Walk-on: </w:t>
             </w:r>
-            <w:hyperlink w:history="1" r:id="rIdvkfw9nueepjmj3elbgirw">
+            <w:hyperlink w:history="1" r:id="rId9geke1db7sof4jbbaa6rc">
               <w:r>
                 <w:rPr>
                   <w:rStyle w:val="Hyperlink"/>
@@ -4017,11 +4101,18 @@
                 <w:rFonts w:ascii="Calibri" w:cs="Calibri" w:eastAsia="Calibri" w:hAnsi="Calibri"/>
                 <w:b/>
                 <w:bCs/>
-                <w:color w:val="B0000A"/>
-                <w:sz w:val="18"/>
-                <w:szCs w:val="18"/>
-              </w:rPr>
-              <w:t xml:space="preserve">TBD (walkthrough)</w:t>
+                <w:sz w:val="18"/>
+                <w:szCs w:val="18"/>
+              </w:rPr>
+              <w:t xml:space="preserve">Countdown</w:t>
+            </w:r>
+            <w:r>
+              <w:rPr>
+                <w:rFonts w:ascii="Calibri" w:cs="Calibri" w:eastAsia="Calibri" w:hAnsi="Calibri"/>
+                <w:sz w:val="18"/>
+                <w:szCs w:val="18"/>
+              </w:rPr>
+              <w:t xml:space="preserve"> to 4:45 PM</w:t>
             </w:r>
           </w:p>
         </w:tc>
@@ -4046,7 +4137,7 @@
             <w:pPr>
               <w:spacing w:after="40" w:before="0"/>
             </w:pPr>
-            <w:hyperlink w:history="1" r:id="rIdxqnpbkddqbsqhij7imf6h">
+            <w:hyperlink w:history="1" r:id="rIdzmscsrhjbuaeuqmwk3yvf">
               <w:r>
                 <w:rPr>
                   <w:rStyle w:val="Hyperlink"/>
@@ -4116,7 +4207,7 @@
               </w:rPr>
               <w:t xml:space="preserve"> to exit Celebrations loop. One-click: </w:t>
             </w:r>
-            <w:hyperlink w:history="1" r:id="rIduomerv76vsi2lvquuu21w">
+            <w:hyperlink w:history="1" r:id="rIdq5ttwxjpt6-yq4ordgpeb">
               <w:r>
                 <w:rPr>
                   <w:rStyle w:val="Hyperlink"/>
@@ -4278,11 +4369,18 @@
                 <w:rFonts w:ascii="Calibri" w:cs="Calibri" w:eastAsia="Calibri" w:hAnsi="Calibri"/>
                 <w:b/>
                 <w:bCs/>
-                <w:color w:val="B0000A"/>
-                <w:sz w:val="18"/>
-                <w:szCs w:val="18"/>
-              </w:rPr>
-              <w:t xml:space="preserve">TBD (walkthrough)</w:t>
+                <w:sz w:val="18"/>
+                <w:szCs w:val="18"/>
+              </w:rPr>
+              <w:t xml:space="preserve">Live camera feed</w:t>
+            </w:r>
+            <w:r>
+              <w:rPr>
+                <w:rFonts w:ascii="Calibri" w:cs="Calibri" w:eastAsia="Calibri" w:hAnsi="Calibri"/>
+                <w:sz w:val="18"/>
+                <w:szCs w:val="18"/>
+              </w:rPr>
+              <w:t xml:space="preserve"> from the stage</w:t>
             </w:r>
           </w:p>
         </w:tc>
@@ -4552,11 +4650,18 @@
                 <w:rFonts w:ascii="Calibri" w:cs="Calibri" w:eastAsia="Calibri" w:hAnsi="Calibri"/>
                 <w:b/>
                 <w:bCs/>
-                <w:color w:val="B0000A"/>
-                <w:sz w:val="18"/>
-                <w:szCs w:val="18"/>
-              </w:rPr>
-              <w:t xml:space="preserve">TBD (walkthrough)</w:t>
+                <w:sz w:val="18"/>
+                <w:szCs w:val="18"/>
+              </w:rPr>
+              <w:t xml:space="preserve">Live camera feed</w:t>
+            </w:r>
+            <w:r>
+              <w:rPr>
+                <w:rFonts w:ascii="Calibri" w:cs="Calibri" w:eastAsia="Calibri" w:hAnsi="Calibri"/>
+                <w:sz w:val="18"/>
+                <w:szCs w:val="18"/>
+              </w:rPr>
+              <w:t xml:space="preserve"> from the stage</w:t>
             </w:r>
           </w:p>
         </w:tc>
@@ -4879,7 +4984,7 @@
             <w:pPr>
               <w:spacing w:after="40" w:before="0"/>
             </w:pPr>
-            <w:hyperlink w:history="1" r:id="rIdpdon94slkpmj-f1e1w6l5">
+            <w:hyperlink w:history="1" r:id="rId_caiyjo249c2m-cm1rp9c">
               <w:r>
                 <w:rPr>
                   <w:rStyle w:val="Hyperlink"/>
@@ -4982,7 +5087,7 @@
             <w:pPr>
               <w:spacing w:after="40" w:before="0"/>
             </w:pPr>
-            <w:hyperlink w:history="1" r:id="rIdgsj9rplgq-rakzi7bvllf">
+            <w:hyperlink w:history="1" r:id="rIdky_bwfpotua7fncbfoxkp">
               <w:r>
                 <w:rPr>
                   <w:rStyle w:val="Hyperlink"/>
@@ -5082,7 +5187,7 @@
             <w:pPr>
               <w:spacing w:after="40" w:before="0"/>
             </w:pPr>
-            <w:hyperlink w:history="1" r:id="rIdy36rwfs_m9i0_ciqrwivj">
+            <w:hyperlink w:history="1" r:id="rId5rnxly53amhw1qxd1g1pw">
               <w:r>
                 <w:rPr>
                   <w:rStyle w:val="Hyperlink"/>
@@ -5185,7 +5290,7 @@
             <w:pPr>
               <w:spacing w:after="40" w:before="0"/>
             </w:pPr>
-            <w:hyperlink w:history="1" r:id="rIdodpond7bcihxjntqsyqvi">
+            <w:hyperlink w:history="1" r:id="rIdhq7w2vigutsgbvrl_tjpr">
               <w:r>
                 <w:rPr>
                   <w:rStyle w:val="Hyperlink"/>
@@ -5469,7 +5574,7 @@
             <w:pPr>
               <w:spacing w:after="40" w:before="0"/>
             </w:pPr>
-            <w:hyperlink w:history="1" r:id="rId3kuhtwedifsqrt-z_nd6n">
+            <w:hyperlink w:history="1" r:id="rIdbbkii01jfoixumzpgy7ag">
               <w:r>
                 <w:rPr>
                   <w:rStyle w:val="Hyperlink"/>
@@ -5613,7 +5718,7 @@
             <w:pPr>
               <w:spacing w:after="40" w:before="0"/>
             </w:pPr>
-            <w:hyperlink w:history="1" r:id="rIdxqws4qgjh9a5l4o3uwluk">
+            <w:hyperlink w:history="1" r:id="rIdc5s2e7avnagthjuj8kcxw">
               <w:r>
                 <w:rPr>
                   <w:rStyle w:val="Hyperlink"/>
@@ -5757,7 +5862,7 @@
             <w:pPr>
               <w:spacing w:after="40" w:before="0"/>
             </w:pPr>
-            <w:hyperlink w:history="1" r:id="rId0xinurxjjek6jnltekttu">
+            <w:hyperlink w:history="1" r:id="rIdkxpbsv0umompbienheds0">
               <w:r>
                 <w:rPr>
                   <w:rStyle w:val="Hyperlink"/>
@@ -5899,7 +6004,7 @@
             <w:pPr>
               <w:spacing w:after="40" w:before="0"/>
             </w:pPr>
-            <w:hyperlink w:history="1" r:id="rIdgutxzcduk_ctl8whn7ptc">
+            <w:hyperlink w:history="1" r:id="rIdfrnghkbj-rmrshfmgzxi4">
               <w:r>
                 <w:rPr>
                   <w:rStyle w:val="Hyperlink"/>
@@ -6043,7 +6148,7 @@
             <w:pPr>
               <w:spacing w:after="40" w:before="0"/>
             </w:pPr>
-            <w:hyperlink w:history="1" r:id="rIdunlzpmlmd570azpqar8gr">
+            <w:hyperlink w:history="1" r:id="rIdfz5kjmtp5c0zwacdchhca">
               <w:r>
                 <w:rPr>
                   <w:rStyle w:val="Hyperlink"/>
@@ -6185,7 +6290,7 @@
             <w:pPr>
               <w:spacing w:after="40" w:before="0"/>
             </w:pPr>
-            <w:hyperlink w:history="1" r:id="rIdgzkeoats80myhte5cvcew">
+            <w:hyperlink w:history="1" r:id="rIdfcmyzebndtt5pqqjhuho7">
               <w:r>
                 <w:rPr>
                   <w:rStyle w:val="Hyperlink"/>
@@ -6372,7 +6477,7 @@
               </w:rPr>
               <w:t xml:space="preserve">Default to </w:t>
             </w:r>
-            <w:hyperlink w:history="1" r:id="rId_cibzvy-zzq-11dbg3h0q">
+            <w:hyperlink w:history="1" r:id="rIdtatg4fdeufe9lsrxrbkoi">
               <w:r>
                 <w:rPr>
                   <w:rStyle w:val="Hyperlink"/>
@@ -6438,7 +6543,7 @@
         </w:rPr>
         <w:t xml:space="preserve">•  Pre-Lunch bridge (11:55 AM): </w:t>
       </w:r>
-      <w:hyperlink w:history="1" r:id="rIdnjxife7xxzgu0nwgkkxi8">
+      <w:hyperlink w:history="1" r:id="rIdqaceajkczusbufh1sinxa">
         <w:r>
           <w:rPr>
             <w:rStyle w:val="Hyperlink"/>
@@ -6474,7 +6579,7 @@
         </w:rPr>
         <w:t xml:space="preserve">•  Post-Lunch return (1:00 PM): </w:t>
       </w:r>
-      <w:hyperlink w:history="1" r:id="rIdjiurfgm7mwyfgecixs2tc">
+      <w:hyperlink w:history="1" r:id="rId7wcuanatbfodqpxbuiygt">
         <w:r>
           <w:rPr>
             <w:rStyle w:val="Hyperlink"/>
@@ -6495,7 +6600,7 @@
         </w:rPr>
         <w:t xml:space="preserve"> by Dolly Parton, then resume </w:t>
       </w:r>
-      <w:hyperlink w:history="1" r:id="rIde78qqdwn4bkki0vrgrnr4">
+      <w:hyperlink w:history="1" r:id="rIdkwxokt8fecbfnlzzvxcb_">
         <w:r>
           <w:rPr>
             <w:rStyle w:val="Hyperlink"/>
@@ -6742,7 +6847,7 @@
         </w:rPr>
         <w:t xml:space="preserve"> (deck / files / AV lead) · </w:t>
       </w:r>
-      <w:hyperlink w:history="1" r:id="rId6yemceeckyot9vtf1dllo">
+      <w:hyperlink w:history="1" r:id="rIdk6qyru7izrw5vhsclhysp">
         <w:r>
           <w:rPr>
             <w:rStyle w:val="Hyperlink"/>
@@ -6761,7 +6866,7 @@
         </w:rPr>
         <w:t xml:space="preserve"> · </w:t>
       </w:r>
-      <w:hyperlink w:history="1" r:id="rIdbbrzvztbwgxgptnak1k34">
+      <w:hyperlink w:history="1" r:id="rId7ofo3h0-xwbfgtmcpvkzy">
         <w:r>
           <w:rPr>
             <w:rStyle w:val="Hyperlink"/>
@@ -6795,7 +6900,7 @@
         </w:rPr>
         <w:t xml:space="preserve"> (Day-of Show Operations (event lead, run of show)) · </w:t>
       </w:r>
-      <w:hyperlink w:history="1" r:id="rIdrtwljbqcymvtleddihj9w">
+      <w:hyperlink w:history="1" r:id="rIdux2gsul_nyatfl__j9-d3">
         <w:r>
           <w:rPr>
             <w:rStyle w:val="Hyperlink"/>
@@ -6814,7 +6919,7 @@
         </w:rPr>
         <w:t xml:space="preserve"> · </w:t>
       </w:r>
-      <w:hyperlink w:history="1" r:id="rId24vsmjexd4mr7ev4cewhy">
+      <w:hyperlink w:history="1" r:id="rIduyxcebkspnbgdjne7tz0z">
         <w:r>
           <w:rPr>
             <w:rStyle w:val="Hyperlink"/>
@@ -6848,7 +6953,7 @@
         </w:rPr>
         <w:t xml:space="preserve"> (Venue Liaison (knows the Statler)) · </w:t>
       </w:r>
-      <w:hyperlink w:history="1" r:id="rId5nl3hjibllrb_glqlnuob">
+      <w:hyperlink w:history="1" r:id="rIdkyvvj1ghg3_c0gsel-i2c">
         <w:r>
           <w:rPr>
             <w:rStyle w:val="Hyperlink"/>
@@ -6867,7 +6972,7 @@
         </w:rPr>
         <w:t xml:space="preserve"> · </w:t>
       </w:r>
-      <w:hyperlink w:history="1" r:id="rIddamc9gxxmxbpfxc4tqrpk">
+      <w:hyperlink w:history="1" r:id="rIdrlzsq6q3-gjub6dszytjc">
         <w:r>
           <w:rPr>
             <w:rStyle w:val="Hyperlink"/>
@@ -6901,7 +7006,7 @@
         </w:rPr>
         <w:t xml:space="preserve"> (Encore / Statler AV contact) · </w:t>
       </w:r>
-      <w:hyperlink w:history="1" r:id="rIdksdfvhqpqtm-rtdym9uip">
+      <w:hyperlink w:history="1" r:id="rIdiaxsdgz8h460dtvr8r74e">
         <w:r>
           <w:rPr>
             <w:rStyle w:val="Hyperlink"/>
@@ -6920,7 +7025,7 @@
         </w:rPr>
         <w:t xml:space="preserve"> · </w:t>
       </w:r>
-      <w:hyperlink w:history="1" r:id="rIdqont0cmcpuel2uh1avbao">
+      <w:hyperlink w:history="1" r:id="rIdrjfykdyi64jmspi23a-e3">
         <w:r>
           <w:rPr>
             <w:rStyle w:val="Hyperlink"/>
@@ -6954,7 +7059,7 @@
         </w:rPr>
         <w:t xml:space="preserve"> (MC (emcee)) · </w:t>
       </w:r>
-      <w:hyperlink w:history="1" r:id="rIdozzdkya1qnrjvtdvfoi7z">
+      <w:hyperlink w:history="1" r:id="rIdkmncicpyrypycj3uv52xo">
         <w:r>
           <w:rPr>
             <w:rStyle w:val="Hyperlink"/>
@@ -6988,7 +7093,7 @@
         </w:rPr>
         <w:t xml:space="preserve"> (stage-side coordinator (eyes on stage all day, supports MC Max)) · </w:t>
       </w:r>
-      <w:hyperlink w:history="1" r:id="rIduh-dlvda4zx3sijdrb2qv">
+      <w:hyperlink w:history="1" r:id="rId8e3pp2btvugbxxy4olcub">
         <w:r>
           <w:rPr>
             <w:rStyle w:val="Hyperlink"/>

</xml_diff>